<commit_message>
Record QUAD second-step and NN enclosure gates
</commit_message>
<xml_diff>
--- a/docs/evidence/results/archcomp26_20261001/stage_report/ARCHCOMP26_FULL_STAGE_DRAFT_200_20261003.docx
+++ b/docs/evidence/results/archcomp26_20261001/stage_report/ARCHCOMP26_FULL_STAGE_DRAFT_200_20261003.docx
@@ -824,6 +824,98 @@
       </w:r>
     </w:p>
     <w:p>
+      <w:hyperlink r:id="rId30">
+        <w:r>
+          <w:rPr>
+            <w:color w:val="1D4D71"/>
+            <w:u w:val="single"/>
+            <w:rFonts w:eastAsia="Hiragino Sans GB" w:ascii="Hiragino Sans GB"/>
+          </w:rPr>
+          <w:t>第一个源盒的第二小步隔离回放</w:t>
+        </w:r>
+      </w:hyperlink>
+      <w:r>
+        <w:rPr>
+          <w:b w:val="0"/>
+        </w:rPr>
+        <w:t xml:space="preserve">不用第二次 CROWN 调用，先把原首步的二进制范围、八方向和十二个终态轴直接复现，再以同一常值控制一次推进到 </w:t>
+      </w:r>
+      <w:r>
+        <w:rPr>
+          <w:rFonts w:ascii="Menlo" w:hAnsi="Menlo"/>
+          <w:b w:val="0"/>
+          <w:sz w:val="16"/>
+        </w:rPr>
+        <w:t>t=0.010</w:t>
+      </w:r>
+      <w:r>
+        <w:rPr>
+          <w:b w:val="0"/>
+        </w:rPr>
+        <w:t>，2/2 小步数值接受。独立 plant 检查重新证明该时窗的七项首离开条件，用连续两段各 1000 次严格 Picard 构造第二小步 tube 与终点；第二小步 20/20 个合成物理界落在保存的未扩张 binary64 界内。此结果只覆盖第一个源盒的前两小步，且仍以保存 CROWN 控制包络有效为前提。另立</w:t>
+      </w:r>
+      <w:hyperlink r:id="rId31">
+        <w:r>
+          <w:rPr>
+            <w:color w:val="1D4D71"/>
+            <w:u w:val="single"/>
+            <w:rFonts w:eastAsia="Hiragino Sans GB" w:ascii="Hiragino Sans GB"/>
+          </w:rPr>
+          <w:t>保存 NN 包络合同审计</w:t>
+        </w:r>
+      </w:hyperlink>
+      <w:r>
+        <w:rPr>
+          <w:b w:val="0"/>
+        </w:rPr>
+        <w:t xml:space="preserve">发现原 RPC 未保存上界斜率或独立 same-slope 证据；首盒第一输出直接分离区间法的 </w:t>
+      </w:r>
+      <w:r>
+        <w:rPr>
+          <w:rFonts w:ascii="Menlo" w:hAnsi="Menlo"/>
+          <w:b w:val="0"/>
+          <w:sz w:val="16"/>
+        </w:rPr>
+        <w:t>T·X</w:t>
+      </w:r>
+      <w:r>
+        <w:rPr>
+          <w:b w:val="0"/>
+        </w:rPr>
+        <w:t xml:space="preserve"> 宽 3.39016，而保存残差带宽仅 0.06710，不能用该方法补出网络证书。</w:t>
+      </w:r>
+      <w:hyperlink r:id="rId32">
+        <w:r>
+          <w:rPr>
+            <w:color w:val="1D4D71"/>
+            <w:u w:val="single"/>
+            <w:rFonts w:eastAsia="Hiragino Sans GB" w:ascii="Hiragino Sans GB"/>
+          </w:rPr>
+          <w:t>首盒相关仿射 sigmoid 检查</w:t>
+        </w:r>
+      </w:hyperlink>
+      <w:r>
+        <w:rPr>
+          <w:b w:val="0"/>
+        </w:rPr>
+        <w:t xml:space="preserve">也仅得 </w:t>
+      </w:r>
+      <w:r>
+        <w:rPr>
+          <w:rFonts w:ascii="Menlo" w:hAnsi="Menlo"/>
+          <w:b w:val="0"/>
+          <w:sz w:val="16"/>
+        </w:rPr>
+        <w:t>UNDECIDED</w:t>
+      </w:r>
+      <w:r>
+        <w:rPr>
+          <w:b w:val="0"/>
+        </w:rPr>
+        <w:t>：第一输出的独立残差包络宽 0.09847，大于保存带宽 0.06710；其余两输出亦未包含。这是外包络过宽，不是网络反例；64 子盒尝试未完成，不能称覆盖。原生生产门仍关闭，这些诊断不增加主表格数。</w:t>
+      </w:r>
+    </w:p>
+    <w:p>
       <w:pPr>
         <w:pStyle w:val="Heading1"/>
       </w:pPr>
@@ -901,7 +993,7 @@
         </w:rPr>
         <w:t>；单次全进程 1107.127423 s。见</w:t>
       </w:r>
-      <w:hyperlink r:id="rId30">
+      <w:hyperlink r:id="rId33">
         <w:r>
           <w:rPr>
             <w:color w:val="1D4D71"/>
@@ -968,298 +1060,6 @@
           <w:b w:val="0"/>
         </w:rPr>
         <w:t>与原生共用 225 盒 × 100 小步合同，各接受 22,500/22,500；进程 wall 分别 9.539174 s / 8.387790 s，保存 tube 各在全时安全带内。见</w:t>
-      </w:r>
-      <w:hyperlink r:id="rId31">
-        <w:r>
-          <w:rPr>
-            <w:color w:val="1D4D71"/>
-            <w:u w:val="single"/>
-            <w:rFonts w:eastAsia="Hiragino Sans GB" w:ascii="Hiragino Sans GB"/>
-          </w:rPr>
-          <w:t>两方摘要</w:t>
-        </w:r>
-      </w:hyperlink>
-      <w:r>
-        <w:rPr>
-          <w:b w:val="0"/>
-        </w:rPr>
-        <w:t>。</w:t>
-      </w:r>
-    </w:p>
-    <w:p>
-      <w:pPr>
-        <w:pStyle w:val="EvidenceBody"/>
-      </w:pPr>
-      <w:r>
-        <w:rPr>
-          <w:b/>
-        </w:rPr>
-        <w:t xml:space="preserve">结果资格  </w:t>
-      </w:r>
-      <w:r>
-        <w:rPr>
-          <w:b/>
-        </w:rPr>
-        <w:t>两方单次全程数值结果</w:t>
-      </w:r>
-      <w:r>
-        <w:rPr>
-          <w:b w:val="0"/>
-        </w:rPr>
-        <w:t>；共享控制驱动与主要数值源码，范围相同不是独立证明；没有四方排名资格。</w:t>
-      </w:r>
-    </w:p>
-    <w:p>
-      <w:pPr>
-        <w:pStyle w:val="EvidenceName"/>
-        <w:keepNext/>
-      </w:pPr>
-      <w:r>
-        <w:rPr>
-          <w:b w:val="0"/>
-        </w:rPr>
-        <w:t>新 DP less PyTorch/GPU P3 有向仿射分区</w:t>
-      </w:r>
-    </w:p>
-    <w:p>
-      <w:pPr>
-        <w:pStyle w:val="EvidenceBody"/>
-      </w:pPr>
-      <w:r>
-        <w:rPr>
-          <w:b/>
-        </w:rPr>
-        <w:t xml:space="preserve">已知状态  </w:t>
-      </w:r>
-      <w:r>
-        <w:rPr>
-          <w:b w:val="0"/>
-        </w:rPr>
-        <w:t xml:space="preserve">保持完整 225 初盒与 20×0.05 s 合同；同一全局控制仿射图 </w:t>
-      </w:r>
-      <w:r>
-        <w:rPr>
-          <w:rFonts w:ascii="Menlo" w:hAnsi="Menlo"/>
-          <w:b w:val="0"/>
-          <w:sz w:val="16"/>
-        </w:rPr>
-        <w:t>T</w:t>
-      </w:r>
-      <w:r>
-        <w:rPr>
-          <w:b w:val="0"/>
-        </w:rPr>
-        <w:t xml:space="preserve"> 下，16 子盒诊断仍在第 75 步性质未决、第 84 步首拒。256 子盒新运行完成 100/100 小步、22,500/22,500 盒步接受，保存全时四态 tube 均在 </w:t>
-      </w:r>
-      <w:r>
-        <w:rPr>
-          <w:rFonts w:ascii="Menlo" w:hAnsi="Menlo"/>
-          <w:b w:val="0"/>
-          <w:sz w:val="16"/>
-        </w:rPr>
-        <w:t>[-1.7,2]</w:t>
-      </w:r>
-      <w:r>
-        <w:rPr>
-          <w:b w:val="0"/>
-        </w:rPr>
-        <w:t xml:space="preserve"> 内，最小盒裕量 +0.093919848；外层 wall 74.274085 s。见</w:t>
-      </w:r>
-      <w:hyperlink r:id="rId32">
-        <w:r>
-          <w:rPr>
-            <w:color w:val="1D4D71"/>
-            <w:u w:val="single"/>
-            <w:rFonts w:eastAsia="Hiragino Sans GB" w:ascii="Hiragino Sans GB"/>
-          </w:rPr>
-          <w:t>分区审计与原始镜像</w:t>
-        </w:r>
-      </w:hyperlink>
-      <w:r>
-        <w:rPr>
-          <w:b w:val="0"/>
-        </w:rPr>
-        <w:t>。</w:t>
-      </w:r>
-    </w:p>
-    <w:p>
-      <w:pPr>
-        <w:pStyle w:val="EvidenceBody"/>
-      </w:pPr>
-      <w:r>
-        <w:rPr>
-          <w:b/>
-        </w:rPr>
-        <w:t xml:space="preserve">结果资格  </w:t>
-      </w:r>
-      <w:r>
-        <w:rPr>
-          <w:b/>
-        </w:rPr>
-        <w:t>第四方完整数值时域结果</w:t>
-      </w:r>
-      <w:r>
-        <w:rPr>
-          <w:b w:val="0"/>
-        </w:rPr>
-        <w:t xml:space="preserve">，但 </w:t>
-      </w:r>
-      <w:r>
-        <w:rPr>
-          <w:rFonts w:ascii="Menlo" w:hAnsi="Menlo"/>
-          <w:b w:val="0"/>
-          <w:sz w:val="16"/>
-        </w:rPr>
-        <w:t>end_to_end_strict_certificate=false</w:t>
-      </w:r>
-      <w:r>
-        <w:rPr>
-          <w:b w:val="0"/>
-        </w:rPr>
-        <w:t>；诊断时间包含逐盒观察写盘，不能与其它方法据单次 wall 排名。</w:t>
-      </w:r>
-    </w:p>
-    <w:p>
-      <w:pPr>
-        <w:pStyle w:val="EvidenceName"/>
-        <w:keepNext/>
-      </w:pPr>
-      <w:r>
-        <w:rPr>
-          <w:b w:val="0"/>
-        </w:rPr>
-        <w:t>新 DP more 四方前缀</w:t>
-      </w:r>
-    </w:p>
-    <w:p>
-      <w:pPr>
-        <w:pStyle w:val="EvidenceBody"/>
-      </w:pPr>
-      <w:r>
-        <w:rPr>
-          <w:b/>
-        </w:rPr>
-        <w:t xml:space="preserve">已知状态  </w:t>
-      </w:r>
-      <w:r>
-        <w:rPr>
-          <w:b w:val="0"/>
-        </w:rPr>
-        <w:t xml:space="preserve">原生保存 225×64/80 小步，checker </w:t>
-      </w:r>
-      <w:r>
-        <w:rPr>
-          <w:rFonts w:ascii="Menlo" w:hAnsi="Menlo"/>
-          <w:b w:val="0"/>
-          <w:sz w:val="16"/>
-        </w:rPr>
-        <w:t>UNKNOWN</w:t>
-      </w:r>
-      <w:r>
-        <w:rPr>
-          <w:b w:val="0"/>
-        </w:rPr>
-        <w:t xml:space="preserve">；Huan/Xiangru 各保存 225×72/80 小步后 checker </w:t>
-      </w:r>
-      <w:r>
-        <w:rPr>
-          <w:rFonts w:ascii="Menlo" w:hAnsi="Menlo"/>
-          <w:b w:val="0"/>
-          <w:sz w:val="16"/>
-        </w:rPr>
-        <w:t>Unsafe.</w:t>
-      </w:r>
-      <w:r>
-        <w:rPr>
-          <w:b w:val="0"/>
-        </w:rPr>
-        <w:t xml:space="preserve"> 早停。P3 最新 affine-split4 也完整接受前 72 小步后由 checker 输出 </w:t>
-      </w:r>
-      <w:r>
-        <w:rPr>
-          <w:rFonts w:ascii="Menlo" w:hAnsi="Menlo"/>
-          <w:b w:val="0"/>
-          <w:sz w:val="16"/>
-        </w:rPr>
-        <w:t>Unsafe.</w:t>
-      </w:r>
-      <w:r>
-        <w:rPr>
-          <w:b w:val="0"/>
-        </w:rPr>
-        <w:t xml:space="preserve">；四方全盒保存安全的共同前缀仅到 </w:t>
-      </w:r>
-      <w:r>
-        <w:rPr>
-          <w:rFonts w:ascii="Menlo" w:hAnsi="Menlo"/>
-          <w:b w:val="0"/>
-          <w:sz w:val="16"/>
-        </w:rPr>
-        <w:t>T=0.3</w:t>
-      </w:r>
-      <w:r>
-        <w:rPr>
-          <w:b w:val="0"/>
-        </w:rPr>
-        <w:t xml:space="preserve">。另有严格内点 </w:t>
-      </w:r>
-      <w:r>
-        <w:rPr>
-          <w:rFonts w:ascii="Menlo" w:hAnsi="Menlo"/>
-          <w:b w:val="0"/>
-          <w:sz w:val="16"/>
-        </w:rPr>
-        <w:t>(1.299)^4</w:t>
-      </w:r>
-      <w:r>
-        <w:rPr>
-          <w:b w:val="0"/>
-        </w:rPr>
-        <w:t xml:space="preserve"> 的独立数值轨迹，在约 </w:t>
-      </w:r>
-      <w:r>
-        <w:rPr>
-          <w:rFonts w:ascii="Menlo" w:hAnsi="Menlo"/>
-          <w:b w:val="0"/>
-          <w:sz w:val="16"/>
-        </w:rPr>
-        <w:t>t=0.324865</w:t>
-      </w:r>
-      <w:r>
-        <w:rPr>
-          <w:b w:val="0"/>
-        </w:rPr>
-        <w:t xml:space="preserve"> 越过 </w:t>
-      </w:r>
-      <w:r>
-        <w:rPr>
-          <w:rFonts w:ascii="Menlo" w:hAnsi="Menlo"/>
-          <w:b w:val="0"/>
-          <w:sz w:val="16"/>
-        </w:rPr>
-        <w:t>θ̇₁=-1.5</w:t>
-      </w:r>
-      <w:r>
-        <w:rPr>
-          <w:b w:val="0"/>
-        </w:rPr>
-        <w:t>。见</w:t>
-      </w:r>
-      <w:hyperlink r:id="rId33">
-        <w:r>
-          <w:rPr>
-            <w:color w:val="1D4D71"/>
-            <w:u w:val="single"/>
-            <w:rFonts w:eastAsia="Hiragino Sans GB" w:ascii="Hiragino Sans GB"/>
-          </w:rPr>
-          <w:t>原生摘要</w:t>
-        </w:r>
-      </w:hyperlink>
-      <w:r>
-        <w:rPr>
-          <w:b w:val="0"/>
-        </w:rPr>
-        <w:t>、</w:t>
       </w:r>
       <w:hyperlink r:id="rId34">
         <w:r>
@@ -1275,9 +1075,301 @@
         <w:rPr>
           <w:b w:val="0"/>
         </w:rPr>
+        <w:t>。</w:t>
+      </w:r>
+    </w:p>
+    <w:p>
+      <w:pPr>
+        <w:pStyle w:val="EvidenceBody"/>
+      </w:pPr>
+      <w:r>
+        <w:rPr>
+          <w:b/>
+        </w:rPr>
+        <w:t xml:space="preserve">结果资格  </w:t>
+      </w:r>
+      <w:r>
+        <w:rPr>
+          <w:b/>
+        </w:rPr>
+        <w:t>两方单次全程数值结果</w:t>
+      </w:r>
+      <w:r>
+        <w:rPr>
+          <w:b w:val="0"/>
+        </w:rPr>
+        <w:t>；共享控制驱动与主要数值源码，范围相同不是独立证明；没有四方排名资格。</w:t>
+      </w:r>
+    </w:p>
+    <w:p>
+      <w:pPr>
+        <w:pStyle w:val="EvidenceName"/>
+        <w:keepNext/>
+      </w:pPr>
+      <w:r>
+        <w:rPr>
+          <w:b w:val="0"/>
+        </w:rPr>
+        <w:t>新 DP less PyTorch/GPU P3 有向仿射分区</w:t>
+      </w:r>
+    </w:p>
+    <w:p>
+      <w:pPr>
+        <w:pStyle w:val="EvidenceBody"/>
+      </w:pPr>
+      <w:r>
+        <w:rPr>
+          <w:b/>
+        </w:rPr>
+        <w:t xml:space="preserve">已知状态  </w:t>
+      </w:r>
+      <w:r>
+        <w:rPr>
+          <w:b w:val="0"/>
+        </w:rPr>
+        <w:t xml:space="preserve">保持完整 225 初盒与 20×0.05 s 合同；同一全局控制仿射图 </w:t>
+      </w:r>
+      <w:r>
+        <w:rPr>
+          <w:rFonts w:ascii="Menlo" w:hAnsi="Menlo"/>
+          <w:b w:val="0"/>
+          <w:sz w:val="16"/>
+        </w:rPr>
+        <w:t>T</w:t>
+      </w:r>
+      <w:r>
+        <w:rPr>
+          <w:b w:val="0"/>
+        </w:rPr>
+        <w:t xml:space="preserve"> 下，16 子盒诊断仍在第 75 步性质未决、第 84 步首拒。256 子盒新运行完成 100/100 小步、22,500/22,500 盒步接受，保存全时四态 tube 均在 </w:t>
+      </w:r>
+      <w:r>
+        <w:rPr>
+          <w:rFonts w:ascii="Menlo" w:hAnsi="Menlo"/>
+          <w:b w:val="0"/>
+          <w:sz w:val="16"/>
+        </w:rPr>
+        <w:t>[-1.7,2]</w:t>
+      </w:r>
+      <w:r>
+        <w:rPr>
+          <w:b w:val="0"/>
+        </w:rPr>
+        <w:t xml:space="preserve"> 内，最小盒裕量 +0.093919848；外层 wall 74.274085 s。见</w:t>
+      </w:r>
+      <w:hyperlink r:id="rId35">
+        <w:r>
+          <w:rPr>
+            <w:color w:val="1D4D71"/>
+            <w:u w:val="single"/>
+            <w:rFonts w:eastAsia="Hiragino Sans GB" w:ascii="Hiragino Sans GB"/>
+          </w:rPr>
+          <w:t>分区审计与原始镜像</w:t>
+        </w:r>
+      </w:hyperlink>
+      <w:r>
+        <w:rPr>
+          <w:b w:val="0"/>
+        </w:rPr>
+        <w:t>。</w:t>
+      </w:r>
+    </w:p>
+    <w:p>
+      <w:pPr>
+        <w:pStyle w:val="EvidenceBody"/>
+      </w:pPr>
+      <w:r>
+        <w:rPr>
+          <w:b/>
+        </w:rPr>
+        <w:t xml:space="preserve">结果资格  </w:t>
+      </w:r>
+      <w:r>
+        <w:rPr>
+          <w:b/>
+        </w:rPr>
+        <w:t>第四方完整数值时域结果</w:t>
+      </w:r>
+      <w:r>
+        <w:rPr>
+          <w:b w:val="0"/>
+        </w:rPr>
+        <w:t xml:space="preserve">，但 </w:t>
+      </w:r>
+      <w:r>
+        <w:rPr>
+          <w:rFonts w:ascii="Menlo" w:hAnsi="Menlo"/>
+          <w:b w:val="0"/>
+          <w:sz w:val="16"/>
+        </w:rPr>
+        <w:t>end_to_end_strict_certificate=false</w:t>
+      </w:r>
+      <w:r>
+        <w:rPr>
+          <w:b w:val="0"/>
+        </w:rPr>
+        <w:t>；诊断时间包含逐盒观察写盘，不能与其它方法据单次 wall 排名。</w:t>
+      </w:r>
+    </w:p>
+    <w:p>
+      <w:pPr>
+        <w:pStyle w:val="EvidenceName"/>
+        <w:keepNext/>
+      </w:pPr>
+      <w:r>
+        <w:rPr>
+          <w:b w:val="0"/>
+        </w:rPr>
+        <w:t>新 DP more 四方前缀</w:t>
+      </w:r>
+    </w:p>
+    <w:p>
+      <w:pPr>
+        <w:pStyle w:val="EvidenceBody"/>
+      </w:pPr>
+      <w:r>
+        <w:rPr>
+          <w:b/>
+        </w:rPr>
+        <w:t xml:space="preserve">已知状态  </w:t>
+      </w:r>
+      <w:r>
+        <w:rPr>
+          <w:b w:val="0"/>
+        </w:rPr>
+        <w:t xml:space="preserve">原生保存 225×64/80 小步，checker </w:t>
+      </w:r>
+      <w:r>
+        <w:rPr>
+          <w:rFonts w:ascii="Menlo" w:hAnsi="Menlo"/>
+          <w:b w:val="0"/>
+          <w:sz w:val="16"/>
+        </w:rPr>
+        <w:t>UNKNOWN</w:t>
+      </w:r>
+      <w:r>
+        <w:rPr>
+          <w:b w:val="0"/>
+        </w:rPr>
+        <w:t xml:space="preserve">；Huan/Xiangru 各保存 225×72/80 小步后 checker </w:t>
+      </w:r>
+      <w:r>
+        <w:rPr>
+          <w:rFonts w:ascii="Menlo" w:hAnsi="Menlo"/>
+          <w:b w:val="0"/>
+          <w:sz w:val="16"/>
+        </w:rPr>
+        <w:t>Unsafe.</w:t>
+      </w:r>
+      <w:r>
+        <w:rPr>
+          <w:b w:val="0"/>
+        </w:rPr>
+        <w:t xml:space="preserve"> 早停。P3 最新 affine-split4 也完整接受前 72 小步后由 checker 输出 </w:t>
+      </w:r>
+      <w:r>
+        <w:rPr>
+          <w:rFonts w:ascii="Menlo" w:hAnsi="Menlo"/>
+          <w:b w:val="0"/>
+          <w:sz w:val="16"/>
+        </w:rPr>
+        <w:t>Unsafe.</w:t>
+      </w:r>
+      <w:r>
+        <w:rPr>
+          <w:b w:val="0"/>
+        </w:rPr>
+        <w:t xml:space="preserve">；四方全盒保存安全的共同前缀仅到 </w:t>
+      </w:r>
+      <w:r>
+        <w:rPr>
+          <w:rFonts w:ascii="Menlo" w:hAnsi="Menlo"/>
+          <w:b w:val="0"/>
+          <w:sz w:val="16"/>
+        </w:rPr>
+        <w:t>T=0.3</w:t>
+      </w:r>
+      <w:r>
+        <w:rPr>
+          <w:b w:val="0"/>
+        </w:rPr>
+        <w:t xml:space="preserve">。另有严格内点 </w:t>
+      </w:r>
+      <w:r>
+        <w:rPr>
+          <w:rFonts w:ascii="Menlo" w:hAnsi="Menlo"/>
+          <w:b w:val="0"/>
+          <w:sz w:val="16"/>
+        </w:rPr>
+        <w:t>(1.299)^4</w:t>
+      </w:r>
+      <w:r>
+        <w:rPr>
+          <w:b w:val="0"/>
+        </w:rPr>
+        <w:t xml:space="preserve"> 的独立数值轨迹，在约 </w:t>
+      </w:r>
+      <w:r>
+        <w:rPr>
+          <w:rFonts w:ascii="Menlo" w:hAnsi="Menlo"/>
+          <w:b w:val="0"/>
+          <w:sz w:val="16"/>
+        </w:rPr>
+        <w:t>t=0.324865</w:t>
+      </w:r>
+      <w:r>
+        <w:rPr>
+          <w:b w:val="0"/>
+        </w:rPr>
+        <w:t xml:space="preserve"> 越过 </w:t>
+      </w:r>
+      <w:r>
+        <w:rPr>
+          <w:rFonts w:ascii="Menlo" w:hAnsi="Menlo"/>
+          <w:b w:val="0"/>
+          <w:sz w:val="16"/>
+        </w:rPr>
+        <w:t>θ̇₁=-1.5</w:t>
+      </w:r>
+      <w:r>
+        <w:rPr>
+          <w:b w:val="0"/>
+        </w:rPr>
+        <w:t>。见</w:t>
+      </w:r>
+      <w:hyperlink r:id="rId36">
+        <w:r>
+          <w:rPr>
+            <w:color w:val="1D4D71"/>
+            <w:u w:val="single"/>
+            <w:rFonts w:eastAsia="Hiragino Sans GB" w:ascii="Hiragino Sans GB"/>
+          </w:rPr>
+          <w:t>原生摘要</w:t>
+        </w:r>
+      </w:hyperlink>
+      <w:r>
+        <w:rPr>
+          <w:b w:val="0"/>
+        </w:rPr>
         <w:t>、</w:t>
       </w:r>
-      <w:hyperlink r:id="rId35">
+      <w:hyperlink r:id="rId37">
+        <w:r>
+          <w:rPr>
+            <w:color w:val="1D4D71"/>
+            <w:u w:val="single"/>
+            <w:rFonts w:eastAsia="Hiragino Sans GB" w:ascii="Hiragino Sans GB"/>
+          </w:rPr>
+          <w:t>两方摘要</w:t>
+        </w:r>
+      </w:hyperlink>
+      <w:r>
+        <w:rPr>
+          <w:b w:val="0"/>
+        </w:rPr>
+        <w:t>、</w:t>
+      </w:r>
+      <w:hyperlink r:id="rId38">
         <w:r>
           <w:rPr>
             <w:color w:val="1D4D71"/>
@@ -1293,7 +1385,7 @@
         </w:rPr>
         <w:t>及</w:t>
       </w:r>
-      <w:hyperlink r:id="rId36">
+      <w:hyperlink r:id="rId39">
         <w:r>
           <w:rPr>
             <w:color w:val="1D4D71"/>
@@ -1403,7 +1495,7 @@
         </w:rPr>
         <w:t>、wall 16.616363 s，未输出终局作者性质标签。见</w:t>
       </w:r>
-      <w:hyperlink r:id="rId37">
+      <w:hyperlink r:id="rId40">
         <w:r>
           <w:rPr>
             <w:color w:val="1D4D71"/>
@@ -1541,7 +1633,7 @@
         </w:rPr>
         <w:t>、wall 62.360384 s 仅是早停进程时间。见</w:t>
       </w:r>
-      <w:hyperlink r:id="rId38">
+      <w:hyperlink r:id="rId41">
         <w:r>
           <w:rPr>
             <w:color w:val="1D4D71"/>
@@ -1557,7 +1649,7 @@
         </w:rPr>
         <w:t>与</w:t>
       </w:r>
-      <w:hyperlink r:id="rId35">
+      <w:hyperlink r:id="rId38">
         <w:r>
           <w:rPr>
             <w:color w:val="1D4D71"/>
@@ -1681,7 +1773,7 @@
         </w:rPr>
         <w:t>。见</w:t>
       </w:r>
-      <w:hyperlink r:id="rId39">
+      <w:hyperlink r:id="rId42">
         <w:r>
           <w:rPr>
             <w:color w:val="1D4D71"/>
@@ -1697,7 +1789,7 @@
         </w:rPr>
         <w:t>和</w:t>
       </w:r>
-      <w:hyperlink r:id="rId40">
+      <w:hyperlink r:id="rId43">
         <w:r>
           <w:rPr>
             <w:color w:val="1D4D71"/>
@@ -1821,7 +1913,7 @@
         </w:rPr>
         <w:t>、空范围和当时源码见</w:t>
       </w:r>
-      <w:hyperlink r:id="rId41">
+      <w:hyperlink r:id="rId44">
         <w:r>
           <w:rPr>
             <w:color w:val="1D4D71"/>
@@ -1837,7 +1929,7 @@
         </w:rPr>
         <w:t>。另立</w:t>
       </w:r>
-      <w:hyperlink r:id="rId42">
+      <w:hyperlink r:id="rId45">
         <w:r>
           <w:rPr>
             <w:color w:val="1D4D71"/>
@@ -2017,7 +2109,7 @@
         </w:rPr>
         <w:t xml:space="preserve"> 与 observations 均为空。原</w:t>
       </w:r>
-      <w:hyperlink r:id="rId43">
+      <w:hyperlink r:id="rId46">
         <w:r>
           <w:rPr>
             <w:color w:val="1D4D71"/>
@@ -2033,7 +2125,7 @@
         </w:rPr>
         <w:t>没有保留四界；随后独立</w:t>
       </w:r>
-      <w:hyperlink r:id="rId44">
+      <w:hyperlink r:id="rId47">
         <w:r>
           <w:rPr>
             <w:color w:val="1D4D71"/>
@@ -2199,7 +2291,7 @@
         </w:rPr>
         <w:t xml:space="preserve"> 对零 tube 是空真，非性质结论；见</w:t>
       </w:r>
-      <w:hyperlink r:id="rId45">
+      <w:hyperlink r:id="rId48">
         <w:r>
           <w:rPr>
             <w:color w:val="1D4D71"/>
@@ -2351,7 +2443,7 @@
         </w:rPr>
         <w:t>。两次初盒和 CROWN RPC 逐值一致，见</w:t>
       </w:r>
-      <w:hyperlink r:id="rId46">
+      <w:hyperlink r:id="rId49">
         <w:r>
           <w:rPr>
             <w:color w:val="1D4D71"/>
@@ -2489,7 +2581,7 @@
         </w:rPr>
         <w:t>。新旧初盒及 RPC 逐值相同，见</w:t>
       </w:r>
-      <w:hyperlink r:id="rId47">
+      <w:hyperlink r:id="rId50">
         <w:r>
           <w:rPr>
             <w:color w:val="1D4D71"/>
@@ -2571,7 +2663,7 @@
         </w:rPr>
         <w:t xml:space="preserve"> 与余项。新 </w:t>
       </w:r>
-      <w:hyperlink r:id="rId48">
+      <w:hyperlink r:id="rId51">
         <w:r>
           <w:rPr>
             <w:color w:val="1D4D71"/>
@@ -2601,7 +2693,7 @@
         </w:rPr>
         <w:t xml:space="preserve">，19/19 Picard 自包含、1 RPC、1 段数值接受，status 2、exit 0。新 </w:t>
       </w:r>
-      <w:hyperlink r:id="rId49">
+      <w:hyperlink r:id="rId52">
         <w:r>
           <w:rPr>
             <w:color w:val="1D4D71"/>
@@ -2682,7 +2774,7 @@
         </w:rPr>
         <w:t xml:space="preserve"> 是性质 Unknown，不是 Picard 拒绝或实际不安全轨迹。</w:t>
       </w:r>
-      <w:hyperlink r:id="rId50">
+      <w:hyperlink r:id="rId53">
         <w:r>
           <w:rPr>
             <w:color w:val="1D4D71"/>
@@ -2839,7 +2931,7 @@
         </w:rPr>
         <w:t>。见</w:t>
       </w:r>
-      <w:hyperlink r:id="rId51">
+      <w:hyperlink r:id="rId54">
         <w:r>
           <w:rPr>
             <w:color w:val="1D4D71"/>
@@ -2855,7 +2947,7 @@
         </w:rPr>
         <w:t>、</w:t>
       </w:r>
-      <w:hyperlink r:id="rId52">
+      <w:hyperlink r:id="rId55">
         <w:r>
           <w:rPr>
             <w:color w:val="1D4D71"/>
@@ -2871,7 +2963,7 @@
         </w:rPr>
         <w:t>、</w:t>
       </w:r>
-      <w:hyperlink r:id="rId53">
+      <w:hyperlink r:id="rId56">
         <w:r>
           <w:rPr>
             <w:color w:val="1D4D71"/>
@@ -2887,7 +2979,7 @@
         </w:rPr>
         <w:t>、</w:t>
       </w:r>
-      <w:hyperlink r:id="rId54">
+      <w:hyperlink r:id="rId57">
         <w:r>
           <w:rPr>
             <w:color w:val="1D4D71"/>
@@ -2903,7 +2995,7 @@
         </w:rPr>
         <w:t>与</w:t>
       </w:r>
-      <w:hyperlink r:id="rId55">
+      <w:hyperlink r:id="rId58">
         <w:r>
           <w:rPr>
             <w:color w:val="1D4D71"/>
@@ -3069,7 +3161,7 @@
         </w:rPr>
         <w:t>，其它三方对应保存 tube 也在带内。见</w:t>
       </w:r>
-      <w:hyperlink r:id="rId56">
+      <w:hyperlink r:id="rId59">
         <w:r>
           <w:rPr>
             <w:color w:val="1D4D71"/>
@@ -3085,7 +3177,7 @@
         </w:rPr>
         <w:t>、</w:t>
       </w:r>
-      <w:hyperlink r:id="rId57">
+      <w:hyperlink r:id="rId60">
         <w:r>
           <w:rPr>
             <w:color w:val="1D4D71"/>
@@ -3101,7 +3193,7 @@
         </w:rPr>
         <w:t>及</w:t>
       </w:r>
-      <w:hyperlink r:id="rId58">
+      <w:hyperlink r:id="rId61">
         <w:r>
           <w:rPr>
             <w:color w:val="1D4D71"/>
@@ -3225,7 +3317,7 @@
         </w:rPr>
         <w:t>，各自进程 wall 8.371523 s / 8.270158 s。见</w:t>
       </w:r>
-      <w:hyperlink r:id="rId59">
+      <w:hyperlink r:id="rId62">
         <w:r>
           <w:rPr>
             <w:color w:val="1D4D71"/>
@@ -3241,7 +3333,7 @@
         </w:rPr>
         <w:t>、</w:t>
       </w:r>
-      <w:hyperlink r:id="rId60">
+      <w:hyperlink r:id="rId63">
         <w:r>
           <w:rPr>
             <w:color w:val="1D4D71"/>
@@ -3257,7 +3349,7 @@
         </w:rPr>
         <w:t>、</w:t>
       </w:r>
-      <w:hyperlink r:id="rId61">
+      <w:hyperlink r:id="rId64">
         <w:r>
           <w:rPr>
             <w:color w:val="1D4D71"/>
@@ -3273,7 +3365,7 @@
         </w:rPr>
         <w:t>及</w:t>
       </w:r>
-      <w:hyperlink r:id="rId62">
+      <w:hyperlink r:id="rId65">
         <w:r>
           <w:rPr>
             <w:color w:val="1D4D71"/>
@@ -3383,7 +3475,7 @@
         </w:rPr>
         <w:t xml:space="preserve"> 下界最小分别为 16.434859 / 16.165035 / 16.165035 / 16.254754，全部严格为正。最初各一次单独进程 wall 分别为 7.934 / 7.260 / 7.312 / 7.930 s；随后另开四方各 1 首轮+5 后续独立进程的轮换 campaign，均走完 50/50，详见下表。见</w:t>
       </w:r>
-      <w:hyperlink r:id="rId63">
+      <w:hyperlink r:id="rId66">
         <w:r>
           <w:rPr>
             <w:color w:val="1D4D71"/>
@@ -3399,7 +3491,7 @@
         </w:rPr>
         <w:t>、</w:t>
       </w:r>
-      <w:hyperlink r:id="rId64">
+      <w:hyperlink r:id="rId67">
         <w:r>
           <w:rPr>
             <w:color w:val="1D4D71"/>
@@ -3415,7 +3507,7 @@
         </w:rPr>
         <w:t>、</w:t>
       </w:r>
-      <w:hyperlink r:id="rId65">
+      <w:hyperlink r:id="rId68">
         <w:r>
           <w:rPr>
             <w:color w:val="1D4D71"/>
@@ -3431,7 +3523,7 @@
         </w:rPr>
         <w:t>和</w:t>
       </w:r>
-      <w:hyperlink r:id="rId66">
+      <w:hyperlink r:id="rId69">
         <w:r>
           <w:rPr>
             <w:color w:val="1D4D71"/>
@@ -3597,7 +3689,7 @@
         </w:rPr>
         <w:t>。见</w:t>
       </w:r>
-      <w:hyperlink r:id="rId67">
+      <w:hyperlink r:id="rId70">
         <w:r>
           <w:rPr>
             <w:color w:val="1D4D71"/>
@@ -3613,7 +3705,7 @@
         </w:rPr>
         <w:t>、</w:t>
       </w:r>
-      <w:hyperlink r:id="rId68">
+      <w:hyperlink r:id="rId71">
         <w:r>
           <w:rPr>
             <w:color w:val="1D4D71"/>
@@ -3629,7 +3721,7 @@
         </w:rPr>
         <w:t>、</w:t>
       </w:r>
-      <w:hyperlink r:id="rId69">
+      <w:hyperlink r:id="rId72">
         <w:r>
           <w:rPr>
             <w:color w:val="1D4D71"/>
@@ -3645,7 +3737,7 @@
         </w:rPr>
         <w:t>和</w:t>
       </w:r>
-      <w:hyperlink r:id="rId70">
+      <w:hyperlink r:id="rId73">
         <w:r>
           <w:rPr>
             <w:color w:val="1D4D71"/>
@@ -3811,7 +3903,7 @@
         </w:rPr>
         <w:t>，同时保存 40/40 周期、400 tubes、40 RPC；末时绝对区间、原始记录和接口核对见</w:t>
       </w:r>
-      <w:hyperlink r:id="rId71">
+      <w:hyperlink r:id="rId74">
         <w:r>
           <w:rPr>
             <w:color w:val="1D4D71"/>
@@ -3827,7 +3919,7 @@
         </w:rPr>
         <w:t>与</w:t>
       </w:r>
-      <w:hyperlink r:id="rId72">
+      <w:hyperlink r:id="rId75">
         <w:r>
           <w:rPr>
             <w:color w:val="1D4D71"/>
@@ -3951,7 +4043,7 @@
         </w:rPr>
         <w:t xml:space="preserve"> 周期。两个新 ID 各 20/20 小步接受，保存 tube 均与障碍盒分离，进程 wall 4.142439 / 4.417727 s。见</w:t>
       </w:r>
-      <w:hyperlink r:id="rId73">
+      <w:hyperlink r:id="rId76">
         <w:r>
           <w:rPr>
             <w:color w:val="1D4D71"/>
@@ -4089,7 +4181,7 @@
         </w:rPr>
         <w:t>。见</w:t>
       </w:r>
-      <w:hyperlink r:id="rId74">
+      <w:hyperlink r:id="rId77">
         <w:r>
           <w:rPr>
             <w:color w:val="1D4D71"/>
@@ -4183,7 +4275,7 @@
         </w:rPr>
         <w:t>门检完成 20/20 小步、12,800/12,800 盒步接受、wall 5.243638 s。独立重扫全部记录有限、有序、endpoint 含于 tube、每个初盒含于首步 tube，保存二维 x/y tube 与闭障碍相交 0。见</w:t>
       </w:r>
-      <w:hyperlink r:id="rId75">
+      <w:hyperlink r:id="rId78">
         <w:r>
           <w:rPr>
             <w:color w:val="1D4D71"/>
@@ -4199,7 +4291,7 @@
         </w:rPr>
         <w:t>及</w:t>
       </w:r>
-      <w:hyperlink r:id="rId76">
+      <w:hyperlink r:id="rId79">
         <w:r>
           <w:rPr>
             <w:color w:val="1D4D71"/>
@@ -4379,7 +4471,7 @@
         </w:rPr>
         <w:t>。见</w:t>
       </w:r>
-      <w:hyperlink r:id="rId77">
+      <w:hyperlink r:id="rId80">
         <w:r>
           <w:rPr>
             <w:color w:val="1D4D71"/>
@@ -4545,7 +4637,7 @@
         </w:rPr>
         <w:t>；见</w:t>
       </w:r>
-      <w:hyperlink r:id="rId78">
+      <w:hyperlink r:id="rId81">
         <w:r>
           <w:rPr>
             <w:color w:val="1D4D71"/>
@@ -4621,7 +4713,7 @@
         </w:rPr>
         <w:t xml:space="preserve">已知状态  </w:t>
       </w:r>
-      <w:hyperlink r:id="rId79">
+      <w:hyperlink r:id="rId82">
         <w:r>
           <w:rPr>
             <w:color w:val="1D4D71"/>
@@ -4697,7 +4789,7 @@
         </w:rPr>
         <w:t xml:space="preserve">已知状态  </w:t>
       </w:r>
-      <w:hyperlink r:id="rId80">
+      <w:hyperlink r:id="rId83">
         <w:r>
           <w:rPr>
             <w:color w:val="1D4D71"/>
@@ -4787,7 +4879,7 @@
         </w:rPr>
         <w:t xml:space="preserve">已知状态  </w:t>
       </w:r>
-      <w:hyperlink r:id="rId81">
+      <w:hyperlink r:id="rId84">
         <w:r>
           <w:rPr>
             <w:color w:val="1D4D71"/>
@@ -4925,7 +5017,7 @@
         </w:rPr>
         <w:t xml:space="preserve"> 拒绝，外层 wall 8.218304 s，0 次 8–10 s 性质检查。见</w:t>
       </w:r>
-      <w:hyperlink r:id="rId82">
+      <w:hyperlink r:id="rId85">
         <w:r>
           <w:rPr>
             <w:color w:val="1D4D71"/>
@@ -5035,7 +5127,7 @@
         </w:rPr>
         <w:t>，故引擎接受与严格可审计 tube 包含分开报告；见</w:t>
       </w:r>
-      <w:hyperlink r:id="rId83">
+      <w:hyperlink r:id="rId86">
         <w:r>
           <w:rPr>
             <w:color w:val="1D4D71"/>
@@ -5103,7 +5195,7 @@
         </w:rPr>
         <w:t>同一具名 raw4 合同及完整单初盒，P3 工作三阶/验证四阶，首个 0.02 s 周期 4/4 个小步接受。原始进程 wall 5.230873 s，四条保存 tube/endpoint 独立读回均有限、有序且逐步包含。见</w:t>
       </w:r>
-      <w:hyperlink r:id="rId84">
+      <w:hyperlink r:id="rId87">
         <w:r>
           <w:rPr>
             <w:color w:val="1D4D71"/>
@@ -5213,7 +5305,7 @@
         </w:rPr>
         <w:t>、wall 13.806936 s，性质窗 0/400 检查。见</w:t>
       </w:r>
-      <w:hyperlink r:id="rId85">
+      <w:hyperlink r:id="rId88">
         <w:r>
           <w:rPr>
             <w:color w:val="1D4D71"/>
@@ -5309,7 +5401,7 @@
         </w:rPr>
         <w:t>，outer exit 2、wall 5.731613 s、8–10 秒性质窗 0/400 检查。83 条五坐标范围独立扫描有限、有序，endpoint 在同段 tube 内。见</w:t>
       </w:r>
-      <w:hyperlink r:id="rId86">
+      <w:hyperlink r:id="rId89">
         <w:r>
           <w:rPr>
             <w:color w:val="1D4D71"/>
@@ -5405,7 +5497,7 @@
         </w:rPr>
         <w:t xml:space="preserve"> 不同。见</w:t>
       </w:r>
-      <w:hyperlink r:id="rId87">
+      <w:hyperlink r:id="rId90">
         <w:r>
           <w:rPr>
             <w:color w:val="1D4D71"/>
@@ -5495,7 +5587,7 @@
         </w:rPr>
         <w:t xml:space="preserve"> 不同；新独立入口先有一次误选 Python 环境、0 小步的</w:t>
       </w:r>
-      <w:hyperlink r:id="rId88">
+      <w:hyperlink r:id="rId91">
         <w:r>
           <w:rPr>
             <w:color w:val="1D4D71"/>
@@ -5553,7 +5645,7 @@
         </w:rPr>
         <w:t>，在目标盒内。见</w:t>
       </w:r>
-      <w:hyperlink r:id="rId89">
+      <w:hyperlink r:id="rId92">
         <w:r>
           <w:rPr>
             <w:color w:val="1D4D71"/>
@@ -5677,7 +5769,7 @@
         </w:rPr>
         <w:t xml:space="preserve"> 与 Huan 行相同并落目标。两方原始范围直接逐字节相同，见</w:t>
       </w:r>
-      <w:hyperlink r:id="rId90">
+      <w:hyperlink r:id="rId93">
         <w:r>
           <w:rPr>
             <w:color w:val="1D4D71"/>
@@ -5693,7 +5785,7 @@
         </w:rPr>
         <w:t>与</w:t>
       </w:r>
-      <w:hyperlink r:id="rId91">
+      <w:hyperlink r:id="rId94">
         <w:r>
           <w:rPr>
             <w:color w:val="1D4D71"/>
@@ -5817,7 +5909,7 @@
         </w:rPr>
         <w:t xml:space="preserve"> 落入目标。见</w:t>
       </w:r>
-      <w:hyperlink r:id="rId92">
+      <w:hyperlink r:id="rId95">
         <w:r>
           <w:rPr>
             <w:color w:val="1D4D71"/>
@@ -5833,7 +5925,7 @@
         </w:rPr>
         <w:t>与</w:t>
       </w:r>
-      <w:hyperlink r:id="rId93">
+      <w:hyperlink r:id="rId96">
         <w:r>
           <w:rPr>
             <w:color w:val="1D4D71"/>
@@ -6013,7 +6105,7 @@
         </w:rPr>
         <w:t xml:space="preserve"> 落入目标。见</w:t>
       </w:r>
-      <w:hyperlink r:id="rId94">
+      <w:hyperlink r:id="rId97">
         <w:r>
           <w:rPr>
             <w:color w:val="1D4D71"/>
@@ -6029,7 +6121,7 @@
         </w:rPr>
         <w:t>与</w:t>
       </w:r>
-      <w:hyperlink r:id="rId95">
+      <w:hyperlink r:id="rId98">
         <w:r>
           <w:rPr>
             <w:color w:val="1D4D71"/>
@@ -6153,7 +6245,7 @@
         </w:rPr>
         <w:t>，均在目标内。外层 wall 13.456629 s；见</w:t>
       </w:r>
-      <w:hyperlink r:id="rId96">
+      <w:hyperlink r:id="rId99">
         <w:r>
           <w:rPr>
             <w:color w:val="1D4D71"/>
@@ -6169,7 +6261,7 @@
         </w:rPr>
         <w:t>及</w:t>
       </w:r>
-      <w:hyperlink r:id="rId97">
+      <w:hyperlink r:id="rId100">
         <w:r>
           <w:rPr>
             <w:color w:val="1D4D71"/>
@@ -6293,7 +6385,7 @@
         </w:rPr>
         <w:t>新 Huan 一期 50/50 小步接受，与保存的旧 Huan 全程前 50 步四态 tube/endpoint 共 800 个边界值逐值相同。旧 Huan、Xiangru、原生各有同合同 500 步全程原始记录；旧 P3 全程另存代际对照，见</w:t>
       </w:r>
-      <w:hyperlink r:id="rId98">
+      <w:hyperlink r:id="rId101">
         <w:r>
           <w:rPr>
             <w:color w:val="1D4D71"/>
@@ -6375,7 +6467,7 @@
         </w:rPr>
         <w:t>Huan parity 5 次完整运行、旧 P3 完整一次、native 6 小时超时仅到 600 步；另有 40 步 parity/strict 新诊断，但使用旧模型。见</w:t>
       </w:r>
-      <w:hyperlink r:id="rId99">
+      <w:hyperlink r:id="rId102">
         <w:r>
           <w:rPr>
             <w:color w:val="1D4D71"/>
@@ -6474,7 +6566,7 @@
         </w:rPr>
         <w:t>QUAD 已存逐步包络的</w:t>
       </w:r>
-      <w:hyperlink r:id="rId100">
+      <w:hyperlink r:id="rId103">
         <w:r>
           <w:rPr>
             <w:color w:val="1D4D71"/>
@@ -6582,7 +6674,7 @@
         </w:rPr>
         <w:t xml:space="preserve"> 的终点绝对上下界与宽度见</w:t>
       </w:r>
-      <w:hyperlink r:id="rId101">
+      <w:hyperlink r:id="rId104">
         <w:r>
           <w:rPr>
             <w:color w:val="1D4D71"/>
@@ -6660,7 +6752,7 @@
         </w:rPr>
         <w:t>如下；</w:t>
       </w:r>
-      <w:hyperlink r:id="rId102">
+      <w:hyperlink r:id="rId105">
         <w:r>
           <w:rPr>
             <w:color w:val="1D4D71"/>
@@ -7239,7 +7331,7 @@
         </w:rPr>
         <w:t>具名</w:t>
       </w:r>
-      <w:hyperlink r:id="rId103">
+      <w:hyperlink r:id="rId106">
         <w:r>
           <w:rPr>
             <w:color w:val="1D4D71"/>
@@ -7602,7 +7694,7 @@
         </w:rPr>
         <w:t>修正危险盒后的</w:t>
       </w:r>
-      <w:hyperlink r:id="rId104">
+      <w:hyperlink r:id="rId107">
         <w:r>
           <w:rPr>
             <w:color w:val="1D4D71"/>
@@ -8016,7 +8108,7 @@
                     <pic:cNvPicPr/>
                   </pic:nvPicPr>
                   <pic:blipFill>
-                    <a:blip r:embed="rId105"/>
+                    <a:blip r:embed="rId108"/>
                     <a:stretch>
                       <a:fillRect/>
                     </a:stretch>
@@ -8069,7 +8161,7 @@
                     <pic:cNvPicPr/>
                   </pic:nvPicPr>
                   <pic:blipFill>
-                    <a:blip r:embed="rId106"/>
+                    <a:blip r:embed="rId109"/>
                     <a:stretch>
                       <a:fillRect/>
                     </a:stretch>
@@ -8135,7 +8227,7 @@
         </w:rPr>
         <w:t xml:space="preserve"> 当前 P3 比新原生 x/y 窄 0.001313132 / 0.000142738，旧 Huan/Xiangru 窄 0.006344828 / 0.001473943。robust 旧 Huan/Xiangru 对旧原生 x/y 窄 0.000661962 / 0.000232496。见</w:t>
       </w:r>
-      <w:hyperlink r:id="rId107">
+      <w:hyperlink r:id="rId110">
         <w:r>
           <w:rPr>
             <w:color w:val="1D4D71"/>
@@ -8199,7 +8291,7 @@
         </w:rPr>
         <w:t xml:space="preserve"> 联合绝对区间与宽度如下；每一步 tube/endpoint 汇总在</w:t>
       </w:r>
-      <w:hyperlink r:id="rId108">
+      <w:hyperlink r:id="rId111">
         <w:r>
           <w:rPr>
             <w:color w:val="1D4D71"/>
@@ -8215,7 +8307,7 @@
         </w:rPr>
         <w:t>、</w:t>
       </w:r>
-      <w:hyperlink r:id="rId109">
+      <w:hyperlink r:id="rId112">
         <w:r>
           <w:rPr>
             <w:color w:val="1D4D71"/>
@@ -8231,7 +8323,7 @@
         </w:rPr>
         <w:t>、</w:t>
       </w:r>
-      <w:hyperlink r:id="rId110">
+      <w:hyperlink r:id="rId113">
         <w:r>
           <w:rPr>
             <w:color w:val="1D4D71"/>
@@ -8247,7 +8339,7 @@
         </w:rPr>
         <w:t>和</w:t>
       </w:r>
-      <w:hyperlink r:id="rId111">
+      <w:hyperlink r:id="rId114">
         <w:r>
           <w:rPr>
             <w:color w:val="1D4D71"/>
@@ -9434,7 +9526,7 @@
                     <pic:cNvPicPr/>
                   </pic:nvPicPr>
                   <pic:blipFill>
-                    <a:blip r:embed="rId112"/>
+                    <a:blip r:embed="rId115"/>
                     <a:stretch>
                       <a:fillRect/>
                     </a:stretch>
@@ -9472,7 +9564,7 @@
         </w:rPr>
         <w:t>这张</w:t>
       </w:r>
-      <w:hyperlink r:id="rId113">
+      <w:hyperlink r:id="rId116">
         <w:r>
           <w:rPr>
             <w:color w:val="1D4D71"/>
@@ -9568,7 +9660,7 @@
         </w:rPr>
         <w:t>、观察函数和原始来源均在</w:t>
       </w:r>
-      <w:hyperlink r:id="rId114">
+      <w:hyperlink r:id="rId117">
         <w:r>
           <w:rPr>
             <w:color w:val="1D4D71"/>
@@ -9584,7 +9676,7 @@
         </w:rPr>
         <w:t>与</w:t>
       </w:r>
-      <w:hyperlink r:id="rId66">
+      <w:hyperlink r:id="rId69">
         <w:r>
           <w:rPr>
             <w:color w:val="1D4D71"/>
@@ -10365,7 +10457,7 @@
       </w:r>
     </w:p>
     <w:p>
-      <w:hyperlink r:id="rId65">
+      <w:hyperlink r:id="rId68">
         <w:r>
           <w:rPr>
             <w:color w:val="1D4D71"/>
@@ -10966,7 +11058,7 @@
         </w:rPr>
         <w:t xml:space="preserve"> 见</w:t>
       </w:r>
-      <w:hyperlink r:id="rId115">
+      <w:hyperlink r:id="rId118">
         <w:r>
           <w:rPr>
             <w:color w:val="1D4D71"/>
@@ -10982,7 +11074,7 @@
         </w:rPr>
         <w:t>。原生一列还给出 1,024 个终点盒的宽度均值与最大值；其余三方原始 metrics 只提供并集边界，该两栏保持空白，不从并集宽度臆造逐盒统计。旧</w:t>
       </w:r>
-      <w:hyperlink r:id="rId116">
+      <w:hyperlink r:id="rId119">
         <w:r>
           <w:rPr>
             <w:color w:val="1D4D71"/>
@@ -11500,7 +11592,7 @@
         </w:rPr>
         <w:t>，来源和差异见</w:t>
       </w:r>
-      <w:hyperlink r:id="rId117">
+      <w:hyperlink r:id="rId120">
         <w:r>
           <w:rPr>
             <w:color w:val="1D4D71"/>
@@ -11546,7 +11638,7 @@
         </w:rPr>
         <w:t xml:space="preserve"> 均在</w:t>
       </w:r>
-      <w:hyperlink r:id="rId118">
+      <w:hyperlink r:id="rId121">
         <w:r>
           <w:rPr>
             <w:color w:val="1D4D71"/>
@@ -11562,7 +11654,7 @@
         </w:rPr>
         <w:t>；原始盒、正确危险集判交及观察器差异见</w:t>
       </w:r>
-      <w:hyperlink r:id="rId119">
+      <w:hyperlink r:id="rId122">
         <w:r>
           <w:rPr>
             <w:color w:val="1D4D71"/>
@@ -12433,7 +12525,7 @@
         </w:rPr>
         <w:t>、每盒 endpoint mean/max、未完成值的空值见</w:t>
       </w:r>
-      <w:hyperlink r:id="rId120">
+      <w:hyperlink r:id="rId123">
         <w:r>
           <w:rPr>
             <w:color w:val="1D4D71"/>
@@ -12449,7 +12541,7 @@
         </w:rPr>
         <w:t>与</w:t>
       </w:r>
-      <w:hyperlink r:id="rId121">
+      <w:hyperlink r:id="rId124">
         <w:r>
           <w:rPr>
             <w:color w:val="1D4D71"/>
@@ -13120,7 +13212,7 @@
                     <pic:cNvPicPr/>
                   </pic:nvPicPr>
                   <pic:blipFill>
-                    <a:blip r:embed="rId122"/>
+                    <a:blip r:embed="rId125"/>
                     <a:stretch>
                       <a:fillRect/>
                     </a:stretch>
@@ -13158,7 +13250,7 @@
         </w:rPr>
         <w:t>这张</w:t>
       </w:r>
-      <w:hyperlink r:id="rId123">
+      <w:hyperlink r:id="rId126">
         <w:r>
           <w:rPr>
             <w:color w:val="1D4D71"/>
@@ -15230,7 +15322,7 @@
         </w:rPr>
         <w:t xml:space="preserve"> 具名 participant-order profile 使用固定 2026 ONNX、单个完整初盒、50 个 0.1 秒控制期到 T=5。参与者源码的相对速度取 v_lead−v_ego；全时检查 x_lead−x_ego−1.4v_ego−10≥0。</w:t>
       </w:r>
-      <w:hyperlink r:id="rId63">
+      <w:hyperlink r:id="rId66">
         <w:r>
           <w:rPr>
             <w:color w:val="1D4D71"/>
@@ -15263,7 +15355,7 @@
         </w:rPr>
         <w:t xml:space="preserve"> 我方 P3、Huan、Xiangru、原生均有新完整数值时域；四方保存 tube 的安全裕量下界均为正。</w:t>
       </w:r>
-      <w:hyperlink r:id="rId64">
+      <w:hyperlink r:id="rId67">
         <w:r>
           <w:rPr>
             <w:color w:val="1D4D71"/>
@@ -15296,7 +15388,7 @@
         </w:rPr>
         <w:t xml:space="preserve"> </w:t>
       </w:r>
-      <w:hyperlink r:id="rId65">
+      <w:hyperlink r:id="rId68">
         <w:r>
           <w:rPr>
             <w:color w:val="1D4D71"/>
@@ -15312,7 +15404,7 @@
         </w:rPr>
         <w:t>含首轮与各五次后续完成样本；</w:t>
       </w:r>
-      <w:hyperlink r:id="rId114">
+      <w:hyperlink r:id="rId117">
         <w:r>
           <w:rPr>
             <w:color w:val="1D4D71"/>
@@ -15328,7 +15420,7 @@
         </w:rPr>
         <w:t>和上方宽度表给出 endpoint 与全时 tube；</w:t>
       </w:r>
-      <w:hyperlink r:id="rId124">
+      <w:hyperlink r:id="rId127">
         <w:r>
           <w:rPr>
             <w:color w:val="1D4D71"/>
@@ -15367,7 +15459,7 @@
                     <pic:cNvPicPr/>
                   </pic:nvPicPr>
                   <pic:blipFill>
-                    <a:blip r:embed="rId125"/>
+                    <a:blip r:embed="rId128"/>
                     <a:stretch>
                       <a:fillRect/>
                     </a:stretch>
@@ -15439,7 +15531,7 @@
         </w:rPr>
         <w:t xml:space="preserve"> 官方完整初集是一个未分割 12 物理态盒，六个速度/姿态分量各为 [0,1]，固定 12→6 控制器；连续方程与 0.1 秒采样到 T=2，全时要求 sy、phi、theta、psi∈[-1,1]。</w:t>
       </w:r>
-      <w:hyperlink r:id="rId40">
+      <w:hyperlink r:id="rId43">
         <w:r>
           <w:rPr>
             <w:color w:val="1D4D71"/>
@@ -15472,7 +15564,7 @@
         </w:rPr>
         <w:t xml:space="preserve"> P3、Huan、Xiangru、原生均无完整数值时域。P3 全盒入口建表溢出或首步拒绝，定向余项诊断在观察器检查前没有可用保存段；Huan 高阶入口遇资源阻断，两作者低阶全盒首步拒绝；原生三种隔离数值 profile 首步均为 UNCOMPLETED_SAFE。</w:t>
       </w:r>
-      <w:hyperlink r:id="rId41">
+      <w:hyperlink r:id="rId44">
         <w:r>
           <w:rPr>
             <w:color w:val="1D4D71"/>
@@ -15488,7 +15580,7 @@
         </w:rPr>
         <w:t>、</w:t>
       </w:r>
-      <w:hyperlink r:id="rId39">
+      <w:hyperlink r:id="rId42">
         <w:r>
           <w:rPr>
             <w:color w:val="1D4D71"/>
@@ -15504,7 +15596,7 @@
         </w:rPr>
         <w:t>、</w:t>
       </w:r>
-      <w:hyperlink r:id="rId45">
+      <w:hyperlink r:id="rId48">
         <w:r>
           <w:rPr>
             <w:color w:val="1D4D71"/>
@@ -15537,7 +15629,7 @@
         </w:rPr>
         <w:t xml:space="preserve"> 现有 wall 只属于入口失败或短诊断；没有完整 T=2 宽度或全程图。上述摘要链接命令、配置和日志；</w:t>
       </w:r>
-      <w:hyperlink r:id="rId42">
+      <w:hyperlink r:id="rId45">
         <w:r>
           <w:rPr>
             <w:color w:val="1D4D71"/>
@@ -15553,7 +15645,7 @@
         </w:rPr>
         <w:t>只定位独立诊断路径。</w:t>
       </w:r>
-      <w:hyperlink r:id="rId46">
+      <w:hyperlink r:id="rId49">
         <w:r>
           <w:rPr>
             <w:color w:val="1D4D71"/>
@@ -15597,7 +15689,7 @@
         </w:rPr>
         <w:t xml:space="preserve"> 五个 Picard 提议不含于原余项初猜，仍是 0 段接受。</w:t>
       </w:r>
-      <w:hyperlink r:id="rId47">
+      <w:hyperlink r:id="rId50">
         <w:r>
           <w:rPr>
             <w:color w:val="1D4D71"/>
@@ -15644,7 +15736,7 @@
         </w:rPr>
         <w:t xml:space="preserve"> 六个不确定初态各二分的 64 盒规划只实际运行两角盒。</w:t>
       </w:r>
-      <w:hyperlink r:id="rId48">
+      <w:hyperlink r:id="rId51">
         <w:r>
           <w:rPr>
             <w:color w:val="1D4D71"/>
@@ -15660,7 +15752,7 @@
         </w:rPr>
         <w:t>数值接受首个 0.01 秒且保存 tube 在安全盒内；</w:t>
       </w:r>
-      <w:hyperlink r:id="rId49">
+      <w:hyperlink r:id="rId52">
         <w:r>
           <w:rPr>
             <w:color w:val="1D4D71"/>
@@ -15676,7 +15768,7 @@
         </w:rPr>
         <w:t>也数值接受，但保存角度 tube 越过安全上界，性质为 Unknown。另立</w:t>
       </w:r>
-      <w:hyperlink r:id="rId50">
+      <w:hyperlink r:id="rId53">
         <w:r>
           <w:rPr>
             <w:color w:val="1D4D71"/>
@@ -15734,7 +15826,7 @@
         </w:rPr>
         <w:t xml:space="preserve"> 报告指定 forward Euler、Δt=0.1 秒、20 次转移，在 k=0…20 检查 sy、phi、theta、psi∈[-1,1]；初盒与网络见</w:t>
       </w:r>
-      <w:hyperlink r:id="rId126">
+      <w:hyperlink r:id="rId129">
         <w:r>
           <w:rPr>
             <w:color w:val="1D4D71"/>
@@ -15767,7 +15859,7 @@
         </w:rPr>
         <w:t xml:space="preserve"> 我方、Huan、Xiangru、原生均未在权威离散合同下启动。四方之外的</w:t>
       </w:r>
-      <w:hyperlink r:id="rId127">
+      <w:hyperlink r:id="rId130">
         <w:r>
           <w:rPr>
             <w:color w:val="1D4D71"/>
@@ -15842,7 +15934,7 @@
         </w:rPr>
         <w:t xml:space="preserve"> 固定六态完整初盒、30 个 0.1 秒周期到 T=3；避免官方六维闭危险盒，其 x4 范围为 [-0.7,-0.6]。</w:t>
       </w:r>
-      <w:hyperlink r:id="rId67">
+      <w:hyperlink r:id="rId70">
         <w:r>
           <w:rPr>
             <w:color w:val="1D4D71"/>
@@ -15875,7 +15967,7 @@
         </w:rPr>
         <w:t xml:space="preserve"> 修正危险盒后，P3、Huan、Xiangru、原生新入口均完成 30/30 期与 60/60 小段；保存六维 tube 与危险盒不相交，原生 checker 打印 VERIFIED，三 GPU checker 未打印 Unsafe/Unknown。</w:t>
       </w:r>
-      <w:hyperlink r:id="rId119">
+      <w:hyperlink r:id="rId122">
         <w:r>
           <w:rPr>
             <w:color w:val="1D4D71"/>
@@ -15908,7 +16000,7 @@
         </w:rPr>
         <w:t xml:space="preserve"> </w:t>
       </w:r>
-      <w:hyperlink r:id="rId104">
+      <w:hyperlink r:id="rId107">
         <w:r>
           <w:rPr>
             <w:color w:val="1D4D71"/>
@@ -15924,7 +16016,7 @@
         </w:rPr>
         <w:t>和上方描述统计保留单次与后五次；</w:t>
       </w:r>
-      <w:hyperlink r:id="rId118">
+      <w:hyperlink r:id="rId121">
         <w:r>
           <w:rPr>
             <w:color w:val="1D4D71"/>
@@ -15940,7 +16032,7 @@
         </w:rPr>
         <w:t>及</w:t>
       </w:r>
-      <w:hyperlink r:id="rId128">
+      <w:hyperlink r:id="rId131">
         <w:r>
           <w:rPr>
             <w:color w:val="1D4D71"/>
@@ -15979,7 +16071,7 @@
                     <pic:cNvPicPr/>
                   </pic:nvPicPr>
                   <pic:blipFill>
-                    <a:blip r:embed="rId129"/>
+                    <a:blip r:embed="rId132"/>
                     <a:stretch>
                       <a:fillRect/>
                     </a:stretch>
@@ -16051,7 +16143,7 @@
         </w:rPr>
         <w:t xml:space="preserve"> 论文五特征控制器缺对应模型或权威五到四映射；另名 fixed-repo-raw4 profile 使用官方仓库四原态网络、完整四态初盒、500 个 0.02 秒周期到 T=10，在固定规格 8&lt;t≤10 检查 x1、x3、x4∈[-0.001,0.001]。</w:t>
       </w:r>
-      <w:hyperlink r:id="rId130">
+      <w:hyperlink r:id="rId133">
         <w:r>
           <w:rPr>
             <w:color w:val="1D4D71"/>
@@ -16084,7 +16176,7 @@
         </w:rPr>
         <w:t xml:space="preserve"> 对 raw4，P3 第 87 小步、Huan/Xiangru 各第 99 小步首拒；原生保存 83 段，第 84 段 UNCOMPLETED_SAFE。四方均未进入性质窗，无完整数值时域。</w:t>
       </w:r>
-      <w:hyperlink r:id="rId85">
+      <w:hyperlink r:id="rId88">
         <w:r>
           <w:rPr>
             <w:color w:val="1D4D71"/>
@@ -16100,7 +16192,7 @@
         </w:rPr>
         <w:t>、</w:t>
       </w:r>
-      <w:hyperlink r:id="rId83">
+      <w:hyperlink r:id="rId86">
         <w:r>
           <w:rPr>
             <w:color w:val="1D4D71"/>
@@ -16116,7 +16208,7 @@
         </w:rPr>
         <w:t>、</w:t>
       </w:r>
-      <w:hyperlink r:id="rId86">
+      <w:hyperlink r:id="rId89">
         <w:r>
           <w:rPr>
             <w:color w:val="1D4D71"/>
@@ -16191,7 +16283,7 @@
         </w:rPr>
         <w:t xml:space="preserve"> 四态 (sx,sy,vx,vy)，完整初盒 [70,106]²×[-0.28,0.28]²，固定四输入两力输出，每秒更新到 T=40；全时要求 q=√(vx²+vy²)−0.2−0.002054√(sx²+sy²)≤0。</w:t>
       </w:r>
-      <w:hyperlink r:id="rId87">
+      <w:hyperlink r:id="rId90">
         <w:r>
           <w:rPr>
             <w:color w:val="1D4D71"/>
@@ -16224,7 +16316,7 @@
         </w:rPr>
         <w:t xml:space="preserve"> P3、Huan、Xiangru、原生各保存 400 个 0.1 秒小段；四方性质均 UNKNOWN。原生外层为 failed/exit 2，但 40 期、400 tubes 与 40 RPC 齐全。q 的保守盒上界在首段为正，只说明包络不足以判安全。</w:t>
       </w:r>
-      <w:hyperlink r:id="rId71">
+      <w:hyperlink r:id="rId74">
         <w:r>
           <w:rPr>
             <w:color w:val="1D4D71"/>
@@ -16240,7 +16332,7 @@
         </w:rPr>
         <w:t>和</w:t>
       </w:r>
-      <w:hyperlink r:id="rId72">
+      <w:hyperlink r:id="rId75">
         <w:r>
           <w:rPr>
             <w:color w:val="1D4D71"/>
@@ -16273,7 +16365,7 @@
         </w:rPr>
         <w:t xml:space="preserve"> 单次外层 wall 按 P3/Huan/Xiangru/原生为 17.412/12.699/12.668/9.139 秒；</w:t>
       </w:r>
-      <w:hyperlink r:id="rId102">
+      <w:hyperlink r:id="rId105">
         <w:r>
           <w:rPr>
             <w:color w:val="1D4D71"/>
@@ -16289,7 +16381,7 @@
         </w:rPr>
         <w:t>和</w:t>
       </w:r>
-      <w:hyperlink r:id="rId131">
+      <w:hyperlink r:id="rId134">
         <w:r>
           <w:rPr>
             <w:color w:val="1D4D71"/>
@@ -16347,7 +16439,7 @@
         </w:rPr>
         <w:t xml:space="preserve"> 官方 less-robust 控制器，完整 [1,1.3]^4 分为 225 盒，20 个 0.05 秒控制期、100 个 0.01 秒子步到 T=1；全时要求四态在 [-1.7,2]^4。</w:t>
       </w:r>
-      <w:hyperlink r:id="rId132">
+      <w:hyperlink r:id="rId135">
         <w:r>
           <w:rPr>
             <w:color w:val="1D4D71"/>
@@ -16380,7 +16472,7 @@
         </w:rPr>
         <w:t xml:space="preserve"> P3 有向仿射四分、Huan、Xiangru、原生各保存 225×100 完整数值时域，tube 均在安全盒内；原生 checker 打印 VERIFIED。P3 先前失败候选仍独立保留。</w:t>
       </w:r>
-      <w:hyperlink r:id="rId32">
+      <w:hyperlink r:id="rId35">
         <w:r>
           <w:rPr>
             <w:color w:val="1D4D71"/>
@@ -16396,7 +16488,7 @@
         </w:rPr>
         <w:t>及</w:t>
       </w:r>
-      <w:hyperlink r:id="rId133">
+      <w:hyperlink r:id="rId136">
         <w:r>
           <w:rPr>
             <w:color w:val="1D4D71"/>
@@ -16429,7 +16521,7 @@
         </w:rPr>
         <w:t xml:space="preserve"> 单次外层 wall 按 P3/Huan/Xiangru/原生为 74.274085/9.539174/8.387790/1107.127423 秒；</w:t>
       </w:r>
-      <w:hyperlink r:id="rId134">
+      <w:hyperlink r:id="rId137">
         <w:r>
           <w:rPr>
             <w:color w:val="1D4D71"/>
@@ -16445,7 +16537,7 @@
         </w:rPr>
         <w:t>、</w:t>
       </w:r>
-      <w:hyperlink r:id="rId135">
+      <w:hyperlink r:id="rId138">
         <w:r>
           <w:rPr>
             <w:color w:val="1D4D71"/>
@@ -16484,7 +16576,7 @@
                     <pic:cNvPicPr/>
                   </pic:nvPicPr>
                   <pic:blipFill>
-                    <a:blip r:embed="rId136"/>
+                    <a:blip r:embed="rId139"/>
                     <a:stretch>
                       <a:fillRect/>
                     </a:stretch>
@@ -16556,7 +16648,7 @@
         </w:rPr>
         <w:t xml:space="preserve"> 官方独立 more-robust 网络、完整 [1,1.3]^4、225 盒、20 个 0.02 秒控制期到 T=0.4，全时安全盒 [-1.5,1.5]^4。历史入口误用 less-robust 网络且只取角点，不能迁入本格。</w:t>
       </w:r>
-      <w:hyperlink r:id="rId137">
+      <w:hyperlink r:id="rId140">
         <w:r>
           <w:rPr>
             <w:color w:val="1D4D71"/>
@@ -16603,7 +16695,7 @@
         </w:rPr>
         <w:t>；旧区间控制余项入口第 9 小步数值拒绝仍保留。</w:t>
       </w:r>
-      <w:hyperlink r:id="rId35">
+      <w:hyperlink r:id="rId38">
         <w:r>
           <w:rPr>
             <w:color w:val="1D4D71"/>
@@ -16619,7 +16711,7 @@
         </w:rPr>
         <w:t>、</w:t>
       </w:r>
-      <w:hyperlink r:id="rId37">
+      <w:hyperlink r:id="rId40">
         <w:r>
           <w:rPr>
             <w:color w:val="1D4D71"/>
@@ -16635,7 +16727,7 @@
         </w:rPr>
         <w:t>、</w:t>
       </w:r>
-      <w:hyperlink r:id="rId34">
+      <w:hyperlink r:id="rId37">
         <w:r>
           <w:rPr>
             <w:color w:val="1D4D71"/>
@@ -16651,7 +16743,7 @@
         </w:rPr>
         <w:t>、</w:t>
       </w:r>
-      <w:hyperlink r:id="rId33">
+      <w:hyperlink r:id="rId36">
         <w:r>
           <w:rPr>
             <w:color w:val="1D4D71"/>
@@ -16712,7 +16804,7 @@
         </w:rPr>
         <w:t xml:space="preserve"> tube 完全在下界外。外层 62.360384 秒仅是早停进程时间；不报 T=0.4 终点和完整时间。</w:t>
       </w:r>
-      <w:hyperlink r:id="rId38">
+      <w:hyperlink r:id="rId41">
         <w:r>
           <w:rPr>
             <w:color w:val="1D4D71"/>
@@ -16728,7 +16820,7 @@
         </w:rPr>
         <w:t>先通过 12/12 小步、2,700/2,700 盒步。</w:t>
       </w:r>
-      <w:hyperlink r:id="rId36">
+      <w:hyperlink r:id="rId39">
         <w:r>
           <w:rPr>
             <w:color w:val="1D4D71"/>
@@ -16744,7 +16836,7 @@
         </w:rPr>
         <w:t>不是第五个 flowpipe 方法。另立的</w:t>
       </w:r>
-      <w:hyperlink r:id="rId138">
+      <w:hyperlink r:id="rId141">
         <w:r>
           <w:rPr>
             <w:color w:val="1D4D71"/>
@@ -16844,7 +16936,7 @@
         </w:rPr>
         <w:t xml:space="preserve"> 固定官方 point ONNX，作者可执行顺序 [x,y,speed,heading]→[speed_rate,heading_rate]；640 初盒、0.2 秒×30 到 T=6，全时避开 [1,2]²，终点进入 [-0.5,0.5]²。</w:t>
       </w:r>
-      <w:hyperlink r:id="rId73">
+      <w:hyperlink r:id="rId76">
         <w:r>
           <w:rPr>
             <w:color w:val="1D4D71"/>
@@ -16877,7 +16969,7 @@
         </w:rPr>
         <w:t xml:space="preserve"> 当前 working P3 和原生各有本轮完整 640×600 盒步；Huan/Xiangru 是经审计同合同历史全程。新 Huan 首盒首周期不替代旧全程。</w:t>
       </w:r>
-      <w:hyperlink r:id="rId77">
+      <w:hyperlink r:id="rId80">
         <w:r>
           <w:rPr>
             <w:color w:val="1D4D71"/>
@@ -16893,7 +16985,7 @@
         </w:rPr>
         <w:t>、</w:t>
       </w:r>
-      <w:hyperlink r:id="rId74">
+      <w:hyperlink r:id="rId77">
         <w:r>
           <w:rPr>
             <w:color w:val="1D4D71"/>
@@ -16942,7 +17034,7 @@
         </w:rPr>
         <w:t xml:space="preserve"> 新 P3/原生单次 wall 为 28.999885/1478.865919 秒；</w:t>
       </w:r>
-      <w:hyperlink r:id="rId110">
+      <w:hyperlink r:id="rId113">
         <w:r>
           <w:rPr>
             <w:color w:val="1D4D71"/>
@@ -16958,7 +17050,7 @@
         </w:rPr>
         <w:t>、</w:t>
       </w:r>
-      <w:hyperlink r:id="rId108">
+      <w:hyperlink r:id="rId111">
         <w:r>
           <w:rPr>
             <w:color w:val="1D4D71"/>
@@ -16974,7 +17066,7 @@
         </w:rPr>
         <w:t>和</w:t>
       </w:r>
-      <w:hyperlink r:id="rId107">
+      <w:hyperlink r:id="rId110">
         <w:r>
           <w:rPr>
             <w:color w:val="1D4D71"/>
@@ -17032,7 +17124,7 @@
         </w:rPr>
         <w:t xml:space="preserve"> 同一官方可执行方程，用 set ONNX 和 25 初盒，0.2 秒×30 到 T=6；全时避开 [1,2]²、终点进入 [-0.5,0.5]²。robust 指控制器训练方式，plant 不另加训练噪声。</w:t>
       </w:r>
-      <w:hyperlink r:id="rId73">
+      <w:hyperlink r:id="rId76">
         <w:r>
           <w:rPr>
             <w:color w:val="1D4D71"/>
@@ -17065,7 +17157,7 @@
         </w:rPr>
         <w:t xml:space="preserve"> 当前 working P3 有本轮完整 25×600 盒步；Huan、Xiangru、原生是经审计的同合同历史全程。新 Huan 首盒首周期仅作入口诊断。</w:t>
       </w:r>
-      <w:hyperlink r:id="rId78">
+      <w:hyperlink r:id="rId81">
         <w:r>
           <w:rPr>
             <w:color w:val="1D4D71"/>
@@ -17114,7 +17206,7 @@
         </w:rPr>
         <w:t xml:space="preserve"> 新 P3 单次 wall 18.703898 秒；</w:t>
       </w:r>
-      <w:hyperlink r:id="rId111">
+      <w:hyperlink r:id="rId114">
         <w:r>
           <w:rPr>
             <w:color w:val="1D4D71"/>
@@ -17130,7 +17222,7 @@
         </w:rPr>
         <w:t>、</w:t>
       </w:r>
-      <w:hyperlink r:id="rId109">
+      <w:hyperlink r:id="rId112">
         <w:r>
           <w:rPr>
             <w:color w:val="1D4D71"/>
@@ -17146,7 +17238,7 @@
         </w:rPr>
         <w:t>和</w:t>
       </w:r>
-      <w:hyperlink r:id="rId107">
+      <w:hyperlink r:id="rId110">
         <w:r>
           <w:rPr>
             <w:color w:val="1D4D71"/>
@@ -17204,7 +17296,7 @@
         </w:rPr>
         <w:t xml:space="preserve"> 新主表按用户指定的 2026 论文十二态方程；约 80 秒研究仍按作者旧合同。</w:t>
       </w:r>
-      <w:hyperlink r:id="rId55">
+      <w:hyperlink r:id="rId58">
         <w:r>
           <w:rPr>
             <w:color w:val="1D4D71"/>
@@ -17237,7 +17329,7 @@
         </w:rPr>
         <w:t xml:space="preserve"> P3、Huan、Xiangru、原生各一次完整 1024×1000 数值运行，T=5 的 x3 endpoint 并集均在目标内。原生 checker 仅核终点却打印 VERIFIED；P3/原生保存包络分别自约 T=3.95/3.87 连续入带，Huan/Xiangru 没有逐步坐标范围。</w:t>
       </w:r>
-      <w:hyperlink r:id="rId117">
+      <w:hyperlink r:id="rId120">
         <w:r>
           <w:rPr>
             <w:color w:val="1D4D71"/>
@@ -17270,7 +17362,7 @@
         </w:rPr>
         <w:t xml:space="preserve"> 单次 wall 按 P3/Huan/Xiangru/原生为 1357.555/94.583/108.018/47058.887 秒；</w:t>
       </w:r>
-      <w:hyperlink r:id="rId115">
+      <w:hyperlink r:id="rId118">
         <w:r>
           <w:rPr>
             <w:color w:val="1D4D71"/>
@@ -17286,7 +17378,7 @@
         </w:rPr>
         <w:t>和上方 x3 表给宽度；</w:t>
       </w:r>
-      <w:hyperlink r:id="rId139">
+      <w:hyperlink r:id="rId142">
         <w:r>
           <w:rPr>
             <w:color w:val="1D4D71"/>
@@ -17325,7 +17417,7 @@
                     <pic:cNvPicPr/>
                   </pic:nvPicPr>
                   <pic:blipFill>
-                    <a:blip r:embed="rId140"/>
+                    <a:blip r:embed="rId143"/>
                     <a:stretch>
                       <a:fillRect/>
                     </a:stretch>
@@ -17372,7 +17464,7 @@
         </w:rPr>
         <w:t xml:space="preserve"> </w:t>
       </w:r>
-      <w:hyperlink r:id="rId141">
+      <w:hyperlink r:id="rId144">
         <w:r>
           <w:rPr>
             <w:color w:val="1D4D71"/>
@@ -17430,7 +17522,7 @@
         </w:rPr>
         <w:t>。另立</w:t>
       </w:r>
-      <w:hyperlink r:id="rId142">
+      <w:hyperlink r:id="rId145">
         <w:r>
           <w:rPr>
             <w:color w:val="1D4D71"/>
@@ -17692,6 +17784,113 @@
         <w:rPr>
           <w:b/>
         </w:rPr>
+        <w:t>第二小步与控制包络缺口：</w:t>
+      </w:r>
+      <w:r>
+        <w:rPr>
+          <w:b w:val="0"/>
+        </w:rPr>
+        <w:t xml:space="preserve"> </w:t>
+      </w:r>
+      <w:hyperlink r:id="rId30">
+        <w:r>
+          <w:rPr>
+            <w:color w:val="1D4D71"/>
+            <w:u w:val="single"/>
+            <w:rFonts w:eastAsia="Hiragino Sans GB" w:ascii="Hiragino Sans GB"/>
+          </w:rPr>
+          <w:t>源盒 lane 0 的新隔离门</w:t>
+        </w:r>
+      </w:hyperlink>
+      <w:r>
+        <w:rPr>
+          <w:b w:val="0"/>
+        </w:rPr>
+        <w:t xml:space="preserve">只用保存首控 RPC 回放，同一 </w:t>
+      </w:r>
+      <w:r>
+        <w:rPr>
+          <w:rFonts w:ascii="Menlo" w:hAnsi="Menlo"/>
+          <w:b w:val="0"/>
+          <w:sz w:val="16"/>
+        </w:rPr>
+        <w:t>u'=0</w:t>
+      </w:r>
+      <w:r>
+        <w:rPr>
+          <w:b w:val="0"/>
+        </w:rPr>
+        <w:t xml:space="preserve"> 控制下一次 </w:t>
+      </w:r>
+      <w:r>
+        <w:rPr>
+          <w:rFonts w:ascii="Menlo" w:hAnsi="Menlo"/>
+          <w:b w:val="0"/>
+          <w:sz w:val="16"/>
+        </w:rPr>
+        <w:t>reach(...,0.010,...)</w:t>
+      </w:r>
+      <w:r>
+        <w:rPr>
+          <w:b w:val="0"/>
+        </w:rPr>
+        <w:t xml:space="preserve"> 接受 2/2 小步；首步与旧收据逐值相同，独立 </w:t>
+      </w:r>
+      <w:r>
+        <w:rPr>
+          <w:rFonts w:ascii="Menlo" w:hAnsi="Menlo"/>
+          <w:b w:val="0"/>
+          <w:sz w:val="16"/>
+        </w:rPr>
+        <w:t>H=0.010</w:t>
+      </w:r>
+      <w:r>
+        <w:rPr>
+          <w:b w:val="0"/>
+        </w:rPr>
+        <w:t xml:space="preserve"> plant 检查对第二步 tube、endpoint、终态轴共 20/20 项包含。其余 1023 盒的第二步、lane 0 的后 18 步、后续控制和全时性质仍未闭合。</w:t>
+      </w:r>
+      <w:hyperlink r:id="rId31">
+        <w:r>
+          <w:rPr>
+            <w:color w:val="1D4D71"/>
+            <w:u w:val="single"/>
+            <w:rFonts w:eastAsia="Hiragino Sans GB" w:ascii="Hiragino Sans GB"/>
+          </w:rPr>
+          <w:t>保存 NN 包络合同审计</w:t>
+        </w:r>
+      </w:hyperlink>
+      <w:r>
+        <w:rPr>
+          <w:b w:val="0"/>
+        </w:rPr>
+        <w:t>说明上界斜率未存、直接分离区间法对首盒第一输出过宽约 50.5 倍；</w:t>
+      </w:r>
+      <w:hyperlink r:id="rId32">
+        <w:r>
+          <w:rPr>
+            <w:color w:val="1D4D71"/>
+            <w:u w:val="single"/>
+            <w:rFonts w:eastAsia="Hiragino Sans GB" w:ascii="Hiragino Sans GB"/>
+          </w:rPr>
+          <w:t>首盒相关仿射门</w:t>
+        </w:r>
+      </w:hyperlink>
+      <w:r>
+        <w:rPr>
+          <w:b w:val="0"/>
+        </w:rPr>
+        <w:t>仍未判定，第一输出区间宽 0.09847，未落入宽 0.06710 的保存 residual 带。这些都不是网络输出反例；生产门关闭。</w:t>
+      </w:r>
+    </w:p>
+    <w:p>
+      <w:pPr>
+        <w:pStyle w:val="ListBullet"/>
+      </w:pPr>
+      <w:r>
+        <w:rPr>
+          <w:b/>
+        </w:rPr>
         <w:t>未决：</w:t>
       </w:r>
       <w:r>
@@ -17725,7 +17924,7 @@
         </w:rPr>
         <w:t xml:space="preserve"> 当前具名两物理态 profile 用官方前两条 ODE 和固定控制器，完整初盒 [1,1.175]×[0,0.2]，20 个 0.05 秒期到 T=1；在全部 t∈[0.5,1] 检查 x1∈[0,1]。辅助时钟不进入网络。</w:t>
       </w:r>
-      <w:hyperlink r:id="rId137">
+      <w:hyperlink r:id="rId140">
         <w:r>
           <w:rPr>
             <w:color w:val="1D4D71"/>
@@ -17758,7 +17957,7 @@
         </w:rPr>
         <w:t xml:space="preserve"> P3、Huan、Xiangru、原生各有本轮完整 100 小步，保存性质窗内 x1 tube 均在闭带内；这不是尚缺执行材料的官方三态 MATLAB 身份。</w:t>
       </w:r>
-      <w:hyperlink r:id="rId57">
+      <w:hyperlink r:id="rId60">
         <w:r>
           <w:rPr>
             <w:color w:val="1D4D71"/>
@@ -17774,7 +17973,7 @@
         </w:rPr>
         <w:t>、</w:t>
       </w:r>
-      <w:hyperlink r:id="rId58">
+      <w:hyperlink r:id="rId61">
         <w:r>
           <w:rPr>
             <w:color w:val="1D4D71"/>
@@ -17790,7 +17989,7 @@
         </w:rPr>
         <w:t>、</w:t>
       </w:r>
-      <w:hyperlink r:id="rId103">
+      <w:hyperlink r:id="rId106">
         <w:r>
           <w:rPr>
             <w:color w:val="1D4D71"/>
@@ -17823,7 +18022,7 @@
         </w:rPr>
         <w:t xml:space="preserve"> 各方法有首轮和五次后续独立进程，逐次见 campaign；P3 安全窗 x1 tube union 为 [0.5645452654370386,0.9932406822927875]。</w:t>
       </w:r>
-      <w:hyperlink r:id="rId143">
+      <w:hyperlink r:id="rId146">
         <w:r>
           <w:rPr>
             <w:color w:val="1D4D71"/>
@@ -17853,7 +18052,7 @@
         </w:rPr>
         <w:t xml:space="preserve"> 全 100 步 tube，下排展示末段 endpoint 相对 Huan 的小差值；Huan/Xiangru 保存界直接一致。</w:t>
       </w:r>
-      <w:hyperlink r:id="rId144">
+      <w:hyperlink r:id="rId147">
         <w:r>
           <w:rPr>
             <w:color w:val="1D4D71"/>
@@ -17869,7 +18068,7 @@
         </w:rPr>
         <w:t>及</w:t>
       </w:r>
-      <w:hyperlink r:id="rId145">
+      <w:hyperlink r:id="rId148">
         <w:r>
           <w:rPr>
             <w:color w:val="1D4D71"/>
@@ -17908,7 +18107,7 @@
                     <pic:cNvPicPr/>
                   </pic:nvPicPr>
                   <pic:blipFill>
-                    <a:blip r:embed="rId146"/>
+                    <a:blip r:embed="rId149"/>
                     <a:stretch>
                       <a:fillRect/>
                     </a:stretch>
@@ -17980,7 +18179,7 @@
         </w:rPr>
         <w:t xml:space="preserve"> 完整初盒切成 12 盒，控制输出只减一次 10；20 个 1 秒期、200 个 0.1 秒子步到 T=20，全时安全盒 [-2,2]^4。</w:t>
       </w:r>
-      <w:hyperlink r:id="rId59">
+      <w:hyperlink r:id="rId62">
         <w:r>
           <w:rPr>
             <w:color w:val="1D4D71"/>
@@ -18060,7 +18259,7 @@
         </w:rPr>
         <w:t xml:space="preserve"> 与统一余项初猜的新</w:t>
       </w:r>
-      <w:hyperlink r:id="rId147">
+      <w:hyperlink r:id="rId150">
         <w:r>
           <w:rPr>
             <w:color w:val="1D4D71"/>
@@ -18146,7 +18345,7 @@
         </w:rPr>
         <w:t xml:space="preserve"> 的</w:t>
       </w:r>
-      <w:hyperlink r:id="rId148">
+      <w:hyperlink r:id="rId151">
         <w:r>
           <w:rPr>
             <w:color w:val="1D4D71"/>
@@ -18179,7 +18378,7 @@
         </w:rPr>
         <w:t xml:space="preserve"> P3/原生完整单次 wall 为 10.411001/8.339151 秒；Huan/Xiangru 约 8 秒仅为失败进程。</w:t>
       </w:r>
-      <w:hyperlink r:id="rId120">
+      <w:hyperlink r:id="rId123">
         <w:r>
           <w:rPr>
             <w:color w:val="1D4D71"/>
@@ -18195,7 +18394,7 @@
         </w:rPr>
         <w:t>把未完成终点留空，</w:t>
       </w:r>
-      <w:hyperlink r:id="rId149">
+      <w:hyperlink r:id="rId152">
         <w:r>
           <w:rPr>
             <w:color w:val="1D4D71"/>
@@ -18256,7 +18455,7 @@
         </w:rPr>
         <w:t xml:space="preserve"> </w:t>
       </w:r>
-      <w:hyperlink r:id="rId150">
+      <w:hyperlink r:id="rId153">
         <w:r>
           <w:rPr>
             <w:color w:val="1D4D71"/>
@@ -18300,7 +18499,7 @@
         </w:rPr>
         <w:t>，前三方没有明确 checker 文字输出。</w:t>
       </w:r>
-      <w:hyperlink r:id="rId151">
+      <w:hyperlink r:id="rId154">
         <w:r>
           <w:rPr>
             <w:color w:val="1D4D71"/>
@@ -18316,7 +18515,7 @@
         </w:rPr>
         <w:t>与</w:t>
       </w:r>
-      <w:hyperlink r:id="rId152">
+      <w:hyperlink r:id="rId155">
         <w:r>
           <w:rPr>
             <w:color w:val="1D4D71"/>
@@ -18386,7 +18585,7 @@
         </w:rPr>
         <w:t>，也不提供稳定速度排名或独立端到端 NNCS 证明。</w:t>
       </w:r>
-      <w:hyperlink r:id="rId153">
+      <w:hyperlink r:id="rId156">
         <w:r>
           <w:rPr>
             <w:color w:val="1D4D71"/>
@@ -18402,7 +18601,7 @@
         </w:rPr>
         <w:t>、</w:t>
       </w:r>
-      <w:hyperlink r:id="rId154">
+      <w:hyperlink r:id="rId157">
         <w:r>
           <w:rPr>
             <w:color w:val="1D4D71"/>
@@ -18418,7 +18617,7 @@
         </w:rPr>
         <w:t>、</w:t>
       </w:r>
-      <w:hyperlink r:id="rId155">
+      <w:hyperlink r:id="rId158">
         <w:r>
           <w:rPr>
             <w:color w:val="1D4D71"/>
@@ -18457,7 +18656,7 @@
                     <pic:cNvPicPr/>
                   </pic:nvPicPr>
                   <pic:blipFill>
-                    <a:blip r:embed="rId156"/>
+                    <a:blip r:embed="rId159"/>
                     <a:stretch>
                       <a:fillRect/>
                     </a:stretch>
@@ -18512,7 +18711,7 @@
         </w:rPr>
         <w:t xml:space="preserve"> 用户选定官方 2026 四层 sigmoid 模型及 u=11f；四态完整初盒、0.5 秒×10 到 T=5，目标 x1∈[-0.1,0.2]、x2∈[-0.9,-0.6]。</w:t>
       </w:r>
-      <w:hyperlink r:id="rId157">
+      <w:hyperlink r:id="rId160">
         <w:r>
           <w:rPr>
             <w:color w:val="1D4D71"/>
@@ -18545,7 +18744,7 @@
         </w:rPr>
         <w:t xml:space="preserve"> P3、Huan、Xiangru、原生均有本轮 500/500 小步，保存 T=5 目标坐标全盒入目标。P3/Huan/Xiangru 未执行性质 checker，只有原生作者终点 checker 打印 VERIFIED；Huan/Xiangru 共用驱动。</w:t>
       </w:r>
-      <w:hyperlink r:id="rId158">
+      <w:hyperlink r:id="rId161">
         <w:r>
           <w:rPr>
             <w:color w:val="1D4D71"/>
@@ -18578,7 +18777,7 @@
         </w:rPr>
         <w:t xml:space="preserve"> P3/原生单次 wall 为 13.741791/8.991666 秒，Huan/Xiangru 时间见各</w:t>
       </w:r>
-      <w:hyperlink r:id="rId89">
+      <w:hyperlink r:id="rId92">
         <w:r>
           <w:rPr>
             <w:color w:val="1D4D71"/>
@@ -18594,7 +18793,7 @@
         </w:rPr>
         <w:t>和</w:t>
       </w:r>
-      <w:hyperlink r:id="rId91">
+      <w:hyperlink r:id="rId94">
         <w:r>
           <w:rPr>
             <w:color w:val="1D4D71"/>
@@ -18610,7 +18809,7 @@
         </w:rPr>
         <w:t>摘要；四态终点绝对界见 CSV。</w:t>
       </w:r>
-      <w:hyperlink r:id="rId159">
+      <w:hyperlink r:id="rId162">
         <w:r>
           <w:rPr>
             <w:color w:val="1D4D71"/>
@@ -18649,7 +18848,7 @@
                     <pic:cNvPicPr/>
                   </pic:nvPicPr>
                   <pic:blipFill>
-                    <a:blip r:embed="rId160"/>
+                    <a:blip r:embed="rId163"/>
                     <a:stretch>
                       <a:fillRect/>
                     </a:stretch>
@@ -18721,7 +18920,7 @@
         </w:rPr>
         <w:t xml:space="preserve"> 固定官方 ReLU³/tanh 网络及 u=11f；和 sigmoid 共用四态 ODE、初盒、0.5 秒×10 与终点目标。</w:t>
       </w:r>
-      <w:hyperlink r:id="rId157">
+      <w:hyperlink r:id="rId160">
         <w:r>
           <w:rPr>
             <w:color w:val="1D4D71"/>
@@ -18754,7 +18953,7 @@
         </w:rPr>
         <w:t xml:space="preserve"> 新</w:t>
       </w:r>
-      <w:hyperlink r:id="rId96">
+      <w:hyperlink r:id="rId99">
         <w:r>
           <w:rPr>
             <w:color w:val="1D4D71"/>
@@ -18770,7 +18969,7 @@
         </w:rPr>
         <w:t xml:space="preserve"> 50/50 接受后，另立</w:t>
       </w:r>
-      <w:hyperlink r:id="rId97">
+      <w:hyperlink r:id="rId100">
         <w:r>
           <w:rPr>
             <w:color w:val="1D4D71"/>
@@ -18800,7 +18999,7 @@
         </w:rPr>
         <w:t xml:space="preserve"> P3 仍保留作历史对照，不能改名为当前 working P3。</w:t>
       </w:r>
-      <w:hyperlink r:id="rId161">
+      <w:hyperlink r:id="rId164">
         <w:r>
           <w:rPr>
             <w:color w:val="1D4D71"/>
@@ -18903,7 +19102,7 @@
         </w:rPr>
         <w:t>；逐步 500 条范围独立扫描有限、有序且 endpoint 逐段包含。</w:t>
       </w:r>
-      <w:hyperlink r:id="rId162">
+      <w:hyperlink r:id="rId165">
         <w:r>
           <w:rPr>
             <w:color w:val="1D4D71"/>
@@ -18919,7 +19118,7 @@
         </w:rPr>
         <w:t>逐行标明 P3 为新、其它三方为历史；本轮没有同资源四方计时，不据旧新混合样本排名。</w:t>
       </w:r>
-      <w:hyperlink r:id="rId163">
+      <w:hyperlink r:id="rId166">
         <w:r>
           <w:rPr>
             <w:color w:val="1D4D71"/>
@@ -18972,7 +19171,7 @@
                     <pic:cNvPicPr/>
                   </pic:nvPicPr>
                   <pic:blipFill>
-                    <a:blip r:embed="rId164"/>
+                    <a:blip r:embed="rId167"/>
                     <a:stretch>
                       <a:fillRect/>
                     </a:stretch>
@@ -19058,7 +19257,7 @@
         </w:rPr>
         <w:t xml:space="preserve"> 用户指定论文方程：常值 w∈[-10⁻⁴,10⁻⁴] 只加速度导数，完整四态初盒、0.2 秒×50 到 T=10；目标 [-0.6,0.6]×[-0.2,0.2]×[-0.06,0.06]×[-0.3,0.3]。</w:t>
       </w:r>
-      <w:hyperlink r:id="rId165">
+      <w:hyperlink r:id="rId168">
         <w:r>
           <w:rPr>
             <w:color w:val="1D4D71"/>
@@ -19091,7 +19290,7 @@
         </w:rPr>
         <w:t xml:space="preserve"> P3、Huan、Xiangru、原生各有 500/500 小步。P3/原生保存 T=10 全盒终点入目标，原生作者终点 checker 打印 VERIFIED；Huan/Xiangru 的 x3/x4 终点盒未全入目标，程序 UNKNOWN。</w:t>
       </w:r>
-      <w:hyperlink r:id="rId166">
+      <w:hyperlink r:id="rId169">
         <w:r>
           <w:rPr>
             <w:color w:val="1D4D71"/>
@@ -19135,7 +19334,7 @@
         </w:rPr>
         <w:t xml:space="preserve"> 的完整初盒 endpoint 入目标；Huan/Xiangru 的 500 个已保存 endpoint 无一次四态同时全入目标，这不能推成整个窗口不可达。</w:t>
       </w:r>
-      <w:hyperlink r:id="rId167">
+      <w:hyperlink r:id="rId170">
         <w:r>
           <w:rPr>
             <w:color w:val="1D4D71"/>
@@ -19151,7 +19350,7 @@
         </w:rPr>
         <w:t>与</w:t>
       </w:r>
-      <w:hyperlink r:id="rId168">
+      <w:hyperlink r:id="rId171">
         <w:r>
           <w:rPr>
             <w:color w:val="1D4D71"/>
@@ -19184,7 +19383,7 @@
         </w:rPr>
         <w:t xml:space="preserve"> 单次外层 wall 按 P3/Huan/Xiangru/原生为 17.819782/9.594389/9.895126/10.397308 秒；</w:t>
       </w:r>
-      <w:hyperlink r:id="rId169">
+      <w:hyperlink r:id="rId172">
         <w:r>
           <w:rPr>
             <w:color w:val="1D4D71"/>
@@ -19200,7 +19399,7 @@
         </w:rPr>
         <w:t>来自保存范围，各方法阶数不同。</w:t>
       </w:r>
-      <w:hyperlink r:id="rId170">
+      <w:hyperlink r:id="rId173">
         <w:r>
           <w:rPr>
             <w:color w:val="1D4D71"/>
@@ -19267,7 +19466,7 @@
                     <pic:cNvPicPr/>
                   </pic:nvPicPr>
                   <pic:blipFill>
-                    <a:blip r:embed="rId171"/>
+                    <a:blip r:embed="rId174"/>
                     <a:stretch>
                       <a:fillRect/>
                     </a:stretch>
@@ -19330,7 +19529,7 @@
         </w:rPr>
         <w:t>原因、模式、移植技巧与历史证据见</w:t>
       </w:r>
-      <w:hyperlink r:id="rId99">
+      <w:hyperlink r:id="rId102">
         <w:r>
           <w:rPr>
             <w:color w:val="1D4D71"/>
@@ -19360,7 +19559,7 @@
         </w:rPr>
         <w:t xml:space="preserve"> 当同合同加速比。新论文方程下 Huan parity 单次 94.583 s 已独立列于 QUAD 节，也不能直接与旧 75.250099 s 作优化倍率。40 步 parity/strict 与阶段计时只解释早期成本，不外推 1000 步；见</w:t>
       </w:r>
-      <w:hyperlink r:id="rId172">
+      <w:hyperlink r:id="rId175">
         <w:r>
           <w:rPr>
             <w:color w:val="1D4D71"/>
@@ -19376,7 +19575,7 @@
         </w:rPr>
         <w:t>。旧作者合同的另一组 P3 无 JIT 40 步 observer 开/关成对尝试在终步每盒数值数组直接一致的条件下，单对 driver 时间差仅 0.230546 s；两臂均省去旧完整运行的诊断签名，因此它不测签名净成本，也不支持删除逐步绘图记录或宣称全程加速，见</w:t>
       </w:r>
-      <w:hyperlink r:id="rId173">
+      <w:hyperlink r:id="rId176">
         <w:r>
           <w:rPr>
             <w:color w:val="1D4D71"/>
@@ -19400,7 +19599,7 @@
         </w:rPr>
         <w:t>另立</w:t>
       </w:r>
-      <w:hyperlink r:id="rId174">
+      <w:hyperlink r:id="rId177">
         <w:r>
           <w:rPr>
             <w:color w:val="1D4D71"/>
@@ -19418,7 +19617,7 @@
       </w:r>
     </w:p>
     <w:p>
-      <w:hyperlink r:id="rId175">
+      <w:hyperlink r:id="rId178">
         <w:r>
           <w:rPr>
             <w:color w:val="1D4D71"/>
@@ -19436,7 +19635,7 @@
       </w:r>
     </w:p>
     <w:p>
-      <w:hyperlink r:id="rId176">
+      <w:hyperlink r:id="rId179">
         <w:r>
           <w:rPr>
             <w:color w:val="1D4D71"/>
@@ -19508,7 +19707,7 @@
         </w:rPr>
         <w:t>图层、tube/endpoint 语义与 MATLAB/替代渲染边界见</w:t>
       </w:r>
-      <w:hyperlink r:id="rId177">
+      <w:hyperlink r:id="rId180">
         <w:r>
           <w:rPr>
             <w:color w:val="1D4D71"/>
@@ -19524,7 +19723,7 @@
         </w:rPr>
         <w:t>和</w:t>
       </w:r>
-      <w:hyperlink r:id="rId178">
+      <w:hyperlink r:id="rId181">
         <w:r>
           <w:rPr>
             <w:color w:val="1D4D71"/>
@@ -19540,7 +19739,7 @@
         </w:rPr>
         <w:t>。本轮新增</w:t>
       </w:r>
-      <w:hyperlink r:id="rId179">
+      <w:hyperlink r:id="rId182">
         <w:r>
           <w:rPr>
             <w:color w:val="1D4D71"/>
@@ -19648,7 +19847,7 @@
         </w:rPr>
         <w:t>入口现在可重复指定兼容的 v1 保存几何，在同一坐标轴叠加多方法，并在回执中分别记录几何验证/导出、MATLAB 生成和 PNG/PDF 渲染用时。</w:t>
       </w:r>
-      <w:hyperlink r:id="rId180">
+      <w:hyperlink r:id="rId183">
         <w:r>
           <w:rPr>
             <w:color w:val="1D4D71"/>
@@ -19672,7 +19871,7 @@
         </w:rPr>
         <w:t>本轮还从新保存记录直接生成了</w:t>
       </w:r>
-      <w:hyperlink r:id="rId124">
+      <w:hyperlink r:id="rId127">
         <w:r>
           <w:rPr>
             <w:color w:val="1D4D71"/>
@@ -19688,7 +19887,7 @@
         </w:rPr>
         <w:t>、</w:t>
       </w:r>
-      <w:hyperlink r:id="rId181">
+      <w:hyperlink r:id="rId184">
         <w:r>
           <w:rPr>
             <w:color w:val="1D4D71"/>
@@ -19704,7 +19903,7 @@
         </w:rPr>
         <w:t>，并在原生全程完成后生成上节</w:t>
       </w:r>
-      <w:hyperlink r:id="rId139">
+      <w:hyperlink r:id="rId142">
         <w:r>
           <w:rPr>
             <w:color w:val="1D4D71"/>
@@ -19771,7 +19970,7 @@
                     <pic:cNvPicPr/>
                   </pic:nvPicPr>
                   <pic:blipFill>
-                    <a:blip r:embed="rId182"/>
+                    <a:blip r:embed="rId185"/>
                     <a:stretch>
                       <a:fillRect/>
                     </a:stretch>
@@ -19821,7 +20020,7 @@
       </w:r>
     </w:p>
     <w:p>
-      <w:hyperlink r:id="rId128">
+      <w:hyperlink r:id="rId131">
         <w:r>
           <w:rPr>
             <w:color w:val="1D4D71"/>
@@ -19873,7 +20072,7 @@
         </w:rPr>
         <w:t>新增的</w:t>
       </w:r>
-      <w:hyperlink r:id="rId183">
+      <w:hyperlink r:id="rId186">
         <w:r>
           <w:rPr>
             <w:color w:val="1D4D71"/>
@@ -19935,7 +20134,7 @@
         </w:rPr>
         <w:t>保存新完成、短程 smoke 与失败预检的不同资格。</w:t>
       </w:r>
-      <w:hyperlink r:id="rId184">
+      <w:hyperlink r:id="rId187">
         <w:r>
           <w:rPr>
             <w:color w:val="1D4D71"/>
@@ -19951,7 +20150,7 @@
         </w:rPr>
         <w:t>索引已复制的小型运行收据、范围、图和阶段报告；大多数官方第三方 ONNX/MAT 不重复发布；TORA reach 新 run 目录保留了小型输入模型副本，原生论文 QUAD 长作业的远端范围文件仍留原路径。DP less native 的</w:t>
       </w:r>
-      <w:hyperlink r:id="rId30">
+      <w:hyperlink r:id="rId33">
         <w:r>
           <w:rPr>
             <w:color w:val="1D4D71"/>
@@ -19967,7 +20166,7 @@
         </w:rPr>
         <w:t>收有 START/RESULT、原始日志、完整范围文件、复制来源与三组图；新 QUAD Huan 的</w:t>
       </w:r>
-      <w:hyperlink r:id="rId52">
+      <w:hyperlink r:id="rId55">
         <w:r>
           <w:rPr>
             <w:color w:val="1D4D71"/>
@@ -19987,7 +20186,6 @@
     <w:p>
       <w:pPr>
         <w:pStyle w:val="Heading1"/>
-        <w:pageBreakBefore/>
       </w:pPr>
       <w:r>
         <w:t>最终发布门</w:t>

</xml_diff>

<commit_message>
Record full old-author QUAD candidate and refreshed stage report
</commit_message>
<xml_diff>
--- a/docs/evidence/results/archcomp26_20261001/stage_report/ARCHCOMP26_FULL_STAGE_DRAFT_200_20261003.docx
+++ b/docs/evidence/results/archcomp26_20261001/stage_report/ARCHCOMP26_FULL_STAGE_DRAFT_200_20261003.docx
@@ -868,7 +868,7 @@
         <w:rPr>
           <w:b w:val="0"/>
         </w:rPr>
-        <w:t xml:space="preserve">发现原 RPC 未保存上界斜率或独立 same-slope 证据；首盒第一输出直接分离区间法的 </w:t>
+        <w:t xml:space="preserve">发现原 RPC 未保存上界斜率；首盒第一输出直接分离区间法的 </w:t>
       </w:r>
       <w:r>
         <w:rPr>
@@ -912,7 +912,81 @@
         <w:rPr>
           <w:b w:val="0"/>
         </w:rPr>
-        <w:t>：第一输出的独立残差包络宽 0.09847，大于保存带宽 0.06710；其余两输出亦未包含。这是外包络过宽，不是网络反例；64 子盒尝试未完成，不能称覆盖。原生生产门仍关闭，这些诊断不增加主表格数。</w:t>
+        <w:t>：第一输出的独立残差包络宽 0.09847，大于保存带宽 0.06710；其余两输出亦未包含。这是外包络过宽，不是网络反例；64 子盒尝试未完成，不能称覆盖。</w:t>
+      </w:r>
+      <w:hyperlink r:id="rId33">
+        <w:r>
+          <w:rPr>
+            <w:color w:val="1D4D71"/>
+            <w:u w:val="single"/>
+            <w:rFonts w:eastAsia="Hiragino Sans GB" w:ascii="Hiragino Sans GB"/>
+          </w:rPr>
+          <w:t>全 1024 盒系数传输门</w:t>
+        </w:r>
+      </w:hyperlink>
+      <w:r>
+        <w:rPr>
+          <w:b w:val="0"/>
+        </w:rPr>
+        <w:t xml:space="preserve">另显示，原 CROWN 理想仿射证书在原生 </w:t>
+      </w:r>
+      <w:r>
+        <w:rPr>
+          <w:rFonts w:ascii="Menlo" w:hAnsi="Menlo"/>
+          <w:b w:val="0"/>
+          <w:sz w:val="16"/>
+        </w:rPr>
+        <w:t>.asFloat()</w:t>
+      </w:r>
+      <w:r>
+        <w:rPr>
+          <w:b w:val="0"/>
+        </w:rPr>
+        <w:t xml:space="preserve"> 后没有自动继承的充分条件：三个输出的下界分别有 573、615、533 盒不满足，以上界同斜率为额外假设时，任一侧分别为 833、828、795 盒不满足。这也不是实际网络越界证据。</w:t>
+      </w:r>
+      <w:hyperlink r:id="rId34">
+        <w:r>
+          <w:rPr>
+            <w:color w:val="1D4D71"/>
+            <w:u w:val="single"/>
+            <w:rFonts w:eastAsia="Hiragino Sans GB" w:ascii="Hiragino Sans GB"/>
+          </w:rPr>
+          <w:t>新同批控制器回放</w:t>
+        </w:r>
+      </w:hyperlink>
+      <w:r>
+        <w:rPr>
+          <w:b w:val="0"/>
+        </w:rPr>
+        <w:t>补录上界斜率：新旧三组原已存系数 43,008 项逐值相同，</w:t>
+      </w:r>
+      <w:r>
+        <w:rPr>
+          <w:rFonts w:ascii="Menlo" w:hAnsi="Menlo"/>
+          <w:b w:val="0"/>
+          <w:sz w:val="16"/>
+        </w:rPr>
+        <w:t>uA=lA</w:t>
+      </w:r>
+      <w:r>
+        <w:rPr>
+          <w:b w:val="0"/>
+        </w:rPr>
+        <w:t xml:space="preserve"> 的 36,864 项逐值相同。它只闭合首批数值回放的 same-slope 记录，仍未证明 CROWN 浮点 soundness 或原生 </w:t>
+      </w:r>
+      <w:r>
+        <w:rPr>
+          <w:rFonts w:ascii="Menlo" w:hAnsi="Menlo"/>
+          <w:b w:val="0"/>
+          <w:sz w:val="16"/>
+        </w:rPr>
+        <w:t>float32</w:t>
+      </w:r>
+      <w:r>
+        <w:rPr>
+          <w:b w:val="0"/>
+        </w:rPr>
+        <w:t xml:space="preserve"> 包络；生产门关闭。这些诊断不增加主表格数。</w:t>
       </w:r>
     </w:p>
     <w:p>
@@ -993,7 +1067,7 @@
         </w:rPr>
         <w:t>；单次全进程 1107.127423 s。见</w:t>
       </w:r>
-      <w:hyperlink r:id="rId33">
+      <w:hyperlink r:id="rId35">
         <w:r>
           <w:rPr>
             <w:color w:val="1D4D71"/>
@@ -1061,7 +1135,7 @@
         </w:rPr>
         <w:t>与原生共用 225 盒 × 100 小步合同，各接受 22,500/22,500；进程 wall 分别 9.539174 s / 8.387790 s，保存 tube 各在全时安全带内。见</w:t>
       </w:r>
-      <w:hyperlink r:id="rId34">
+      <w:hyperlink r:id="rId36">
         <w:r>
           <w:rPr>
             <w:color w:val="1D4D71"/>
@@ -1157,7 +1231,7 @@
         </w:rPr>
         <w:t xml:space="preserve"> 内，最小盒裕量 +0.093919848；外层 wall 74.274085 s。见</w:t>
       </w:r>
-      <w:hyperlink r:id="rId35">
+      <w:hyperlink r:id="rId37">
         <w:r>
           <w:rPr>
             <w:color w:val="1D4D71"/>
@@ -1337,7 +1411,7 @@
         </w:rPr>
         <w:t>。见</w:t>
       </w:r>
-      <w:hyperlink r:id="rId36">
+      <w:hyperlink r:id="rId38">
         <w:r>
           <w:rPr>
             <w:color w:val="1D4D71"/>
@@ -1353,7 +1427,7 @@
         </w:rPr>
         <w:t>、</w:t>
       </w:r>
-      <w:hyperlink r:id="rId37">
+      <w:hyperlink r:id="rId39">
         <w:r>
           <w:rPr>
             <w:color w:val="1D4D71"/>
@@ -1369,7 +1443,7 @@
         </w:rPr>
         <w:t>、</w:t>
       </w:r>
-      <w:hyperlink r:id="rId38">
+      <w:hyperlink r:id="rId40">
         <w:r>
           <w:rPr>
             <w:color w:val="1D4D71"/>
@@ -1385,7 +1459,7 @@
         </w:rPr>
         <w:t>及</w:t>
       </w:r>
-      <w:hyperlink r:id="rId39">
+      <w:hyperlink r:id="rId41">
         <w:r>
           <w:rPr>
             <w:color w:val="1D4D71"/>
@@ -1495,7 +1569,7 @@
         </w:rPr>
         <w:t>、wall 16.616363 s，未输出终局作者性质标签。见</w:t>
       </w:r>
-      <w:hyperlink r:id="rId40">
+      <w:hyperlink r:id="rId42">
         <w:r>
           <w:rPr>
             <w:color w:val="1D4D71"/>
@@ -1633,7 +1707,7 @@
         </w:rPr>
         <w:t>、wall 62.360384 s 仅是早停进程时间。见</w:t>
       </w:r>
-      <w:hyperlink r:id="rId41">
+      <w:hyperlink r:id="rId43">
         <w:r>
           <w:rPr>
             <w:color w:val="1D4D71"/>
@@ -1649,7 +1723,7 @@
         </w:rPr>
         <w:t>与</w:t>
       </w:r>
-      <w:hyperlink r:id="rId38">
+      <w:hyperlink r:id="rId40">
         <w:r>
           <w:rPr>
             <w:color w:val="1D4D71"/>
@@ -1773,7 +1847,7 @@
         </w:rPr>
         <w:t>。见</w:t>
       </w:r>
-      <w:hyperlink r:id="rId42">
+      <w:hyperlink r:id="rId44">
         <w:r>
           <w:rPr>
             <w:color w:val="1D4D71"/>
@@ -1789,7 +1863,7 @@
         </w:rPr>
         <w:t>和</w:t>
       </w:r>
-      <w:hyperlink r:id="rId43">
+      <w:hyperlink r:id="rId45">
         <w:r>
           <w:rPr>
             <w:color w:val="1D4D71"/>
@@ -1913,7 +1987,7 @@
         </w:rPr>
         <w:t>、空范围和当时源码见</w:t>
       </w:r>
-      <w:hyperlink r:id="rId44">
+      <w:hyperlink r:id="rId46">
         <w:r>
           <w:rPr>
             <w:color w:val="1D4D71"/>
@@ -1929,7 +2003,7 @@
         </w:rPr>
         <w:t>。另立</w:t>
       </w:r>
-      <w:hyperlink r:id="rId45">
+      <w:hyperlink r:id="rId47">
         <w:r>
           <w:rPr>
             <w:color w:val="1D4D71"/>
@@ -2109,7 +2183,7 @@
         </w:rPr>
         <w:t xml:space="preserve"> 与 observations 均为空。原</w:t>
       </w:r>
-      <w:hyperlink r:id="rId46">
+      <w:hyperlink r:id="rId48">
         <w:r>
           <w:rPr>
             <w:color w:val="1D4D71"/>
@@ -2125,7 +2199,7 @@
         </w:rPr>
         <w:t>没有保留四界；随后独立</w:t>
       </w:r>
-      <w:hyperlink r:id="rId47">
+      <w:hyperlink r:id="rId49">
         <w:r>
           <w:rPr>
             <w:color w:val="1D4D71"/>
@@ -2291,7 +2365,7 @@
         </w:rPr>
         <w:t xml:space="preserve"> 对零 tube 是空真，非性质结论；见</w:t>
       </w:r>
-      <w:hyperlink r:id="rId48">
+      <w:hyperlink r:id="rId50">
         <w:r>
           <w:rPr>
             <w:color w:val="1D4D71"/>
@@ -2443,7 +2517,7 @@
         </w:rPr>
         <w:t>。两次初盒和 CROWN RPC 逐值一致，见</w:t>
       </w:r>
-      <w:hyperlink r:id="rId49">
+      <w:hyperlink r:id="rId51">
         <w:r>
           <w:rPr>
             <w:color w:val="1D4D71"/>
@@ -2581,7 +2655,7 @@
         </w:rPr>
         <w:t>。新旧初盒及 RPC 逐值相同，见</w:t>
       </w:r>
-      <w:hyperlink r:id="rId50">
+      <w:hyperlink r:id="rId52">
         <w:r>
           <w:rPr>
             <w:color w:val="1D4D71"/>
@@ -2663,7 +2737,7 @@
         </w:rPr>
         <w:t xml:space="preserve"> 与余项。新 </w:t>
       </w:r>
-      <w:hyperlink r:id="rId51">
+      <w:hyperlink r:id="rId53">
         <w:r>
           <w:rPr>
             <w:color w:val="1D4D71"/>
@@ -2693,7 +2767,7 @@
         </w:rPr>
         <w:t xml:space="preserve">，19/19 Picard 自包含、1 RPC、1 段数值接受，status 2、exit 0。新 </w:t>
       </w:r>
-      <w:hyperlink r:id="rId52">
+      <w:hyperlink r:id="rId54">
         <w:r>
           <w:rPr>
             <w:color w:val="1D4D71"/>
@@ -2774,7 +2848,7 @@
         </w:rPr>
         <w:t xml:space="preserve"> 是性质 Unknown，不是 Picard 拒绝或实际不安全轨迹。</w:t>
       </w:r>
-      <w:hyperlink r:id="rId53">
+      <w:hyperlink r:id="rId55">
         <w:r>
           <w:rPr>
             <w:color w:val="1D4D71"/>
@@ -2931,7 +3005,7 @@
         </w:rPr>
         <w:t>。见</w:t>
       </w:r>
-      <w:hyperlink r:id="rId54">
+      <w:hyperlink r:id="rId56">
         <w:r>
           <w:rPr>
             <w:color w:val="1D4D71"/>
@@ -2947,7 +3021,7 @@
         </w:rPr>
         <w:t>、</w:t>
       </w:r>
-      <w:hyperlink r:id="rId55">
+      <w:hyperlink r:id="rId57">
         <w:r>
           <w:rPr>
             <w:color w:val="1D4D71"/>
@@ -2963,7 +3037,7 @@
         </w:rPr>
         <w:t>、</w:t>
       </w:r>
-      <w:hyperlink r:id="rId56">
+      <w:hyperlink r:id="rId58">
         <w:r>
           <w:rPr>
             <w:color w:val="1D4D71"/>
@@ -2979,7 +3053,7 @@
         </w:rPr>
         <w:t>、</w:t>
       </w:r>
-      <w:hyperlink r:id="rId57">
+      <w:hyperlink r:id="rId59">
         <w:r>
           <w:rPr>
             <w:color w:val="1D4D71"/>
@@ -2995,7 +3069,7 @@
         </w:rPr>
         <w:t>与</w:t>
       </w:r>
-      <w:hyperlink r:id="rId58">
+      <w:hyperlink r:id="rId60">
         <w:r>
           <w:rPr>
             <w:color w:val="1D4D71"/>
@@ -3161,7 +3235,7 @@
         </w:rPr>
         <w:t>，其它三方对应保存 tube 也在带内。见</w:t>
       </w:r>
-      <w:hyperlink r:id="rId59">
+      <w:hyperlink r:id="rId61">
         <w:r>
           <w:rPr>
             <w:color w:val="1D4D71"/>
@@ -3177,7 +3251,7 @@
         </w:rPr>
         <w:t>、</w:t>
       </w:r>
-      <w:hyperlink r:id="rId60">
+      <w:hyperlink r:id="rId62">
         <w:r>
           <w:rPr>
             <w:color w:val="1D4D71"/>
@@ -3193,7 +3267,7 @@
         </w:rPr>
         <w:t>及</w:t>
       </w:r>
-      <w:hyperlink r:id="rId61">
+      <w:hyperlink r:id="rId63">
         <w:r>
           <w:rPr>
             <w:color w:val="1D4D71"/>
@@ -3317,7 +3391,7 @@
         </w:rPr>
         <w:t>，各自进程 wall 8.371523 s / 8.270158 s。见</w:t>
       </w:r>
-      <w:hyperlink r:id="rId62">
+      <w:hyperlink r:id="rId64">
         <w:r>
           <w:rPr>
             <w:color w:val="1D4D71"/>
@@ -3333,7 +3407,7 @@
         </w:rPr>
         <w:t>、</w:t>
       </w:r>
-      <w:hyperlink r:id="rId63">
+      <w:hyperlink r:id="rId65">
         <w:r>
           <w:rPr>
             <w:color w:val="1D4D71"/>
@@ -3349,7 +3423,7 @@
         </w:rPr>
         <w:t>、</w:t>
       </w:r>
-      <w:hyperlink r:id="rId64">
+      <w:hyperlink r:id="rId66">
         <w:r>
           <w:rPr>
             <w:color w:val="1D4D71"/>
@@ -3365,7 +3439,7 @@
         </w:rPr>
         <w:t>及</w:t>
       </w:r>
-      <w:hyperlink r:id="rId65">
+      <w:hyperlink r:id="rId67">
         <w:r>
           <w:rPr>
             <w:color w:val="1D4D71"/>
@@ -3475,7 +3549,7 @@
         </w:rPr>
         <w:t xml:space="preserve"> 下界最小分别为 16.434859 / 16.165035 / 16.165035 / 16.254754，全部严格为正。最初各一次单独进程 wall 分别为 7.934 / 7.260 / 7.312 / 7.930 s；随后另开四方各 1 首轮+5 后续独立进程的轮换 campaign，均走完 50/50，详见下表。见</w:t>
       </w:r>
-      <w:hyperlink r:id="rId66">
+      <w:hyperlink r:id="rId68">
         <w:r>
           <w:rPr>
             <w:color w:val="1D4D71"/>
@@ -3491,7 +3565,7 @@
         </w:rPr>
         <w:t>、</w:t>
       </w:r>
-      <w:hyperlink r:id="rId67">
+      <w:hyperlink r:id="rId69">
         <w:r>
           <w:rPr>
             <w:color w:val="1D4D71"/>
@@ -3507,7 +3581,7 @@
         </w:rPr>
         <w:t>、</w:t>
       </w:r>
-      <w:hyperlink r:id="rId68">
+      <w:hyperlink r:id="rId70">
         <w:r>
           <w:rPr>
             <w:color w:val="1D4D71"/>
@@ -3523,7 +3597,7 @@
         </w:rPr>
         <w:t>和</w:t>
       </w:r>
-      <w:hyperlink r:id="rId69">
+      <w:hyperlink r:id="rId71">
         <w:r>
           <w:rPr>
             <w:color w:val="1D4D71"/>
@@ -3689,7 +3763,7 @@
         </w:rPr>
         <w:t>。见</w:t>
       </w:r>
-      <w:hyperlink r:id="rId70">
+      <w:hyperlink r:id="rId72">
         <w:r>
           <w:rPr>
             <w:color w:val="1D4D71"/>
@@ -3705,7 +3779,7 @@
         </w:rPr>
         <w:t>、</w:t>
       </w:r>
-      <w:hyperlink r:id="rId71">
+      <w:hyperlink r:id="rId73">
         <w:r>
           <w:rPr>
             <w:color w:val="1D4D71"/>
@@ -3721,7 +3795,7 @@
         </w:rPr>
         <w:t>、</w:t>
       </w:r>
-      <w:hyperlink r:id="rId72">
+      <w:hyperlink r:id="rId74">
         <w:r>
           <w:rPr>
             <w:color w:val="1D4D71"/>
@@ -3737,7 +3811,7 @@
         </w:rPr>
         <w:t>和</w:t>
       </w:r>
-      <w:hyperlink r:id="rId73">
+      <w:hyperlink r:id="rId75">
         <w:r>
           <w:rPr>
             <w:color w:val="1D4D71"/>
@@ -3903,7 +3977,7 @@
         </w:rPr>
         <w:t>，同时保存 40/40 周期、400 tubes、40 RPC；末时绝对区间、原始记录和接口核对见</w:t>
       </w:r>
-      <w:hyperlink r:id="rId74">
+      <w:hyperlink r:id="rId76">
         <w:r>
           <w:rPr>
             <w:color w:val="1D4D71"/>
@@ -3919,7 +3993,7 @@
         </w:rPr>
         <w:t>与</w:t>
       </w:r>
-      <w:hyperlink r:id="rId75">
+      <w:hyperlink r:id="rId77">
         <w:r>
           <w:rPr>
             <w:color w:val="1D4D71"/>
@@ -4043,7 +4117,7 @@
         </w:rPr>
         <w:t xml:space="preserve"> 周期。两个新 ID 各 20/20 小步接受，保存 tube 均与障碍盒分离，进程 wall 4.142439 / 4.417727 s。见</w:t>
       </w:r>
-      <w:hyperlink r:id="rId76">
+      <w:hyperlink r:id="rId78">
         <w:r>
           <w:rPr>
             <w:color w:val="1D4D71"/>
@@ -4181,7 +4255,7 @@
         </w:rPr>
         <w:t>。见</w:t>
       </w:r>
-      <w:hyperlink r:id="rId77">
+      <w:hyperlink r:id="rId79">
         <w:r>
           <w:rPr>
             <w:color w:val="1D4D71"/>
@@ -4275,7 +4349,7 @@
         </w:rPr>
         <w:t>门检完成 20/20 小步、12,800/12,800 盒步接受、wall 5.243638 s。独立重扫全部记录有限、有序、endpoint 含于 tube、每个初盒含于首步 tube，保存二维 x/y tube 与闭障碍相交 0。见</w:t>
       </w:r>
-      <w:hyperlink r:id="rId78">
+      <w:hyperlink r:id="rId80">
         <w:r>
           <w:rPr>
             <w:color w:val="1D4D71"/>
@@ -4291,7 +4365,7 @@
         </w:rPr>
         <w:t>及</w:t>
       </w:r>
-      <w:hyperlink r:id="rId79">
+      <w:hyperlink r:id="rId81">
         <w:r>
           <w:rPr>
             <w:color w:val="1D4D71"/>
@@ -4471,7 +4545,7 @@
         </w:rPr>
         <w:t>。见</w:t>
       </w:r>
-      <w:hyperlink r:id="rId80">
+      <w:hyperlink r:id="rId82">
         <w:r>
           <w:rPr>
             <w:color w:val="1D4D71"/>
@@ -4637,7 +4711,7 @@
         </w:rPr>
         <w:t>；见</w:t>
       </w:r>
-      <w:hyperlink r:id="rId81">
+      <w:hyperlink r:id="rId83">
         <w:r>
           <w:rPr>
             <w:color w:val="1D4D71"/>
@@ -4713,7 +4787,7 @@
         </w:rPr>
         <w:t xml:space="preserve">已知状态  </w:t>
       </w:r>
-      <w:hyperlink r:id="rId82">
+      <w:hyperlink r:id="rId84">
         <w:r>
           <w:rPr>
             <w:color w:val="1D4D71"/>
@@ -4789,7 +4863,7 @@
         </w:rPr>
         <w:t xml:space="preserve">已知状态  </w:t>
       </w:r>
-      <w:hyperlink r:id="rId83">
+      <w:hyperlink r:id="rId85">
         <w:r>
           <w:rPr>
             <w:color w:val="1D4D71"/>
@@ -4879,7 +4953,7 @@
         </w:rPr>
         <w:t xml:space="preserve">已知状态  </w:t>
       </w:r>
-      <w:hyperlink r:id="rId84">
+      <w:hyperlink r:id="rId86">
         <w:r>
           <w:rPr>
             <w:color w:val="1D4D71"/>
@@ -5017,7 +5091,7 @@
         </w:rPr>
         <w:t xml:space="preserve"> 拒绝，外层 wall 8.218304 s，0 次 8–10 s 性质检查。见</w:t>
       </w:r>
-      <w:hyperlink r:id="rId85">
+      <w:hyperlink r:id="rId87">
         <w:r>
           <w:rPr>
             <w:color w:val="1D4D71"/>
@@ -5127,7 +5201,7 @@
         </w:rPr>
         <w:t>，故引擎接受与严格可审计 tube 包含分开报告；见</w:t>
       </w:r>
-      <w:hyperlink r:id="rId86">
+      <w:hyperlink r:id="rId88">
         <w:r>
           <w:rPr>
             <w:color w:val="1D4D71"/>
@@ -5195,7 +5269,7 @@
         </w:rPr>
         <w:t>同一具名 raw4 合同及完整单初盒，P3 工作三阶/验证四阶，首个 0.02 s 周期 4/4 个小步接受。原始进程 wall 5.230873 s，四条保存 tube/endpoint 独立读回均有限、有序且逐步包含。见</w:t>
       </w:r>
-      <w:hyperlink r:id="rId87">
+      <w:hyperlink r:id="rId89">
         <w:r>
           <w:rPr>
             <w:color w:val="1D4D71"/>
@@ -5305,7 +5379,7 @@
         </w:rPr>
         <w:t>、wall 13.806936 s，性质窗 0/400 检查。见</w:t>
       </w:r>
-      <w:hyperlink r:id="rId88">
+      <w:hyperlink r:id="rId90">
         <w:r>
           <w:rPr>
             <w:color w:val="1D4D71"/>
@@ -5401,7 +5475,7 @@
         </w:rPr>
         <w:t>，outer exit 2、wall 5.731613 s、8–10 秒性质窗 0/400 检查。83 条五坐标范围独立扫描有限、有序，endpoint 在同段 tube 内。见</w:t>
       </w:r>
-      <w:hyperlink r:id="rId89">
+      <w:hyperlink r:id="rId91">
         <w:r>
           <w:rPr>
             <w:color w:val="1D4D71"/>
@@ -5497,7 +5571,7 @@
         </w:rPr>
         <w:t xml:space="preserve"> 不同。见</w:t>
       </w:r>
-      <w:hyperlink r:id="rId90">
+      <w:hyperlink r:id="rId92">
         <w:r>
           <w:rPr>
             <w:color w:val="1D4D71"/>
@@ -5587,7 +5661,7 @@
         </w:rPr>
         <w:t xml:space="preserve"> 不同；新独立入口先有一次误选 Python 环境、0 小步的</w:t>
       </w:r>
-      <w:hyperlink r:id="rId91">
+      <w:hyperlink r:id="rId93">
         <w:r>
           <w:rPr>
             <w:color w:val="1D4D71"/>
@@ -5645,7 +5719,7 @@
         </w:rPr>
         <w:t>，在目标盒内。见</w:t>
       </w:r>
-      <w:hyperlink r:id="rId92">
+      <w:hyperlink r:id="rId94">
         <w:r>
           <w:rPr>
             <w:color w:val="1D4D71"/>
@@ -5768,146 +5842,6 @@
           <w:b w:val="0"/>
         </w:rPr>
         <w:t xml:space="preserve"> 与 Huan 行相同并落目标。两方原始范围直接逐字节相同，见</w:t>
-      </w:r>
-      <w:hyperlink r:id="rId93">
-        <w:r>
-          <w:rPr>
-            <w:color w:val="1D4D71"/>
-            <w:u w:val="single"/>
-            <w:rFonts w:eastAsia="Hiragino Sans GB" w:ascii="Hiragino Sans GB"/>
-          </w:rPr>
-          <w:t>一期门检</w:t>
-        </w:r>
-      </w:hyperlink>
-      <w:r>
-        <w:rPr>
-          <w:b w:val="0"/>
-        </w:rPr>
-        <w:t>与</w:t>
-      </w:r>
-      <w:hyperlink r:id="rId94">
-        <w:r>
-          <w:rPr>
-            <w:color w:val="1D4D71"/>
-            <w:u w:val="single"/>
-            <w:rFonts w:eastAsia="Hiragino Sans GB" w:ascii="Hiragino Sans GB"/>
-          </w:rPr>
-          <w:t>全程记录</w:t>
-        </w:r>
-      </w:hyperlink>
-      <w:r>
-        <w:rPr>
-          <w:b w:val="0"/>
-        </w:rPr>
-        <w:t>。</w:t>
-      </w:r>
-    </w:p>
-    <w:p>
-      <w:pPr>
-        <w:pStyle w:val="EvidenceBody"/>
-      </w:pPr>
-      <w:r>
-        <w:rPr>
-          <w:b/>
-        </w:rPr>
-        <w:t xml:space="preserve">结果资格  </w:t>
-      </w:r>
-      <w:r>
-        <w:rPr>
-          <w:b/>
-        </w:rPr>
-        <w:t>用户选定主合同下的完整数值时域</w:t>
-      </w:r>
-      <w:r>
-        <w:rPr>
-          <w:b w:val="0"/>
-        </w:rPr>
-        <w:t>；性质 checker 未运行。与 Huan 共用作者驱动的数值一致性不提供独立正确性证明，单次 wall 也无排名资格。</w:t>
-      </w:r>
-    </w:p>
-    <w:p>
-      <w:pPr>
-        <w:pStyle w:val="EvidenceName"/>
-        <w:keepNext/>
-      </w:pPr>
-      <w:r>
-        <w:rPr>
-          <w:b w:val="0"/>
-        </w:rPr>
-        <w:t xml:space="preserve">TORA reach-sigmoid 官方模型 </w:t>
-      </w:r>
-      <w:r>
-        <w:rPr>
-          <w:rFonts w:ascii="Menlo" w:hAnsi="Menlo"/>
-          <w:b w:val="0"/>
-          <w:sz w:val="16"/>
-        </w:rPr>
-        <w:t>u=11f</w:t>
-      </w:r>
-      <w:r>
-        <w:rPr>
-          <w:b w:val="0"/>
-        </w:rPr>
-        <w:t xml:space="preserve"> / P3</w:t>
-      </w:r>
-    </w:p>
-    <w:p>
-      <w:pPr>
-        <w:pStyle w:val="EvidenceBody"/>
-      </w:pPr>
-      <w:r>
-        <w:rPr>
-          <w:b/>
-        </w:rPr>
-        <w:t xml:space="preserve">已知状态  </w:t>
-      </w:r>
-      <w:r>
-        <w:rPr>
-          <w:b w:val="0"/>
-        </w:rPr>
-        <w:t>完整初盒一期 50/50 通过后，独立新 run 完成 10 期、500/500 小步；外层 wall 13.741791 s。独立扫描 500 条保存 tube/endpoint 均有限、有序且逐段包含；</w:t>
-      </w:r>
-      <w:r>
-        <w:rPr>
-          <w:rFonts w:ascii="Menlo" w:hAnsi="Menlo"/>
-          <w:b w:val="0"/>
-          <w:sz w:val="16"/>
-        </w:rPr>
-        <w:t>T=5</w:t>
-      </w:r>
-      <w:r>
-        <w:rPr>
-          <w:b w:val="0"/>
-        </w:rPr>
-        <w:t xml:space="preserve"> 的 </w:t>
-      </w:r>
-      <w:r>
-        <w:rPr>
-          <w:rFonts w:ascii="Menlo" w:hAnsi="Menlo"/>
-          <w:b w:val="0"/>
-          <w:sz w:val="16"/>
-        </w:rPr>
-        <w:t>x1=[0.1345258159,0.1606047516]</w:t>
-      </w:r>
-      <w:r>
-        <w:rPr>
-          <w:b w:val="0"/>
-        </w:rPr>
-        <w:t>、</w:t>
-      </w:r>
-      <w:r>
-        <w:rPr>
-          <w:rFonts w:ascii="Menlo" w:hAnsi="Menlo"/>
-          <w:b w:val="0"/>
-          <w:sz w:val="16"/>
-        </w:rPr>
-        <w:t>x2=[-0.8764374243,-0.8505126711]</w:t>
-      </w:r>
-      <w:r>
-        <w:rPr>
-          <w:b w:val="0"/>
-        </w:rPr>
-        <w:t xml:space="preserve"> 落入目标。见</w:t>
       </w:r>
       <w:hyperlink r:id="rId95">
         <w:r>
@@ -5932,7 +5866,7 @@
             <w:u w:val="single"/>
             <w:rFonts w:eastAsia="Hiragino Sans GB" w:ascii="Hiragino Sans GB"/>
           </w:rPr>
-          <w:t>全程原始记录</w:t>
+          <w:t>全程记录</w:t>
         </w:r>
       </w:hyperlink>
       <w:r>
@@ -5956,13 +5890,13 @@
         <w:rPr>
           <w:b/>
         </w:rPr>
-        <w:t>用户选定主合同下的完整数值时域及保存终点充分条件观察</w:t>
-      </w:r>
-      <w:r>
-        <w:rPr>
-          <w:b w:val="0"/>
-        </w:rPr>
-        <w:t>；性质 checker 未执行，也无独立端到端浮点 NNCS 证书。P3 数值阶数与作者入口不同，单次 wall 不用于排名。</w:t>
+        <w:t>用户选定主合同下的完整数值时域</w:t>
+      </w:r>
+      <w:r>
+        <w:rPr>
+          <w:b w:val="0"/>
+        </w:rPr>
+        <w:t>；性质 checker 未运行。与 Huan 共用作者驱动的数值一致性不提供独立正确性证明，单次 wall 也无排名资格。</w:t>
       </w:r>
     </w:p>
     <w:p>
@@ -5988,7 +5922,7 @@
         <w:rPr>
           <w:b w:val="0"/>
         </w:rPr>
-        <w:t xml:space="preserve"> / Flow* native</w:t>
+        <w:t xml:space="preserve"> / P3</w:t>
       </w:r>
     </w:p>
     <w:p>
@@ -6005,7 +5939,7 @@
         <w:rPr>
           <w:b w:val="0"/>
         </w:rPr>
-        <w:t xml:space="preserve">独立源码把官方四层 sigmoid </w:t>
+        <w:t>完整初盒一期 50/50 通过后，独立新 run 完成 10 期、500/500 小步；外层 wall 13.741791 s。独立扫描 500 条保存 tube/endpoint 均有限、有序且逐段包含；</w:t>
       </w:r>
       <w:r>
         <w:rPr>
@@ -6013,13 +5947,13 @@
           <w:b w:val="0"/>
           <w:sz w:val="16"/>
         </w:rPr>
-        <w:t>.mat</w:t>
-      </w:r>
-      <w:r>
-        <w:rPr>
-          <w:b w:val="0"/>
-        </w:rPr>
-        <w:t xml:space="preserve"> 导出的图内 </w:t>
+        <w:t>T=5</w:t>
+      </w:r>
+      <w:r>
+        <w:rPr>
+          <w:b w:val="0"/>
+        </w:rPr>
+        <w:t xml:space="preserve"> 的 </w:t>
       </w:r>
       <w:r>
         <w:rPr>
@@ -6027,13 +5961,13 @@
           <w:b w:val="0"/>
           <w:sz w:val="16"/>
         </w:rPr>
-        <w:t>11f</w:t>
-      </w:r>
-      <w:r>
-        <w:rPr>
-          <w:b w:val="0"/>
-        </w:rPr>
-        <w:t xml:space="preserve"> 控制器经 RPC 外部 </w:t>
+        <w:t>x1=[0.1345258159,0.1606047516]</w:t>
+      </w:r>
+      <w:r>
+        <w:rPr>
+          <w:b w:val="0"/>
+        </w:rPr>
+        <w:t>、</w:t>
       </w:r>
       <w:r>
         <w:rPr>
@@ -6041,63 +5975,7 @@
           <w:b w:val="0"/>
           <w:sz w:val="16"/>
         </w:rPr>
-        <w:t>1/0</w:t>
-      </w:r>
-      <w:r>
-        <w:rPr>
-          <w:b w:val="0"/>
-        </w:rPr>
-        <w:t xml:space="preserve"> 注入原生模型，先通过 CPU 预检和一期 50/50 门检。全程新 run 完成 10 期、500/500 小段、10 次 RPC；外层 wall 8.991666 s，作者终点 checker 打印 </w:t>
-      </w:r>
-      <w:r>
-        <w:rPr>
-          <w:rFonts w:ascii="Menlo" w:hAnsi="Menlo"/>
-          <w:b w:val="0"/>
-          <w:sz w:val="16"/>
-        </w:rPr>
-        <w:t>VERIFIED</w:t>
-      </w:r>
-      <w:r>
-        <w:rPr>
-          <w:b w:val="0"/>
-        </w:rPr>
-        <w:t>。独立扫描 500 条四态范围有限有序、endpoint 均在同段 tube；</w:t>
-      </w:r>
-      <w:r>
-        <w:rPr>
-          <w:rFonts w:ascii="Menlo" w:hAnsi="Menlo"/>
-          <w:b w:val="0"/>
-          <w:sz w:val="16"/>
-        </w:rPr>
-        <w:t>T=5</w:t>
-      </w:r>
-      <w:r>
-        <w:rPr>
-          <w:b w:val="0"/>
-        </w:rPr>
-        <w:t xml:space="preserve"> 的 </w:t>
-      </w:r>
-      <w:r>
-        <w:rPr>
-          <w:rFonts w:ascii="Menlo" w:hAnsi="Menlo"/>
-          <w:b w:val="0"/>
-          <w:sz w:val="16"/>
-        </w:rPr>
-        <w:t>x1=[0.1345319317,0.1605988723]</w:t>
-      </w:r>
-      <w:r>
-        <w:rPr>
-          <w:b w:val="0"/>
-        </w:rPr>
-        <w:t>、</w:t>
-      </w:r>
-      <w:r>
-        <w:rPr>
-          <w:rFonts w:ascii="Menlo" w:hAnsi="Menlo"/>
-          <w:b w:val="0"/>
-          <w:sz w:val="16"/>
-        </w:rPr>
-        <w:t>x2=[-0.8763648123,-0.8505857061]</w:t>
+        <w:t>x2=[-0.8764374243,-0.8505126711]</w:t>
       </w:r>
       <w:r>
         <w:rPr>
@@ -6128,7 +6006,7 @@
             <w:u w:val="single"/>
             <w:rFonts w:eastAsia="Hiragino Sans GB" w:ascii="Hiragino Sans GB"/>
           </w:rPr>
-          <w:t>全程原始证据</w:t>
+          <w:t>全程原始记录</w:t>
         </w:r>
       </w:hyperlink>
       <w:r>
@@ -6152,13 +6030,13 @@
         <w:rPr>
           <w:b/>
         </w:rPr>
-        <w:t>用户选定主合同下的完整数值时域、保存终点充分条件及作者 checker 标签</w:t>
-      </w:r>
-      <w:r>
-        <w:rPr>
-          <w:b w:val="0"/>
-        </w:rPr>
-        <w:t>；仍无独立端到端浮点 NNCS 证书。单次 wall 不用于排名。</w:t>
+        <w:t>用户选定主合同下的完整数值时域及保存终点充分条件观察</w:t>
+      </w:r>
+      <w:r>
+        <w:rPr>
+          <w:b w:val="0"/>
+        </w:rPr>
+        <w:t>；性质 checker 未执行，也无独立端到端浮点 NNCS 证书。P3 数值阶数与作者入口不同，单次 wall 不用于排名。</w:t>
       </w:r>
     </w:p>
     <w:p>
@@ -6170,7 +6048,7 @@
         <w:rPr>
           <w:b w:val="0"/>
         </w:rPr>
-        <w:t xml:space="preserve">TORA reach-tanh 官方模型 </w:t>
+        <w:t xml:space="preserve">TORA reach-sigmoid 官方模型 </w:t>
       </w:r>
       <w:r>
         <w:rPr>
@@ -6184,7 +6062,7 @@
         <w:rPr>
           <w:b w:val="0"/>
         </w:rPr>
-        <w:t xml:space="preserve"> / 当前 working P3</w:t>
+        <w:t xml:space="preserve"> / Flow* native</w:t>
       </w:r>
     </w:p>
     <w:p>
@@ -6201,6 +6079,202 @@
         <w:rPr>
           <w:b w:val="0"/>
         </w:rPr>
+        <w:t xml:space="preserve">独立源码把官方四层 sigmoid </w:t>
+      </w:r>
+      <w:r>
+        <w:rPr>
+          <w:rFonts w:ascii="Menlo" w:hAnsi="Menlo"/>
+          <w:b w:val="0"/>
+          <w:sz w:val="16"/>
+        </w:rPr>
+        <w:t>.mat</w:t>
+      </w:r>
+      <w:r>
+        <w:rPr>
+          <w:b w:val="0"/>
+        </w:rPr>
+        <w:t xml:space="preserve"> 导出的图内 </w:t>
+      </w:r>
+      <w:r>
+        <w:rPr>
+          <w:rFonts w:ascii="Menlo" w:hAnsi="Menlo"/>
+          <w:b w:val="0"/>
+          <w:sz w:val="16"/>
+        </w:rPr>
+        <w:t>11f</w:t>
+      </w:r>
+      <w:r>
+        <w:rPr>
+          <w:b w:val="0"/>
+        </w:rPr>
+        <w:t xml:space="preserve"> 控制器经 RPC 外部 </w:t>
+      </w:r>
+      <w:r>
+        <w:rPr>
+          <w:rFonts w:ascii="Menlo" w:hAnsi="Menlo"/>
+          <w:b w:val="0"/>
+          <w:sz w:val="16"/>
+        </w:rPr>
+        <w:t>1/0</w:t>
+      </w:r>
+      <w:r>
+        <w:rPr>
+          <w:b w:val="0"/>
+        </w:rPr>
+        <w:t xml:space="preserve"> 注入原生模型，先通过 CPU 预检和一期 50/50 门检。全程新 run 完成 10 期、500/500 小段、10 次 RPC；外层 wall 8.991666 s，作者终点 checker 打印 </w:t>
+      </w:r>
+      <w:r>
+        <w:rPr>
+          <w:rFonts w:ascii="Menlo" w:hAnsi="Menlo"/>
+          <w:b w:val="0"/>
+          <w:sz w:val="16"/>
+        </w:rPr>
+        <w:t>VERIFIED</w:t>
+      </w:r>
+      <w:r>
+        <w:rPr>
+          <w:b w:val="0"/>
+        </w:rPr>
+        <w:t>。独立扫描 500 条四态范围有限有序、endpoint 均在同段 tube；</w:t>
+      </w:r>
+      <w:r>
+        <w:rPr>
+          <w:rFonts w:ascii="Menlo" w:hAnsi="Menlo"/>
+          <w:b w:val="0"/>
+          <w:sz w:val="16"/>
+        </w:rPr>
+        <w:t>T=5</w:t>
+      </w:r>
+      <w:r>
+        <w:rPr>
+          <w:b w:val="0"/>
+        </w:rPr>
+        <w:t xml:space="preserve"> 的 </w:t>
+      </w:r>
+      <w:r>
+        <w:rPr>
+          <w:rFonts w:ascii="Menlo" w:hAnsi="Menlo"/>
+          <w:b w:val="0"/>
+          <w:sz w:val="16"/>
+        </w:rPr>
+        <w:t>x1=[0.1345319317,0.1605988723]</w:t>
+      </w:r>
+      <w:r>
+        <w:rPr>
+          <w:b w:val="0"/>
+        </w:rPr>
+        <w:t>、</w:t>
+      </w:r>
+      <w:r>
+        <w:rPr>
+          <w:rFonts w:ascii="Menlo" w:hAnsi="Menlo"/>
+          <w:b w:val="0"/>
+          <w:sz w:val="16"/>
+        </w:rPr>
+        <w:t>x2=[-0.8763648123,-0.8505857061]</w:t>
+      </w:r>
+      <w:r>
+        <w:rPr>
+          <w:b w:val="0"/>
+        </w:rPr>
+        <w:t xml:space="preserve"> 落入目标。见</w:t>
+      </w:r>
+      <w:hyperlink r:id="rId99">
+        <w:r>
+          <w:rPr>
+            <w:color w:val="1D4D71"/>
+            <w:u w:val="single"/>
+            <w:rFonts w:eastAsia="Hiragino Sans GB" w:ascii="Hiragino Sans GB"/>
+          </w:rPr>
+          <w:t>一期门检</w:t>
+        </w:r>
+      </w:hyperlink>
+      <w:r>
+        <w:rPr>
+          <w:b w:val="0"/>
+        </w:rPr>
+        <w:t>与</w:t>
+      </w:r>
+      <w:hyperlink r:id="rId100">
+        <w:r>
+          <w:rPr>
+            <w:color w:val="1D4D71"/>
+            <w:u w:val="single"/>
+            <w:rFonts w:eastAsia="Hiragino Sans GB" w:ascii="Hiragino Sans GB"/>
+          </w:rPr>
+          <w:t>全程原始证据</w:t>
+        </w:r>
+      </w:hyperlink>
+      <w:r>
+        <w:rPr>
+          <w:b w:val="0"/>
+        </w:rPr>
+        <w:t>。</w:t>
+      </w:r>
+    </w:p>
+    <w:p>
+      <w:pPr>
+        <w:pStyle w:val="EvidenceBody"/>
+      </w:pPr>
+      <w:r>
+        <w:rPr>
+          <w:b/>
+        </w:rPr>
+        <w:t xml:space="preserve">结果资格  </w:t>
+      </w:r>
+      <w:r>
+        <w:rPr>
+          <w:b/>
+        </w:rPr>
+        <w:t>用户选定主合同下的完整数值时域、保存终点充分条件及作者 checker 标签</w:t>
+      </w:r>
+      <w:r>
+        <w:rPr>
+          <w:b w:val="0"/>
+        </w:rPr>
+        <w:t>；仍无独立端到端浮点 NNCS 证书。单次 wall 不用于排名。</w:t>
+      </w:r>
+    </w:p>
+    <w:p>
+      <w:pPr>
+        <w:pStyle w:val="EvidenceName"/>
+        <w:keepNext/>
+      </w:pPr>
+      <w:r>
+        <w:rPr>
+          <w:b w:val="0"/>
+        </w:rPr>
+        <w:t xml:space="preserve">TORA reach-tanh 官方模型 </w:t>
+      </w:r>
+      <w:r>
+        <w:rPr>
+          <w:rFonts w:ascii="Menlo" w:hAnsi="Menlo"/>
+          <w:b w:val="0"/>
+          <w:sz w:val="16"/>
+        </w:rPr>
+        <w:t>u=11f</w:t>
+      </w:r>
+      <w:r>
+        <w:rPr>
+          <w:b w:val="0"/>
+        </w:rPr>
+        <w:t xml:space="preserve"> / 当前 working P3</w:t>
+      </w:r>
+    </w:p>
+    <w:p>
+      <w:pPr>
+        <w:pStyle w:val="EvidenceBody"/>
+      </w:pPr>
+      <w:r>
+        <w:rPr>
+          <w:b/>
+        </w:rPr>
+        <w:t xml:space="preserve">已知状态  </w:t>
+      </w:r>
+      <w:r>
+        <w:rPr>
+          <w:b w:val="0"/>
+        </w:rPr>
         <w:t xml:space="preserve">固定官方 ReLU³/tanh 和完整初盒下，新 0.5 s 门检 50/50 接受；另立 10 期/500 步新作业全部接受，独立扫描 </w:t>
       </w:r>
       <w:r>
@@ -6245,7 +6319,7 @@
         </w:rPr>
         <w:t>，均在目标内。外层 wall 13.456629 s；见</w:t>
       </w:r>
-      <w:hyperlink r:id="rId99">
+      <w:hyperlink r:id="rId101">
         <w:r>
           <w:rPr>
             <w:color w:val="1D4D71"/>
@@ -6261,7 +6335,7 @@
         </w:rPr>
         <w:t>及</w:t>
       </w:r>
-      <w:hyperlink r:id="rId100">
+      <w:hyperlink r:id="rId102">
         <w:r>
           <w:rPr>
             <w:color w:val="1D4D71"/>
@@ -6385,7 +6459,7 @@
         </w:rPr>
         <w:t>新 Huan 一期 50/50 小步接受，与保存的旧 Huan 全程前 50 步四态 tube/endpoint 共 800 个边界值逐值相同。旧 Huan、Xiangru、原生各有同合同 500 步全程原始记录；旧 P3 全程另存代际对照，见</w:t>
       </w:r>
-      <w:hyperlink r:id="rId101">
+      <w:hyperlink r:id="rId103">
         <w:r>
           <w:rPr>
             <w:color w:val="1D4D71"/>
@@ -6467,7 +6541,7 @@
         </w:rPr>
         <w:t>Huan parity 5 次完整运行、旧 P3 完整一次、native 6 小时超时仅到 600 步；另有 40 步 parity/strict 新诊断，但使用旧模型。见</w:t>
       </w:r>
-      <w:hyperlink r:id="rId102">
+      <w:hyperlink r:id="rId104">
         <w:r>
           <w:rPr>
             <w:color w:val="1D4D71"/>
@@ -6566,7 +6640,7 @@
         </w:rPr>
         <w:t>QUAD 已存逐步包络的</w:t>
       </w:r>
-      <w:hyperlink r:id="rId103">
+      <w:hyperlink r:id="rId105">
         <w:r>
           <w:rPr>
             <w:color w:val="1D4D71"/>
@@ -6674,7 +6748,7 @@
         </w:rPr>
         <w:t xml:space="preserve"> 的终点绝对上下界与宽度见</w:t>
       </w:r>
-      <w:hyperlink r:id="rId104">
+      <w:hyperlink r:id="rId106">
         <w:r>
           <w:rPr>
             <w:color w:val="1D4D71"/>
@@ -6752,7 +6826,7 @@
         </w:rPr>
         <w:t>如下；</w:t>
       </w:r>
-      <w:hyperlink r:id="rId105">
+      <w:hyperlink r:id="rId107">
         <w:r>
           <w:rPr>
             <w:color w:val="1D4D71"/>
@@ -7331,7 +7405,7 @@
         </w:rPr>
         <w:t>具名</w:t>
       </w:r>
-      <w:hyperlink r:id="rId106">
+      <w:hyperlink r:id="rId108">
         <w:r>
           <w:rPr>
             <w:color w:val="1D4D71"/>
@@ -7694,7 +7768,7 @@
         </w:rPr>
         <w:t>修正危险盒后的</w:t>
       </w:r>
-      <w:hyperlink r:id="rId107">
+      <w:hyperlink r:id="rId109">
         <w:r>
           <w:rPr>
             <w:color w:val="1D4D71"/>
@@ -8108,7 +8182,7 @@
                     <pic:cNvPicPr/>
                   </pic:nvPicPr>
                   <pic:blipFill>
-                    <a:blip r:embed="rId108"/>
+                    <a:blip r:embed="rId110"/>
                     <a:stretch>
                       <a:fillRect/>
                     </a:stretch>
@@ -8161,7 +8235,7 @@
                     <pic:cNvPicPr/>
                   </pic:nvPicPr>
                   <pic:blipFill>
-                    <a:blip r:embed="rId109"/>
+                    <a:blip r:embed="rId111"/>
                     <a:stretch>
                       <a:fillRect/>
                     </a:stretch>
@@ -8227,7 +8301,7 @@
         </w:rPr>
         <w:t xml:space="preserve"> 当前 P3 比新原生 x/y 窄 0.001313132 / 0.000142738，旧 Huan/Xiangru 窄 0.006344828 / 0.001473943。robust 旧 Huan/Xiangru 对旧原生 x/y 窄 0.000661962 / 0.000232496。见</w:t>
       </w:r>
-      <w:hyperlink r:id="rId110">
+      <w:hyperlink r:id="rId112">
         <w:r>
           <w:rPr>
             <w:color w:val="1D4D71"/>
@@ -8291,7 +8365,7 @@
         </w:rPr>
         <w:t xml:space="preserve"> 联合绝对区间与宽度如下；每一步 tube/endpoint 汇总在</w:t>
       </w:r>
-      <w:hyperlink r:id="rId111">
+      <w:hyperlink r:id="rId113">
         <w:r>
           <w:rPr>
             <w:color w:val="1D4D71"/>
@@ -8307,7 +8381,7 @@
         </w:rPr>
         <w:t>、</w:t>
       </w:r>
-      <w:hyperlink r:id="rId112">
+      <w:hyperlink r:id="rId114">
         <w:r>
           <w:rPr>
             <w:color w:val="1D4D71"/>
@@ -8323,7 +8397,7 @@
         </w:rPr>
         <w:t>、</w:t>
       </w:r>
-      <w:hyperlink r:id="rId113">
+      <w:hyperlink r:id="rId115">
         <w:r>
           <w:rPr>
             <w:color w:val="1D4D71"/>
@@ -8339,7 +8413,7 @@
         </w:rPr>
         <w:t>和</w:t>
       </w:r>
-      <w:hyperlink r:id="rId114">
+      <w:hyperlink r:id="rId116">
         <w:r>
           <w:rPr>
             <w:color w:val="1D4D71"/>
@@ -9526,7 +9600,7 @@
                     <pic:cNvPicPr/>
                   </pic:nvPicPr>
                   <pic:blipFill>
-                    <a:blip r:embed="rId115"/>
+                    <a:blip r:embed="rId117"/>
                     <a:stretch>
                       <a:fillRect/>
                     </a:stretch>
@@ -9564,7 +9638,7 @@
         </w:rPr>
         <w:t>这张</w:t>
       </w:r>
-      <w:hyperlink r:id="rId116">
+      <w:hyperlink r:id="rId118">
         <w:r>
           <w:rPr>
             <w:color w:val="1D4D71"/>
@@ -9660,7 +9734,7 @@
         </w:rPr>
         <w:t>、观察函数和原始来源均在</w:t>
       </w:r>
-      <w:hyperlink r:id="rId117">
+      <w:hyperlink r:id="rId119">
         <w:r>
           <w:rPr>
             <w:color w:val="1D4D71"/>
@@ -9676,7 +9750,7 @@
         </w:rPr>
         <w:t>与</w:t>
       </w:r>
-      <w:hyperlink r:id="rId69">
+      <w:hyperlink r:id="rId71">
         <w:r>
           <w:rPr>
             <w:color w:val="1D4D71"/>
@@ -10457,7 +10531,7 @@
       </w:r>
     </w:p>
     <w:p>
-      <w:hyperlink r:id="rId68">
+      <w:hyperlink r:id="rId70">
         <w:r>
           <w:rPr>
             <w:color w:val="1D4D71"/>
@@ -11058,7 +11132,7 @@
         </w:rPr>
         <w:t xml:space="preserve"> 见</w:t>
       </w:r>
-      <w:hyperlink r:id="rId118">
+      <w:hyperlink r:id="rId120">
         <w:r>
           <w:rPr>
             <w:color w:val="1D4D71"/>
@@ -11074,7 +11148,7 @@
         </w:rPr>
         <w:t>。原生一列还给出 1,024 个终点盒的宽度均值与最大值；其余三方原始 metrics 只提供并集边界，该两栏保持空白，不从并集宽度臆造逐盒统计。旧</w:t>
       </w:r>
-      <w:hyperlink r:id="rId119">
+      <w:hyperlink r:id="rId121">
         <w:r>
           <w:rPr>
             <w:color w:val="1D4D71"/>
@@ -11592,7 +11666,7 @@
         </w:rPr>
         <w:t>，来源和差异见</w:t>
       </w:r>
-      <w:hyperlink r:id="rId120">
+      <w:hyperlink r:id="rId122">
         <w:r>
           <w:rPr>
             <w:color w:val="1D4D71"/>
@@ -11638,7 +11712,7 @@
         </w:rPr>
         <w:t xml:space="preserve"> 均在</w:t>
       </w:r>
-      <w:hyperlink r:id="rId121">
+      <w:hyperlink r:id="rId123">
         <w:r>
           <w:rPr>
             <w:color w:val="1D4D71"/>
@@ -11654,7 +11728,7 @@
         </w:rPr>
         <w:t>；原始盒、正确危险集判交及观察器差异见</w:t>
       </w:r>
-      <w:hyperlink r:id="rId122">
+      <w:hyperlink r:id="rId124">
         <w:r>
           <w:rPr>
             <w:color w:val="1D4D71"/>
@@ -12525,7 +12599,7 @@
         </w:rPr>
         <w:t>、每盒 endpoint mean/max、未完成值的空值见</w:t>
       </w:r>
-      <w:hyperlink r:id="rId123">
+      <w:hyperlink r:id="rId125">
         <w:r>
           <w:rPr>
             <w:color w:val="1D4D71"/>
@@ -12541,7 +12615,7 @@
         </w:rPr>
         <w:t>与</w:t>
       </w:r>
-      <w:hyperlink r:id="rId124">
+      <w:hyperlink r:id="rId126">
         <w:r>
           <w:rPr>
             <w:color w:val="1D4D71"/>
@@ -13212,7 +13286,7 @@
                     <pic:cNvPicPr/>
                   </pic:nvPicPr>
                   <pic:blipFill>
-                    <a:blip r:embed="rId125"/>
+                    <a:blip r:embed="rId127"/>
                     <a:stretch>
                       <a:fillRect/>
                     </a:stretch>
@@ -13250,7 +13324,7 @@
         </w:rPr>
         <w:t>这张</w:t>
       </w:r>
-      <w:hyperlink r:id="rId126">
+      <w:hyperlink r:id="rId128">
         <w:r>
           <w:rPr>
             <w:color w:val="1D4D71"/>
@@ -15322,7 +15396,7 @@
         </w:rPr>
         <w:t xml:space="preserve"> 具名 participant-order profile 使用固定 2026 ONNX、单个完整初盒、50 个 0.1 秒控制期到 T=5。参与者源码的相对速度取 v_lead−v_ego；全时检查 x_lead−x_ego−1.4v_ego−10≥0。</w:t>
       </w:r>
-      <w:hyperlink r:id="rId66">
+      <w:hyperlink r:id="rId68">
         <w:r>
           <w:rPr>
             <w:color w:val="1D4D71"/>
@@ -15355,7 +15429,7 @@
         </w:rPr>
         <w:t xml:space="preserve"> 我方 P3、Huan、Xiangru、原生均有新完整数值时域；四方保存 tube 的安全裕量下界均为正。</w:t>
       </w:r>
-      <w:hyperlink r:id="rId67">
+      <w:hyperlink r:id="rId69">
         <w:r>
           <w:rPr>
             <w:color w:val="1D4D71"/>
@@ -15388,7 +15462,7 @@
         </w:rPr>
         <w:t xml:space="preserve"> </w:t>
       </w:r>
-      <w:hyperlink r:id="rId68">
+      <w:hyperlink r:id="rId70">
         <w:r>
           <w:rPr>
             <w:color w:val="1D4D71"/>
@@ -15404,7 +15478,7 @@
         </w:rPr>
         <w:t>含首轮与各五次后续完成样本；</w:t>
       </w:r>
-      <w:hyperlink r:id="rId117">
+      <w:hyperlink r:id="rId119">
         <w:r>
           <w:rPr>
             <w:color w:val="1D4D71"/>
@@ -15420,7 +15494,7 @@
         </w:rPr>
         <w:t>和上方宽度表给出 endpoint 与全时 tube；</w:t>
       </w:r>
-      <w:hyperlink r:id="rId127">
+      <w:hyperlink r:id="rId129">
         <w:r>
           <w:rPr>
             <w:color w:val="1D4D71"/>
@@ -15459,7 +15533,7 @@
                     <pic:cNvPicPr/>
                   </pic:nvPicPr>
                   <pic:blipFill>
-                    <a:blip r:embed="rId128"/>
+                    <a:blip r:embed="rId130"/>
                     <a:stretch>
                       <a:fillRect/>
                     </a:stretch>
@@ -15531,7 +15605,7 @@
         </w:rPr>
         <w:t xml:space="preserve"> 官方完整初集是一个未分割 12 物理态盒，六个速度/姿态分量各为 [0,1]，固定 12→6 控制器；连续方程与 0.1 秒采样到 T=2，全时要求 sy、phi、theta、psi∈[-1,1]。</w:t>
       </w:r>
-      <w:hyperlink r:id="rId43">
+      <w:hyperlink r:id="rId45">
         <w:r>
           <w:rPr>
             <w:color w:val="1D4D71"/>
@@ -15564,7 +15638,7 @@
         </w:rPr>
         <w:t xml:space="preserve"> P3、Huan、Xiangru、原生均无完整数值时域。P3 全盒入口建表溢出或首步拒绝，定向余项诊断在观察器检查前没有可用保存段；Huan 高阶入口遇资源阻断，两作者低阶全盒首步拒绝；原生三种隔离数值 profile 首步均为 UNCOMPLETED_SAFE。</w:t>
       </w:r>
-      <w:hyperlink r:id="rId44">
+      <w:hyperlink r:id="rId46">
         <w:r>
           <w:rPr>
             <w:color w:val="1D4D71"/>
@@ -15580,7 +15654,7 @@
         </w:rPr>
         <w:t>、</w:t>
       </w:r>
-      <w:hyperlink r:id="rId42">
+      <w:hyperlink r:id="rId44">
         <w:r>
           <w:rPr>
             <w:color w:val="1D4D71"/>
@@ -15596,7 +15670,7 @@
         </w:rPr>
         <w:t>、</w:t>
       </w:r>
-      <w:hyperlink r:id="rId48">
+      <w:hyperlink r:id="rId50">
         <w:r>
           <w:rPr>
             <w:color w:val="1D4D71"/>
@@ -15629,7 +15703,7 @@
         </w:rPr>
         <w:t xml:space="preserve"> 现有 wall 只属于入口失败或短诊断；没有完整 T=2 宽度或全程图。上述摘要链接命令、配置和日志；</w:t>
       </w:r>
-      <w:hyperlink r:id="rId45">
+      <w:hyperlink r:id="rId47">
         <w:r>
           <w:rPr>
             <w:color w:val="1D4D71"/>
@@ -15645,7 +15719,7 @@
         </w:rPr>
         <w:t>只定位独立诊断路径。</w:t>
       </w:r>
-      <w:hyperlink r:id="rId49">
+      <w:hyperlink r:id="rId51">
         <w:r>
           <w:rPr>
             <w:color w:val="1D4D71"/>
@@ -15689,7 +15763,7 @@
         </w:rPr>
         <w:t xml:space="preserve"> 五个 Picard 提议不含于原余项初猜，仍是 0 段接受。</w:t>
       </w:r>
-      <w:hyperlink r:id="rId50">
+      <w:hyperlink r:id="rId52">
         <w:r>
           <w:rPr>
             <w:color w:val="1D4D71"/>
@@ -15736,7 +15810,7 @@
         </w:rPr>
         <w:t xml:space="preserve"> 六个不确定初态各二分的 64 盒规划只实际运行两角盒。</w:t>
       </w:r>
-      <w:hyperlink r:id="rId51">
+      <w:hyperlink r:id="rId53">
         <w:r>
           <w:rPr>
             <w:color w:val="1D4D71"/>
@@ -15752,7 +15826,7 @@
         </w:rPr>
         <w:t>数值接受首个 0.01 秒且保存 tube 在安全盒内；</w:t>
       </w:r>
-      <w:hyperlink r:id="rId52">
+      <w:hyperlink r:id="rId54">
         <w:r>
           <w:rPr>
             <w:color w:val="1D4D71"/>
@@ -15768,7 +15842,7 @@
         </w:rPr>
         <w:t>也数值接受，但保存角度 tube 越过安全上界，性质为 Unknown。另立</w:t>
       </w:r>
-      <w:hyperlink r:id="rId53">
+      <w:hyperlink r:id="rId55">
         <w:r>
           <w:rPr>
             <w:color w:val="1D4D71"/>
@@ -15824,9 +15898,55 @@
         <w:rPr>
           <w:b w:val="0"/>
         </w:rPr>
-        <w:t xml:space="preserve"> 报告指定 forward Euler、Δt=0.1 秒、20 次转移，在 k=0…20 检查 sy、phi、theta、psi∈[-1,1]；初盒与网络见</w:t>
-      </w:r>
-      <w:hyperlink r:id="rId129">
+        <w:t xml:space="preserve"> </w:t>
+      </w:r>
+      <w:hyperlink r:id="rId131">
+        <w:r>
+          <w:rPr>
+            <w:color w:val="1D4D71"/>
+            <w:u w:val="single"/>
+            <w:rFonts w:eastAsia="Hiragino Sans GB" w:ascii="Hiragino Sans GB"/>
+          </w:rPr>
+          <w:t>2026 报告</w:t>
+        </w:r>
+      </w:hyperlink>
+      <w:r>
+        <w:rPr>
+          <w:b w:val="0"/>
+        </w:rPr>
+        <w:t>给出一般 forward Euler 规则、Airplane 的 Δt=0.1 秒与 20 次转移，在 k=0…20 检查 sy、phi、theta、psi∈[-1,1]。2026-10-03 复核的</w:t>
+      </w:r>
+      <w:hyperlink r:id="rId132">
+        <w:r>
+          <w:rPr>
+            <w:color w:val="1D4D71"/>
+            <w:u w:val="single"/>
+            <w:rFonts w:eastAsia="Hiragino Sans GB" w:ascii="Hiragino Sans GB"/>
+          </w:rPr>
+          <w:t>固定官方 Airplane 目录</w:t>
+        </w:r>
+      </w:hyperlink>
+      <w:r>
+        <w:rPr>
+          <w:b w:val="0"/>
+        </w:rPr>
+        <w:t xml:space="preserve">只有控制器、连续 </w:t>
+      </w:r>
+      <w:r>
+        <w:rPr>
+          <w:rFonts w:ascii="Menlo" w:hAnsi="Menlo"/>
+          <w:b w:val="0"/>
+          <w:sz w:val="16"/>
+        </w:rPr>
+        <w:t>dynamics.m</w:t>
+      </w:r>
+      <w:r>
+        <w:rPr>
+          <w:b w:val="0"/>
+        </w:rPr>
+        <w:t xml:space="preserve"> 与规格，没有离散执行程序；论文也未写参与者实际的 NN 取样及控制更新先后。初盒、网络和逐源检索见</w:t>
+      </w:r>
+      <w:hyperlink r:id="rId133">
         <w:r>
           <w:rPr>
             <w:color w:val="1D4D71"/>
@@ -15840,7 +15960,7 @@
         <w:rPr>
           <w:b w:val="0"/>
         </w:rPr>
-        <w:t>。门内“旧状态先求 NN、同步更新 12 态”只是具名新比较约定，尚非参与者实际离散提交的权威顺序。</w:t>
+        <w:t>。门内“旧状态先求 NN、同步更新 12 态”只是具名新比较约定，尚非参与者离散提交的权威顺序。</w:t>
       </w:r>
     </w:p>
     <w:p>
@@ -15857,9 +15977,21 @@
         <w:rPr>
           <w:b w:val="0"/>
         </w:rPr>
-        <w:t xml:space="preserve"> 我方、Huan、Xiangru、原生均未在权威离散合同下启动。四方之外的</w:t>
-      </w:r>
-      <w:hyperlink r:id="rId130">
+        <w:t xml:space="preserve"> 我方、Huan、Xiangru、原生四格继续标为</w:t>
+      </w:r>
+      <w:r>
+        <w:rPr>
+          <w:b/>
+        </w:rPr>
+        <w:t>合同阻塞</w:t>
+      </w:r>
+      <w:r>
+        <w:rPr>
+          <w:b w:val="0"/>
+        </w:rPr>
+        <w:t>，均未在权威离散合同下启动。四方之外的</w:t>
+      </w:r>
+      <w:hyperlink r:id="rId134">
         <w:r>
           <w:rPr>
             <w:color w:val="1D4D71"/>
@@ -15907,7 +16039,51 @@
         <w:rPr>
           <w:b w:val="0"/>
         </w:rPr>
-        <w:t xml:space="preserve"> 具体缺 2026 参与者离散转移/控制取样与更新顺序源码或等价权威执行记录；取得后仍需四个真正的离散入口和全初盒 21 索引证据。</w:t>
+        <w:t xml:space="preserve"> 具体缺 2026 参与者离散转移、控制取样与更新顺序的源码或等价权威执行记录。论文指向的</w:t>
+      </w:r>
+      <w:hyperlink r:id="rId135">
+        <w:r>
+          <w:rPr>
+            <w:color w:val="1D4D71"/>
+            <w:u w:val="single"/>
+            <w:rFonts w:eastAsia="Hiragino Sans GB" w:ascii="Hiragino Sans GB"/>
+          </w:rPr>
+          <w:t>2026 重复性归档</w:t>
+        </w:r>
+      </w:hyperlink>
+      <w:r>
+        <w:rPr>
+          <w:b w:val="0"/>
+        </w:rPr>
+        <w:t xml:space="preserve">在本次公开读取时尚无该目录；原始 Airplane 基准的 </w:t>
+      </w:r>
+      <w:r>
+        <w:rPr>
+          <w:rFonts w:ascii="Menlo" w:hAnsi="Menlo"/>
+          <w:b w:val="0"/>
+          <w:sz w:val="16"/>
+        </w:rPr>
+        <w:t>odeint</w:t>
+      </w:r>
+      <w:r>
+        <w:rPr>
+          <w:b w:val="0"/>
+        </w:rPr>
+        <w:t xml:space="preserve"> 连续推进也不能代替 2026 离散程序。若用户选择 </w:t>
+      </w:r>
+      <w:r>
+        <w:rPr>
+          <w:rFonts w:ascii="Menlo" w:hAnsi="Menlo"/>
+          <w:b w:val="0"/>
+          <w:sz w:val="16"/>
+        </w:rPr>
+        <w:t>paper-Euler-controller-first</w:t>
+      </w:r>
+      <w:r>
+        <w:rPr>
+          <w:b w:val="0"/>
+        </w:rPr>
+        <w:t>，只能另立明确具名的四方补充比较合同。无论采用哪份合同，仍需四个真正的离散入口与完整初盒 21 个索引的证据。</w:t>
       </w:r>
     </w:p>
     <w:p>
@@ -15934,7 +16110,7 @@
         </w:rPr>
         <w:t xml:space="preserve"> 固定六态完整初盒、30 个 0.1 秒周期到 T=3；避免官方六维闭危险盒，其 x4 范围为 [-0.7,-0.6]。</w:t>
       </w:r>
-      <w:hyperlink r:id="rId70">
+      <w:hyperlink r:id="rId72">
         <w:r>
           <w:rPr>
             <w:color w:val="1D4D71"/>
@@ -15967,7 +16143,7 @@
         </w:rPr>
         <w:t xml:space="preserve"> 修正危险盒后，P3、Huan、Xiangru、原生新入口均完成 30/30 期与 60/60 小段；保存六维 tube 与危险盒不相交，原生 checker 打印 VERIFIED，三 GPU checker 未打印 Unsafe/Unknown。</w:t>
       </w:r>
-      <w:hyperlink r:id="rId122">
+      <w:hyperlink r:id="rId124">
         <w:r>
           <w:rPr>
             <w:color w:val="1D4D71"/>
@@ -16000,7 +16176,7 @@
         </w:rPr>
         <w:t xml:space="preserve"> </w:t>
       </w:r>
-      <w:hyperlink r:id="rId107">
+      <w:hyperlink r:id="rId109">
         <w:r>
           <w:rPr>
             <w:color w:val="1D4D71"/>
@@ -16016,7 +16192,7 @@
         </w:rPr>
         <w:t>和上方描述统计保留单次与后五次；</w:t>
       </w:r>
-      <w:hyperlink r:id="rId121">
+      <w:hyperlink r:id="rId123">
         <w:r>
           <w:rPr>
             <w:color w:val="1D4D71"/>
@@ -16032,7 +16208,7 @@
         </w:rPr>
         <w:t>及</w:t>
       </w:r>
-      <w:hyperlink r:id="rId131">
+      <w:hyperlink r:id="rId136">
         <w:r>
           <w:rPr>
             <w:color w:val="1D4D71"/>
@@ -16071,7 +16247,7 @@
                     <pic:cNvPicPr/>
                   </pic:nvPicPr>
                   <pic:blipFill>
-                    <a:blip r:embed="rId132"/>
+                    <a:blip r:embed="rId137"/>
                     <a:stretch>
                       <a:fillRect/>
                     </a:stretch>
@@ -16143,7 +16319,7 @@
         </w:rPr>
         <w:t xml:space="preserve"> 论文五特征控制器缺对应模型或权威五到四映射；另名 fixed-repo-raw4 profile 使用官方仓库四原态网络、完整四态初盒、500 个 0.02 秒周期到 T=10，在固定规格 8&lt;t≤10 检查 x1、x3、x4∈[-0.001,0.001]。</w:t>
       </w:r>
-      <w:hyperlink r:id="rId133">
+      <w:hyperlink r:id="rId138">
         <w:r>
           <w:rPr>
             <w:color w:val="1D4D71"/>
@@ -16176,7 +16352,7 @@
         </w:rPr>
         <w:t xml:space="preserve"> 对 raw4，P3 第 87 小步、Huan/Xiangru 各第 99 小步首拒；原生保存 83 段，第 84 段 UNCOMPLETED_SAFE。四方均未进入性质窗，无完整数值时域。</w:t>
       </w:r>
-      <w:hyperlink r:id="rId88">
+      <w:hyperlink r:id="rId90">
         <w:r>
           <w:rPr>
             <w:color w:val="1D4D71"/>
@@ -16192,7 +16368,7 @@
         </w:rPr>
         <w:t>、</w:t>
       </w:r>
-      <w:hyperlink r:id="rId86">
+      <w:hyperlink r:id="rId88">
         <w:r>
           <w:rPr>
             <w:color w:val="1D4D71"/>
@@ -16208,7 +16384,7 @@
         </w:rPr>
         <w:t>、</w:t>
       </w:r>
-      <w:hyperlink r:id="rId89">
+      <w:hyperlink r:id="rId91">
         <w:r>
           <w:rPr>
             <w:color w:val="1D4D71"/>
@@ -16283,7 +16459,7 @@
         </w:rPr>
         <w:t xml:space="preserve"> 四态 (sx,sy,vx,vy)，完整初盒 [70,106]²×[-0.28,0.28]²，固定四输入两力输出，每秒更新到 T=40；全时要求 q=√(vx²+vy²)−0.2−0.002054√(sx²+sy²)≤0。</w:t>
       </w:r>
-      <w:hyperlink r:id="rId90">
+      <w:hyperlink r:id="rId92">
         <w:r>
           <w:rPr>
             <w:color w:val="1D4D71"/>
@@ -16316,7 +16492,7 @@
         </w:rPr>
         <w:t xml:space="preserve"> P3、Huan、Xiangru、原生各保存 400 个 0.1 秒小段；四方性质均 UNKNOWN。原生外层为 failed/exit 2，但 40 期、400 tubes 与 40 RPC 齐全。q 的保守盒上界在首段为正，只说明包络不足以判安全。</w:t>
       </w:r>
-      <w:hyperlink r:id="rId74">
+      <w:hyperlink r:id="rId76">
         <w:r>
           <w:rPr>
             <w:color w:val="1D4D71"/>
@@ -16332,7 +16508,7 @@
         </w:rPr>
         <w:t>和</w:t>
       </w:r>
-      <w:hyperlink r:id="rId75">
+      <w:hyperlink r:id="rId77">
         <w:r>
           <w:rPr>
             <w:color w:val="1D4D71"/>
@@ -16365,7 +16541,7 @@
         </w:rPr>
         <w:t xml:space="preserve"> 单次外层 wall 按 P3/Huan/Xiangru/原生为 17.412/12.699/12.668/9.139 秒；</w:t>
       </w:r>
-      <w:hyperlink r:id="rId105">
+      <w:hyperlink r:id="rId107">
         <w:r>
           <w:rPr>
             <w:color w:val="1D4D71"/>
@@ -16381,7 +16557,7 @@
         </w:rPr>
         <w:t>和</w:t>
       </w:r>
-      <w:hyperlink r:id="rId134">
+      <w:hyperlink r:id="rId139">
         <w:r>
           <w:rPr>
             <w:color w:val="1D4D71"/>
@@ -16439,7 +16615,7 @@
         </w:rPr>
         <w:t xml:space="preserve"> 官方 less-robust 控制器，完整 [1,1.3]^4 分为 225 盒，20 个 0.05 秒控制期、100 个 0.01 秒子步到 T=1；全时要求四态在 [-1.7,2]^4。</w:t>
       </w:r>
-      <w:hyperlink r:id="rId135">
+      <w:hyperlink r:id="rId140">
         <w:r>
           <w:rPr>
             <w:color w:val="1D4D71"/>
@@ -16472,7 +16648,7 @@
         </w:rPr>
         <w:t xml:space="preserve"> P3 有向仿射四分、Huan、Xiangru、原生各保存 225×100 完整数值时域，tube 均在安全盒内；原生 checker 打印 VERIFIED。P3 先前失败候选仍独立保留。</w:t>
       </w:r>
-      <w:hyperlink r:id="rId35">
+      <w:hyperlink r:id="rId37">
         <w:r>
           <w:rPr>
             <w:color w:val="1D4D71"/>
@@ -16488,7 +16664,7 @@
         </w:rPr>
         <w:t>及</w:t>
       </w:r>
-      <w:hyperlink r:id="rId136">
+      <w:hyperlink r:id="rId141">
         <w:r>
           <w:rPr>
             <w:color w:val="1D4D71"/>
@@ -16521,7 +16697,7 @@
         </w:rPr>
         <w:t xml:space="preserve"> 单次外层 wall 按 P3/Huan/Xiangru/原生为 74.274085/9.539174/8.387790/1107.127423 秒；</w:t>
       </w:r>
-      <w:hyperlink r:id="rId137">
+      <w:hyperlink r:id="rId142">
         <w:r>
           <w:rPr>
             <w:color w:val="1D4D71"/>
@@ -16537,7 +16713,7 @@
         </w:rPr>
         <w:t>、</w:t>
       </w:r>
-      <w:hyperlink r:id="rId138">
+      <w:hyperlink r:id="rId143">
         <w:r>
           <w:rPr>
             <w:color w:val="1D4D71"/>
@@ -16576,7 +16752,7 @@
                     <pic:cNvPicPr/>
                   </pic:nvPicPr>
                   <pic:blipFill>
-                    <a:blip r:embed="rId139"/>
+                    <a:blip r:embed="rId144"/>
                     <a:stretch>
                       <a:fillRect/>
                     </a:stretch>
@@ -16648,7 +16824,7 @@
         </w:rPr>
         <w:t xml:space="preserve"> 官方独立 more-robust 网络、完整 [1,1.3]^4、225 盒、20 个 0.02 秒控制期到 T=0.4，全时安全盒 [-1.5,1.5]^4。历史入口误用 less-robust 网络且只取角点，不能迁入本格。</w:t>
       </w:r>
-      <w:hyperlink r:id="rId140">
+      <w:hyperlink r:id="rId145">
         <w:r>
           <w:rPr>
             <w:color w:val="1D4D71"/>
@@ -16695,7 +16871,7 @@
         </w:rPr>
         <w:t>；旧区间控制余项入口第 9 小步数值拒绝仍保留。</w:t>
       </w:r>
-      <w:hyperlink r:id="rId38">
+      <w:hyperlink r:id="rId40">
         <w:r>
           <w:rPr>
             <w:color w:val="1D4D71"/>
@@ -16711,7 +16887,7 @@
         </w:rPr>
         <w:t>、</w:t>
       </w:r>
-      <w:hyperlink r:id="rId40">
+      <w:hyperlink r:id="rId42">
         <w:r>
           <w:rPr>
             <w:color w:val="1D4D71"/>
@@ -16727,7 +16903,7 @@
         </w:rPr>
         <w:t>、</w:t>
       </w:r>
-      <w:hyperlink r:id="rId37">
+      <w:hyperlink r:id="rId39">
         <w:r>
           <w:rPr>
             <w:color w:val="1D4D71"/>
@@ -16743,7 +16919,7 @@
         </w:rPr>
         <w:t>、</w:t>
       </w:r>
-      <w:hyperlink r:id="rId36">
+      <w:hyperlink r:id="rId38">
         <w:r>
           <w:rPr>
             <w:color w:val="1D4D71"/>
@@ -16804,7 +16980,7 @@
         </w:rPr>
         <w:t xml:space="preserve"> tube 完全在下界外。外层 62.360384 秒仅是早停进程时间；不报 T=0.4 终点和完整时间。</w:t>
       </w:r>
-      <w:hyperlink r:id="rId41">
+      <w:hyperlink r:id="rId43">
         <w:r>
           <w:rPr>
             <w:color w:val="1D4D71"/>
@@ -16820,7 +16996,7 @@
         </w:rPr>
         <w:t>先通过 12/12 小步、2,700/2,700 盒步。</w:t>
       </w:r>
-      <w:hyperlink r:id="rId39">
+      <w:hyperlink r:id="rId41">
         <w:r>
           <w:rPr>
             <w:color w:val="1D4D71"/>
@@ -16836,7 +17012,7 @@
         </w:rPr>
         <w:t>不是第五个 flowpipe 方法。另立的</w:t>
       </w:r>
-      <w:hyperlink r:id="rId141">
+      <w:hyperlink r:id="rId146">
         <w:r>
           <w:rPr>
             <w:color w:val="1D4D71"/>
@@ -16936,7 +17112,7 @@
         </w:rPr>
         <w:t xml:space="preserve"> 固定官方 point ONNX，作者可执行顺序 [x,y,speed,heading]→[speed_rate,heading_rate]；640 初盒、0.2 秒×30 到 T=6，全时避开 [1,2]²，终点进入 [-0.5,0.5]²。</w:t>
       </w:r>
-      <w:hyperlink r:id="rId76">
+      <w:hyperlink r:id="rId78">
         <w:r>
           <w:rPr>
             <w:color w:val="1D4D71"/>
@@ -16969,7 +17145,7 @@
         </w:rPr>
         <w:t xml:space="preserve"> 当前 working P3 和原生各有本轮完整 640×600 盒步；Huan/Xiangru 是经审计同合同历史全程。新 Huan 首盒首周期不替代旧全程。</w:t>
       </w:r>
-      <w:hyperlink r:id="rId80">
+      <w:hyperlink r:id="rId82">
         <w:r>
           <w:rPr>
             <w:color w:val="1D4D71"/>
@@ -16985,7 +17161,7 @@
         </w:rPr>
         <w:t>、</w:t>
       </w:r>
-      <w:hyperlink r:id="rId77">
+      <w:hyperlink r:id="rId79">
         <w:r>
           <w:rPr>
             <w:color w:val="1D4D71"/>
@@ -17034,7 +17210,7 @@
         </w:rPr>
         <w:t xml:space="preserve"> 新 P3/原生单次 wall 为 28.999885/1478.865919 秒；</w:t>
       </w:r>
-      <w:hyperlink r:id="rId113">
+      <w:hyperlink r:id="rId115">
         <w:r>
           <w:rPr>
             <w:color w:val="1D4D71"/>
@@ -17050,7 +17226,7 @@
         </w:rPr>
         <w:t>、</w:t>
       </w:r>
-      <w:hyperlink r:id="rId111">
+      <w:hyperlink r:id="rId113">
         <w:r>
           <w:rPr>
             <w:color w:val="1D4D71"/>
@@ -17066,7 +17242,7 @@
         </w:rPr>
         <w:t>和</w:t>
       </w:r>
-      <w:hyperlink r:id="rId110">
+      <w:hyperlink r:id="rId112">
         <w:r>
           <w:rPr>
             <w:color w:val="1D4D71"/>
@@ -17124,7 +17300,7 @@
         </w:rPr>
         <w:t xml:space="preserve"> 同一官方可执行方程，用 set ONNX 和 25 初盒，0.2 秒×30 到 T=6；全时避开 [1,2]²、终点进入 [-0.5,0.5]²。robust 指控制器训练方式，plant 不另加训练噪声。</w:t>
       </w:r>
-      <w:hyperlink r:id="rId76">
+      <w:hyperlink r:id="rId78">
         <w:r>
           <w:rPr>
             <w:color w:val="1D4D71"/>
@@ -17157,7 +17333,7 @@
         </w:rPr>
         <w:t xml:space="preserve"> 当前 working P3 有本轮完整 25×600 盒步；Huan、Xiangru、原生是经审计的同合同历史全程。新 Huan 首盒首周期仅作入口诊断。</w:t>
       </w:r>
-      <w:hyperlink r:id="rId81">
+      <w:hyperlink r:id="rId83">
         <w:r>
           <w:rPr>
             <w:color w:val="1D4D71"/>
@@ -17206,7 +17382,7 @@
         </w:rPr>
         <w:t xml:space="preserve"> 新 P3 单次 wall 18.703898 秒；</w:t>
       </w:r>
-      <w:hyperlink r:id="rId114">
+      <w:hyperlink r:id="rId116">
         <w:r>
           <w:rPr>
             <w:color w:val="1D4D71"/>
@@ -17222,7 +17398,7 @@
         </w:rPr>
         <w:t>、</w:t>
       </w:r>
-      <w:hyperlink r:id="rId112">
+      <w:hyperlink r:id="rId114">
         <w:r>
           <w:rPr>
             <w:color w:val="1D4D71"/>
@@ -17238,7 +17414,7 @@
         </w:rPr>
         <w:t>和</w:t>
       </w:r>
-      <w:hyperlink r:id="rId110">
+      <w:hyperlink r:id="rId112">
         <w:r>
           <w:rPr>
             <w:color w:val="1D4D71"/>
@@ -17296,7 +17472,7 @@
         </w:rPr>
         <w:t xml:space="preserve"> 新主表按用户指定的 2026 论文十二态方程；约 80 秒研究仍按作者旧合同。</w:t>
       </w:r>
-      <w:hyperlink r:id="rId58">
+      <w:hyperlink r:id="rId60">
         <w:r>
           <w:rPr>
             <w:color w:val="1D4D71"/>
@@ -17329,7 +17505,7 @@
         </w:rPr>
         <w:t xml:space="preserve"> P3、Huan、Xiangru、原生各一次完整 1024×1000 数值运行，T=5 的 x3 endpoint 并集均在目标内。原生 checker 仅核终点却打印 VERIFIED；P3/原生保存包络分别自约 T=3.95/3.87 连续入带，Huan/Xiangru 没有逐步坐标范围。</w:t>
       </w:r>
-      <w:hyperlink r:id="rId120">
+      <w:hyperlink r:id="rId122">
         <w:r>
           <w:rPr>
             <w:color w:val="1D4D71"/>
@@ -17362,7 +17538,7 @@
         </w:rPr>
         <w:t xml:space="preserve"> 单次 wall 按 P3/Huan/Xiangru/原生为 1357.555/94.583/108.018/47058.887 秒；</w:t>
       </w:r>
-      <w:hyperlink r:id="rId118">
+      <w:hyperlink r:id="rId120">
         <w:r>
           <w:rPr>
             <w:color w:val="1D4D71"/>
@@ -17378,7 +17554,7 @@
         </w:rPr>
         <w:t>和上方 x3 表给宽度；</w:t>
       </w:r>
-      <w:hyperlink r:id="rId142">
+      <w:hyperlink r:id="rId147">
         <w:r>
           <w:rPr>
             <w:color w:val="1D4D71"/>
@@ -17417,7 +17593,7 @@
                     <pic:cNvPicPr/>
                   </pic:nvPicPr>
                   <pic:blipFill>
-                    <a:blip r:embed="rId143"/>
+                    <a:blip r:embed="rId148"/>
                     <a:stretch>
                       <a:fillRect/>
                     </a:stretch>
@@ -17464,7 +17640,7 @@
         </w:rPr>
         <w:t xml:space="preserve"> </w:t>
       </w:r>
-      <w:hyperlink r:id="rId144">
+      <w:hyperlink r:id="rId149">
         <w:r>
           <w:rPr>
             <w:color w:val="1D4D71"/>
@@ -17522,7 +17698,7 @@
         </w:rPr>
         <w:t>。另立</w:t>
       </w:r>
-      <w:hyperlink r:id="rId145">
+      <w:hyperlink r:id="rId150">
         <w:r>
           <w:rPr>
             <w:color w:val="1D4D71"/>
@@ -17864,7 +18040,125 @@
         <w:rPr>
           <w:b w:val="0"/>
         </w:rPr>
-        <w:t>说明上界斜率未存、直接分离区间法对首盒第一输出过宽约 50.5 倍；</w:t>
+        <w:t>指出原 RPC 未存上界斜率，直接分离区间法对首盒第一输出过宽约 50.5 倍；</w:t>
+      </w:r>
+      <w:hyperlink r:id="rId34">
+        <w:r>
+          <w:rPr>
+            <w:color w:val="1D4D71"/>
+            <w:u w:val="single"/>
+            <w:rFonts w:eastAsia="Hiragino Sans GB" w:ascii="Hiragino Sans GB"/>
+          </w:rPr>
+          <w:t>新录制的同批 1024 盒控制器回放</w:t>
+        </w:r>
+      </w:hyperlink>
+      <w:r>
+        <w:rPr>
+          <w:b w:val="0"/>
+        </w:rPr>
+        <w:t xml:space="preserve">与旧 RPC 三组系数的 43,008 项逐值相同，并录得 </w:t>
+      </w:r>
+      <w:r>
+        <w:rPr>
+          <w:rFonts w:ascii="Menlo" w:hAnsi="Menlo"/>
+          <w:b w:val="0"/>
+          <w:sz w:val="16"/>
+        </w:rPr>
+        <w:t>uA=lA</w:t>
+      </w:r>
+      <w:r>
+        <w:rPr>
+          <w:b w:val="0"/>
+        </w:rPr>
+        <w:t xml:space="preserve"> 的 36,864 项。它补齐相同数值回放的斜率记录，不认证 CROWN 的浮点不等式。</w:t>
+      </w:r>
+      <w:hyperlink r:id="rId33">
+        <w:r>
+          <w:rPr>
+            <w:color w:val="1D4D71"/>
+            <w:u w:val="single"/>
+            <w:rFonts w:eastAsia="Hiragino Sans GB" w:ascii="Hiragino Sans GB"/>
+          </w:rPr>
+          <w:t>精确有理数 float32 传输审计</w:t>
+        </w:r>
+      </w:hyperlink>
+      <w:r>
+        <w:rPr>
+          <w:b w:val="0"/>
+        </w:rPr>
+        <w:t xml:space="preserve">发现把理想实数仿射界直接转入原生 </w:t>
+      </w:r>
+      <w:r>
+        <w:rPr>
+          <w:rFonts w:ascii="Menlo" w:hAnsi="Menlo"/>
+          <w:b w:val="0"/>
+          <w:sz w:val="16"/>
+        </w:rPr>
+        <w:t>.asFloat()</w:t>
+      </w:r>
+      <w:r>
+        <w:rPr>
+          <w:b w:val="0"/>
+        </w:rPr>
+        <w:t xml:space="preserve"> 后，三输出的下界充分传递条件分别在 573/615/533 个初盒不成立；结合新斜率记录，上下任一侧分别为 833/828/795 个。该条件失败并非真实网络输出越界。</w:t>
+      </w:r>
+      <w:hyperlink r:id="rId151">
+        <w:r>
+          <w:rPr>
+            <w:color w:val="1D4D71"/>
+            <w:u w:val="single"/>
+            <w:rFonts w:eastAsia="Hiragino Sans GB" w:ascii="Hiragino Sans GB"/>
+          </w:rPr>
+          <w:t>逐盒条件性修正账本</w:t>
+        </w:r>
+      </w:hyperlink>
+      <w:r>
+        <w:rPr>
+          <w:b w:val="0"/>
+        </w:rPr>
+        <w:t>计算了在</w:t>
+      </w:r>
+      <w:r>
+        <w:rPr>
+          <w:b/>
+        </w:rPr>
+        <w:t>假定原实数 CROWN 界有效</w:t>
+      </w:r>
+      <w:r>
+        <w:rPr>
+          <w:b w:val="0"/>
+        </w:rPr>
+        <w:t>时，最邻近向外 binary32 残差端点：3072 个输出行中 2456 行、1024 个初盒中 1014 盒至少一端需调整。</w:t>
+      </w:r>
+      <w:hyperlink r:id="rId152">
+        <w:r>
+          <w:rPr>
+            <w:color w:val="1D4D71"/>
+            <w:u w:val="single"/>
+            <w:rFonts w:eastAsia="Hiragino Sans GB" w:ascii="Hiragino Sans GB"/>
+          </w:rPr>
+          <w:t>隔离 C++ 构造门</w:t>
+        </w:r>
+      </w:hyperlink>
+      <w:r>
+        <w:rPr>
+          <w:b w:val="0"/>
+        </w:rPr>
+        <w:t xml:space="preserve">只检查到首盒第一输出便因整盒区间参考的强包含条件失败而停，原始端点自身含校正残差，未调用 CROWN/ODE；这项比较过宽且 CSV 精度不足，结论 </w:t>
+      </w:r>
+      <w:r>
+        <w:rPr>
+          <w:rFonts w:ascii="Menlo" w:hAnsi="Menlo"/>
+          <w:b w:val="0"/>
+          <w:sz w:val="16"/>
+        </w:rPr>
+        <w:t>UNDECIDED</w:t>
+      </w:r>
+      <w:r>
+        <w:rPr>
+          <w:b w:val="0"/>
+        </w:rPr>
+        <w:t xml:space="preserve">，其余 3071 行未检。 </w:t>
       </w:r>
       <w:hyperlink r:id="rId32">
         <w:r>
@@ -17880,7 +18174,7 @@
         <w:rPr>
           <w:b w:val="0"/>
         </w:rPr>
-        <w:t>仍未判定，第一输出区间宽 0.09847，未落入宽 0.06710 的保存 residual 带。这些都不是网络输出反例；生产门关闭。</w:t>
+        <w:t>也未判定，第一输出区间宽 0.09847，未落入宽 0.06710 的保存 residual 带。原生八方向生产门关闭。</w:t>
       </w:r>
     </w:p>
     <w:p>
@@ -17924,7 +18218,7 @@
         </w:rPr>
         <w:t xml:space="preserve"> 当前具名两物理态 profile 用官方前两条 ODE 和固定控制器，完整初盒 [1,1.175]×[0,0.2]，20 个 0.05 秒期到 T=1；在全部 t∈[0.5,1] 检查 x1∈[0,1]。辅助时钟不进入网络。</w:t>
       </w:r>
-      <w:hyperlink r:id="rId140">
+      <w:hyperlink r:id="rId145">
         <w:r>
           <w:rPr>
             <w:color w:val="1D4D71"/>
@@ -17957,7 +18251,7 @@
         </w:rPr>
         <w:t xml:space="preserve"> P3、Huan、Xiangru、原生各有本轮完整 100 小步，保存性质窗内 x1 tube 均在闭带内；这不是尚缺执行材料的官方三态 MATLAB 身份。</w:t>
       </w:r>
-      <w:hyperlink r:id="rId60">
+      <w:hyperlink r:id="rId62">
         <w:r>
           <w:rPr>
             <w:color w:val="1D4D71"/>
@@ -17973,7 +18267,7 @@
         </w:rPr>
         <w:t>、</w:t>
       </w:r>
-      <w:hyperlink r:id="rId61">
+      <w:hyperlink r:id="rId63">
         <w:r>
           <w:rPr>
             <w:color w:val="1D4D71"/>
@@ -17989,7 +18283,7 @@
         </w:rPr>
         <w:t>、</w:t>
       </w:r>
-      <w:hyperlink r:id="rId106">
+      <w:hyperlink r:id="rId108">
         <w:r>
           <w:rPr>
             <w:color w:val="1D4D71"/>
@@ -18022,7 +18316,7 @@
         </w:rPr>
         <w:t xml:space="preserve"> 各方法有首轮和五次后续独立进程，逐次见 campaign；P3 安全窗 x1 tube union 为 [0.5645452654370386,0.9932406822927875]。</w:t>
       </w:r>
-      <w:hyperlink r:id="rId146">
+      <w:hyperlink r:id="rId153">
         <w:r>
           <w:rPr>
             <w:color w:val="1D4D71"/>
@@ -18052,7 +18346,7 @@
         </w:rPr>
         <w:t xml:space="preserve"> 全 100 步 tube，下排展示末段 endpoint 相对 Huan 的小差值；Huan/Xiangru 保存界直接一致。</w:t>
       </w:r>
-      <w:hyperlink r:id="rId147">
+      <w:hyperlink r:id="rId154">
         <w:r>
           <w:rPr>
             <w:color w:val="1D4D71"/>
@@ -18068,7 +18362,7 @@
         </w:rPr>
         <w:t>及</w:t>
       </w:r>
-      <w:hyperlink r:id="rId148">
+      <w:hyperlink r:id="rId155">
         <w:r>
           <w:rPr>
             <w:color w:val="1D4D71"/>
@@ -18107,7 +18401,7 @@
                     <pic:cNvPicPr/>
                   </pic:nvPicPr>
                   <pic:blipFill>
-                    <a:blip r:embed="rId149"/>
+                    <a:blip r:embed="rId156"/>
                     <a:stretch>
                       <a:fillRect/>
                     </a:stretch>
@@ -18152,7 +18446,51 @@
         <w:rPr>
           <w:b w:val="0"/>
         </w:rPr>
-        <w:t xml:space="preserve"> 官方三态复现仍缺第三态初值、重置及控制/检查入口；两态结果不可冒名。保存范围和计时不构成独立端到端证书或稳定跨合同排名。</w:t>
+        <w:t xml:space="preserve"> </w:t>
+      </w:r>
+      <w:hyperlink r:id="rId157">
+        <w:r>
+          <w:rPr>
+            <w:color w:val="1D4D71"/>
+            <w:u w:val="single"/>
+            <w:rFonts w:eastAsia="Hiragino Sans GB" w:ascii="Hiragino Sans GB"/>
+          </w:rPr>
+          <w:t>定点官方来源复核</w:t>
+        </w:r>
+      </w:hyperlink>
+      <w:r>
+        <w:rPr>
+          <w:b w:val="0"/>
+        </w:rPr>
+        <w:t xml:space="preserve">确认论文和规格定义两个物理态，而固定 </w:t>
+      </w:r>
+      <w:r>
+        <w:rPr>
+          <w:rFonts w:ascii="Menlo" w:hAnsi="Menlo"/>
+          <w:b w:val="0"/>
+          <w:sz w:val="16"/>
+        </w:rPr>
+        <w:t>dynamics_sp.m</w:t>
+      </w:r>
+      <w:r>
+        <w:rPr>
+          <w:b w:val="0"/>
+        </w:rPr>
+        <w:t xml:space="preserve"> 另返回 </w:t>
+      </w:r>
+      <w:r>
+        <w:rPr>
+          <w:rFonts w:ascii="Menlo" w:hAnsi="Menlo"/>
+          <w:b w:val="0"/>
+          <w:sz w:val="16"/>
+        </w:rPr>
+        <w:t>dx3=1</w:t>
+      </w:r>
+      <w:r>
+        <w:rPr>
+          <w:b w:val="0"/>
+        </w:rPr>
+        <w:t>，没有给出第三态初值、重置或 2026 MATLAB 闭环/检查入口；原始仓库的二维 Python 示例不能代替该提交。当前两态数值结果不冒名为三态 MATLAB 复现。保存范围和计时不构成独立端到端证书或稳定跨合同排名。</w:t>
       </w:r>
     </w:p>
     <w:p>
@@ -18179,7 +18517,7 @@
         </w:rPr>
         <w:t xml:space="preserve"> 完整初盒切成 12 盒，控制输出只减一次 10；20 个 1 秒期、200 个 0.1 秒子步到 T=20，全时安全盒 [-2,2]^4。</w:t>
       </w:r>
-      <w:hyperlink r:id="rId62">
+      <w:hyperlink r:id="rId64">
         <w:r>
           <w:rPr>
             <w:color w:val="1D4D71"/>
@@ -18259,7 +18597,7 @@
         </w:rPr>
         <w:t xml:space="preserve"> 与统一余项初猜的新</w:t>
       </w:r>
-      <w:hyperlink r:id="rId150">
+      <w:hyperlink r:id="rId158">
         <w:r>
           <w:rPr>
             <w:color w:val="1D4D71"/>
@@ -18345,7 +18683,7 @@
         </w:rPr>
         <w:t xml:space="preserve"> 的</w:t>
       </w:r>
-      <w:hyperlink r:id="rId151">
+      <w:hyperlink r:id="rId159">
         <w:r>
           <w:rPr>
             <w:color w:val="1D4D71"/>
@@ -18378,7 +18716,7 @@
         </w:rPr>
         <w:t xml:space="preserve"> P3/原生完整单次 wall 为 10.411001/8.339151 秒；Huan/Xiangru 约 8 秒仅为失败进程。</w:t>
       </w:r>
-      <w:hyperlink r:id="rId123">
+      <w:hyperlink r:id="rId125">
         <w:r>
           <w:rPr>
             <w:color w:val="1D4D71"/>
@@ -18394,7 +18732,7 @@
         </w:rPr>
         <w:t>把未完成终点留空，</w:t>
       </w:r>
-      <w:hyperlink r:id="rId152">
+      <w:hyperlink r:id="rId160">
         <w:r>
           <w:rPr>
             <w:color w:val="1D4D71"/>
@@ -18455,7 +18793,7 @@
         </w:rPr>
         <w:t xml:space="preserve"> </w:t>
       </w:r>
-      <w:hyperlink r:id="rId153">
+      <w:hyperlink r:id="rId161">
         <w:r>
           <w:rPr>
             <w:color w:val="1D4D71"/>
@@ -18499,7 +18837,7 @@
         </w:rPr>
         <w:t>，前三方没有明确 checker 文字输出。</w:t>
       </w:r>
-      <w:hyperlink r:id="rId154">
+      <w:hyperlink r:id="rId162">
         <w:r>
           <w:rPr>
             <w:color w:val="1D4D71"/>
@@ -18515,7 +18853,7 @@
         </w:rPr>
         <w:t>与</w:t>
       </w:r>
-      <w:hyperlink r:id="rId155">
+      <w:hyperlink r:id="rId163">
         <w:r>
           <w:rPr>
             <w:color w:val="1D4D71"/>
@@ -18585,7 +18923,7 @@
         </w:rPr>
         <w:t>，也不提供稳定速度排名或独立端到端 NNCS 证明。</w:t>
       </w:r>
-      <w:hyperlink r:id="rId156">
+      <w:hyperlink r:id="rId164">
         <w:r>
           <w:rPr>
             <w:color w:val="1D4D71"/>
@@ -18601,7 +18939,7 @@
         </w:rPr>
         <w:t>、</w:t>
       </w:r>
-      <w:hyperlink r:id="rId157">
+      <w:hyperlink r:id="rId165">
         <w:r>
           <w:rPr>
             <w:color w:val="1D4D71"/>
@@ -18617,7 +18955,7 @@
         </w:rPr>
         <w:t>、</w:t>
       </w:r>
-      <w:hyperlink r:id="rId158">
+      <w:hyperlink r:id="rId166">
         <w:r>
           <w:rPr>
             <w:color w:val="1D4D71"/>
@@ -18656,7 +18994,7 @@
                     <pic:cNvPicPr/>
                   </pic:nvPicPr>
                   <pic:blipFill>
-                    <a:blip r:embed="rId159"/>
+                    <a:blip r:embed="rId167"/>
                     <a:stretch>
                       <a:fillRect/>
                     </a:stretch>
@@ -18711,7 +19049,7 @@
         </w:rPr>
         <w:t xml:space="preserve"> 用户选定官方 2026 四层 sigmoid 模型及 u=11f；四态完整初盒、0.5 秒×10 到 T=5，目标 x1∈[-0.1,0.2]、x2∈[-0.9,-0.6]。</w:t>
       </w:r>
-      <w:hyperlink r:id="rId160">
+      <w:hyperlink r:id="rId168">
         <w:r>
           <w:rPr>
             <w:color w:val="1D4D71"/>
@@ -18744,7 +19082,7 @@
         </w:rPr>
         <w:t xml:space="preserve"> P3、Huan、Xiangru、原生均有本轮 500/500 小步，保存 T=5 目标坐标全盒入目标。P3/Huan/Xiangru 未执行性质 checker，只有原生作者终点 checker 打印 VERIFIED；Huan/Xiangru 共用驱动。</w:t>
       </w:r>
-      <w:hyperlink r:id="rId161">
+      <w:hyperlink r:id="rId169">
         <w:r>
           <w:rPr>
             <w:color w:val="1D4D71"/>
@@ -18777,7 +19115,7 @@
         </w:rPr>
         <w:t xml:space="preserve"> P3/原生单次 wall 为 13.741791/8.991666 秒，Huan/Xiangru 时间见各</w:t>
       </w:r>
-      <w:hyperlink r:id="rId92">
+      <w:hyperlink r:id="rId94">
         <w:r>
           <w:rPr>
             <w:color w:val="1D4D71"/>
@@ -18793,7 +19131,7 @@
         </w:rPr>
         <w:t>和</w:t>
       </w:r>
-      <w:hyperlink r:id="rId94">
+      <w:hyperlink r:id="rId96">
         <w:r>
           <w:rPr>
             <w:color w:val="1D4D71"/>
@@ -18809,7 +19147,7 @@
         </w:rPr>
         <w:t>摘要；四态终点绝对界见 CSV。</w:t>
       </w:r>
-      <w:hyperlink r:id="rId162">
+      <w:hyperlink r:id="rId170">
         <w:r>
           <w:rPr>
             <w:color w:val="1D4D71"/>
@@ -18848,7 +19186,7 @@
                     <pic:cNvPicPr/>
                   </pic:nvPicPr>
                   <pic:blipFill>
-                    <a:blip r:embed="rId163"/>
+                    <a:blip r:embed="rId171"/>
                     <a:stretch>
                       <a:fillRect/>
                     </a:stretch>
@@ -18920,7 +19258,7 @@
         </w:rPr>
         <w:t xml:space="preserve"> 固定官方 ReLU³/tanh 网络及 u=11f；和 sigmoid 共用四态 ODE、初盒、0.5 秒×10 与终点目标。</w:t>
       </w:r>
-      <w:hyperlink r:id="rId160">
+      <w:hyperlink r:id="rId168">
         <w:r>
           <w:rPr>
             <w:color w:val="1D4D71"/>
@@ -18953,7 +19291,7 @@
         </w:rPr>
         <w:t xml:space="preserve"> 新</w:t>
       </w:r>
-      <w:hyperlink r:id="rId99">
+      <w:hyperlink r:id="rId101">
         <w:r>
           <w:rPr>
             <w:color w:val="1D4D71"/>
@@ -18969,7 +19307,7 @@
         </w:rPr>
         <w:t xml:space="preserve"> 50/50 接受后，另立</w:t>
       </w:r>
-      <w:hyperlink r:id="rId100">
+      <w:hyperlink r:id="rId102">
         <w:r>
           <w:rPr>
             <w:color w:val="1D4D71"/>
@@ -18999,7 +19337,7 @@
         </w:rPr>
         <w:t xml:space="preserve"> P3 仍保留作历史对照，不能改名为当前 working P3。</w:t>
       </w:r>
-      <w:hyperlink r:id="rId164">
+      <w:hyperlink r:id="rId172">
         <w:r>
           <w:rPr>
             <w:color w:val="1D4D71"/>
@@ -19102,7 +19440,7 @@
         </w:rPr>
         <w:t>；逐步 500 条范围独立扫描有限、有序且 endpoint 逐段包含。</w:t>
       </w:r>
-      <w:hyperlink r:id="rId165">
+      <w:hyperlink r:id="rId173">
         <w:r>
           <w:rPr>
             <w:color w:val="1D4D71"/>
@@ -19118,7 +19456,7 @@
         </w:rPr>
         <w:t>逐行标明 P3 为新、其它三方为历史；本轮没有同资源四方计时，不据旧新混合样本排名。</w:t>
       </w:r>
-      <w:hyperlink r:id="rId166">
+      <w:hyperlink r:id="rId174">
         <w:r>
           <w:rPr>
             <w:color w:val="1D4D71"/>
@@ -19171,7 +19509,7 @@
                     <pic:cNvPicPr/>
                   </pic:nvPicPr>
                   <pic:blipFill>
-                    <a:blip r:embed="rId167"/>
+                    <a:blip r:embed="rId175"/>
                     <a:stretch>
                       <a:fillRect/>
                     </a:stretch>
@@ -19257,7 +19595,7 @@
         </w:rPr>
         <w:t xml:space="preserve"> 用户指定论文方程：常值 w∈[-10⁻⁴,10⁻⁴] 只加速度导数，完整四态初盒、0.2 秒×50 到 T=10；目标 [-0.6,0.6]×[-0.2,0.2]×[-0.06,0.06]×[-0.3,0.3]。</w:t>
       </w:r>
-      <w:hyperlink r:id="rId168">
+      <w:hyperlink r:id="rId176">
         <w:r>
           <w:rPr>
             <w:color w:val="1D4D71"/>
@@ -19290,7 +19628,7 @@
         </w:rPr>
         <w:t xml:space="preserve"> P3、Huan、Xiangru、原生各有 500/500 小步。P3/原生保存 T=10 全盒终点入目标，原生作者终点 checker 打印 VERIFIED；Huan/Xiangru 的 x3/x4 终点盒未全入目标，程序 UNKNOWN。</w:t>
       </w:r>
-      <w:hyperlink r:id="rId169">
+      <w:hyperlink r:id="rId177">
         <w:r>
           <w:rPr>
             <w:color w:val="1D4D71"/>
@@ -19334,7 +19672,7 @@
         </w:rPr>
         <w:t xml:space="preserve"> 的完整初盒 endpoint 入目标；Huan/Xiangru 的 500 个已保存 endpoint 无一次四态同时全入目标，这不能推成整个窗口不可达。</w:t>
       </w:r>
-      <w:hyperlink r:id="rId170">
+      <w:hyperlink r:id="rId178">
         <w:r>
           <w:rPr>
             <w:color w:val="1D4D71"/>
@@ -19350,7 +19688,7 @@
         </w:rPr>
         <w:t>与</w:t>
       </w:r>
-      <w:hyperlink r:id="rId171">
+      <w:hyperlink r:id="rId179">
         <w:r>
           <w:rPr>
             <w:color w:val="1D4D71"/>
@@ -19383,7 +19721,7 @@
         </w:rPr>
         <w:t xml:space="preserve"> 单次外层 wall 按 P3/Huan/Xiangru/原生为 17.819782/9.594389/9.895126/10.397308 秒；</w:t>
       </w:r>
-      <w:hyperlink r:id="rId172">
+      <w:hyperlink r:id="rId180">
         <w:r>
           <w:rPr>
             <w:color w:val="1D4D71"/>
@@ -19399,7 +19737,7 @@
         </w:rPr>
         <w:t>来自保存范围，各方法阶数不同。</w:t>
       </w:r>
-      <w:hyperlink r:id="rId173">
+      <w:hyperlink r:id="rId181">
         <w:r>
           <w:rPr>
             <w:color w:val="1D4D71"/>
@@ -19466,7 +19804,7 @@
                     <pic:cNvPicPr/>
                   </pic:nvPicPr>
                   <pic:blipFill>
-                    <a:blip r:embed="rId174"/>
+                    <a:blip r:embed="rId182"/>
                     <a:stretch>
                       <a:fillRect/>
                     </a:stretch>
@@ -19529,7 +19867,7 @@
         </w:rPr>
         <w:t>原因、模式、移植技巧与历史证据见</w:t>
       </w:r>
-      <w:hyperlink r:id="rId102">
+      <w:hyperlink r:id="rId104">
         <w:r>
           <w:rPr>
             <w:color w:val="1D4D71"/>
@@ -19559,7 +19897,7 @@
         </w:rPr>
         <w:t xml:space="preserve"> 当同合同加速比。新论文方程下 Huan parity 单次 94.583 s 已独立列于 QUAD 节，也不能直接与旧 75.250099 s 作优化倍率。40 步 parity/strict 与阶段计时只解释早期成本，不外推 1000 步；见</w:t>
       </w:r>
-      <w:hyperlink r:id="rId175">
+      <w:hyperlink r:id="rId183">
         <w:r>
           <w:rPr>
             <w:color w:val="1D4D71"/>
@@ -19575,7 +19913,7 @@
         </w:rPr>
         <w:t>。旧作者合同的另一组 P3 无 JIT 40 步 observer 开/关成对尝试在终步每盒数值数组直接一致的条件下，单对 driver 时间差仅 0.230546 s；两臂均省去旧完整运行的诊断签名，因此它不测签名净成本，也不支持删除逐步绘图记录或宣称全程加速，见</w:t>
       </w:r>
-      <w:hyperlink r:id="rId176">
+      <w:hyperlink r:id="rId184">
         <w:r>
           <w:rPr>
             <w:color w:val="1D4D71"/>
@@ -19599,7 +19937,7 @@
         </w:rPr>
         <w:t>另立</w:t>
       </w:r>
-      <w:hyperlink r:id="rId177">
+      <w:hyperlink r:id="rId185">
         <w:r>
           <w:rPr>
             <w:color w:val="1D4D71"/>
@@ -19617,7 +19955,7 @@
       </w:r>
     </w:p>
     <w:p>
-      <w:hyperlink r:id="rId178">
+      <w:hyperlink r:id="rId186">
         <w:r>
           <w:rPr>
             <w:color w:val="1D4D71"/>
@@ -19635,7 +19973,7 @@
       </w:r>
     </w:p>
     <w:p>
-      <w:hyperlink r:id="rId179">
+      <w:hyperlink r:id="rId187">
         <w:r>
           <w:rPr>
             <w:color w:val="1D4D71"/>
@@ -19693,6 +20031,70 @@
       </w:r>
     </w:p>
     <w:p>
+      <w:hyperlink r:id="rId188">
+        <w:r>
+          <w:rPr>
+            <w:color w:val="1D4D71"/>
+            <w:u w:val="single"/>
+            <w:rFonts w:eastAsia="Hiragino Sans GB" w:ascii="Hiragino Sans GB"/>
+          </w:rPr>
+          <w:t>加权图分块 128→256 的独立 40 步候选</w:t>
+        </w:r>
+      </w:hyperlink>
+      <w:r>
+        <w:rPr>
+          <w:b w:val="0"/>
+        </w:rPr>
+        <w:t>保留两轮细化、普通验证 128 行和旧作者其余合同，40,960/40,960 盒步接受；加权图调用从 640 降至 320，40 条观察与既有短程参考逐字节相同，所存终态逐盒 tube/endpoint/status 亦直接一致。</w:t>
+      </w:r>
+      <w:hyperlink r:id="rId189">
+        <w:r>
+          <w:rPr>
+            <w:color w:val="1D4D71"/>
+            <w:u w:val="single"/>
+            <w:rFonts w:eastAsia="Hiragino Sans GB" w:ascii="Hiragino Sans GB"/>
+          </w:rPr>
+          <w:t>新独立全 1000 步作业</w:t>
+        </w:r>
+      </w:hyperlink>
+      <w:r>
+        <w:rPr>
+          <w:b w:val="0"/>
+        </w:rPr>
+        <w:t>也通过旧合同/资源自动预检后完成 1,000/1,000 步、1,024,000/1,024,000 盒步接受和 50 次控制。</w:t>
+      </w:r>
+      <w:hyperlink r:id="rId190">
+        <w:r>
+          <w:rPr>
+            <w:color w:val="1D4D71"/>
+            <w:u w:val="single"/>
+            <w:rFonts w:eastAsia="Hiragino Sans GB" w:ascii="Hiragino Sans GB"/>
+          </w:rPr>
+          <w:t>全程逐步保存值对照</w:t>
+        </w:r>
+      </w:hyperlink>
+      <w:r>
+        <w:rPr>
+          <w:b w:val="0"/>
+        </w:rPr>
+        <w:t xml:space="preserve">显示全部 1,000 步的逐盒 </w:t>
+      </w:r>
+      <w:r>
+        <w:rPr>
+          <w:rFonts w:ascii="Menlo" w:hAnsi="Menlo"/>
+          <w:b w:val="0"/>
+          <w:sz w:val="16"/>
+        </w:rPr>
+        <w:t>1024×12×4</w:t>
+      </w:r>
+      <w:r>
+        <w:rPr>
+          <w:b w:val="0"/>
+        </w:rPr>
+        <w:t xml:space="preserve"> bounds、接受掩码、状态和 pooled 观察与旧 P3/trig 完整参考直接逐字节相同；未比较不存在的旧 post-driver final NPY 或全部内部 TM/SR。新单次 outer/watchdog wall 为 1093.267/1093.193 秒，旧参考 watchdog 单次 1533.752 秒；异日且无交错计时控制，不把差值写成稳定或因果加速。它不进入 2026 论文 QUAD 主表，也不构成独立浮点 NNCS 证明。</w:t>
+      </w:r>
+    </w:p>
+    <w:p>
       <w:pPr>
         <w:pStyle w:val="Heading1"/>
       </w:pPr>
@@ -19707,7 +20109,7 @@
         </w:rPr>
         <w:t>图层、tube/endpoint 语义与 MATLAB/替代渲染边界见</w:t>
       </w:r>
-      <w:hyperlink r:id="rId180">
+      <w:hyperlink r:id="rId191">
         <w:r>
           <w:rPr>
             <w:color w:val="1D4D71"/>
@@ -19723,7 +20125,7 @@
         </w:rPr>
         <w:t>和</w:t>
       </w:r>
-      <w:hyperlink r:id="rId181">
+      <w:hyperlink r:id="rId192">
         <w:r>
           <w:rPr>
             <w:color w:val="1D4D71"/>
@@ -19739,7 +20141,7 @@
         </w:rPr>
         <w:t>。本轮新增</w:t>
       </w:r>
-      <w:hyperlink r:id="rId182">
+      <w:hyperlink r:id="rId193">
         <w:r>
           <w:rPr>
             <w:color w:val="1D4D71"/>
@@ -19847,7 +20249,7 @@
         </w:rPr>
         <w:t>入口现在可重复指定兼容的 v1 保存几何，在同一坐标轴叠加多方法，并在回执中分别记录几何验证/导出、MATLAB 生成和 PNG/PDF 渲染用时。</w:t>
       </w:r>
-      <w:hyperlink r:id="rId183">
+      <w:hyperlink r:id="rId194">
         <w:r>
           <w:rPr>
             <w:color w:val="1D4D71"/>
@@ -19871,7 +20273,7 @@
         </w:rPr>
         <w:t>本轮还从新保存记录直接生成了</w:t>
       </w:r>
-      <w:hyperlink r:id="rId127">
+      <w:hyperlink r:id="rId129">
         <w:r>
           <w:rPr>
             <w:color w:val="1D4D71"/>
@@ -19887,7 +20289,7 @@
         </w:rPr>
         <w:t>、</w:t>
       </w:r>
-      <w:hyperlink r:id="rId184">
+      <w:hyperlink r:id="rId195">
         <w:r>
           <w:rPr>
             <w:color w:val="1D4D71"/>
@@ -19903,7 +20305,7 @@
         </w:rPr>
         <w:t>，并在原生全程完成后生成上节</w:t>
       </w:r>
-      <w:hyperlink r:id="rId142">
+      <w:hyperlink r:id="rId147">
         <w:r>
           <w:rPr>
             <w:color w:val="1D4D71"/>
@@ -19970,7 +20372,7 @@
                     <pic:cNvPicPr/>
                   </pic:nvPicPr>
                   <pic:blipFill>
-                    <a:blip r:embed="rId185"/>
+                    <a:blip r:embed="rId196"/>
                     <a:stretch>
                       <a:fillRect/>
                     </a:stretch>
@@ -20020,7 +20422,7 @@
       </w:r>
     </w:p>
     <w:p>
-      <w:hyperlink r:id="rId131">
+      <w:hyperlink r:id="rId136">
         <w:r>
           <w:rPr>
             <w:color w:val="1D4D71"/>
@@ -20072,7 +20474,7 @@
         </w:rPr>
         <w:t>新增的</w:t>
       </w:r>
-      <w:hyperlink r:id="rId186">
+      <w:hyperlink r:id="rId197">
         <w:r>
           <w:rPr>
             <w:color w:val="1D4D71"/>
@@ -20134,7 +20536,7 @@
         </w:rPr>
         <w:t>保存新完成、短程 smoke 与失败预检的不同资格。</w:t>
       </w:r>
-      <w:hyperlink r:id="rId187">
+      <w:hyperlink r:id="rId198">
         <w:r>
           <w:rPr>
             <w:color w:val="1D4D71"/>
@@ -20150,7 +20552,7 @@
         </w:rPr>
         <w:t>索引已复制的小型运行收据、范围、图和阶段报告；大多数官方第三方 ONNX/MAT 不重复发布；TORA reach 新 run 目录保留了小型输入模型副本，原生论文 QUAD 长作业的远端范围文件仍留原路径。DP less native 的</w:t>
       </w:r>
-      <w:hyperlink r:id="rId33">
+      <w:hyperlink r:id="rId35">
         <w:r>
           <w:rPr>
             <w:color w:val="1D4D71"/>
@@ -20166,7 +20568,7 @@
         </w:rPr>
         <w:t>收有 START/RESULT、原始日志、完整范围文件、复制来源与三组图；新 QUAD Huan 的</w:t>
       </w:r>
-      <w:hyperlink r:id="rId55">
+      <w:hyperlink r:id="rId57">
         <w:r>
           <w:rPr>
             <w:color w:val="1D4D71"/>
@@ -20830,7 +21232,7 @@
     <w:qFormat/>
     <w:rsid w:val="00FC693F"/>
     <w:pPr>
-      <w:spacing w:line="269" w:lineRule="auto" w:after="80"/>
+      <w:spacing w:line="264" w:lineRule="auto" w:after="60"/>
     </w:pPr>
     <w:rPr>
       <w:rFonts w:ascii="Hiragino Sans GB" w:hAnsi="Hiragino Sans GB" w:eastAsia="Hiragino Sans GB" w:cs="Hiragino Sans GB"/>

</xml_diff>

<commit_message>
Record matched QUAD control and native construction gate
</commit_message>
<xml_diff>
--- a/docs/evidence/results/archcomp26_20261001/stage_report/ARCHCOMP26_FULL_STAGE_DRAFT_200_20261003.docx
+++ b/docs/evidence/results/archcomp26_20261001/stage_report/ARCHCOMP26_FULL_STAGE_DRAFT_200_20261003.docx
@@ -18185,6 +18185,109 @@
         <w:rPr>
           <w:b/>
         </w:rPr>
+        <w:t>相关符号控制构造门：</w:t>
+      </w:r>
+      <w:r>
+        <w:rPr>
+          <w:b w:val="0"/>
+        </w:rPr>
+        <w:t xml:space="preserve"> 新</w:t>
+      </w:r>
+      <w:hyperlink r:id="rId153">
+        <w:r>
+          <w:rPr>
+            <w:color w:val="1D4D71"/>
+            <w:u w:val="single"/>
+            <w:rFonts w:eastAsia="Hiragino Sans GB" w:ascii="Hiragino Sans GB"/>
+          </w:rPr>
+          <w:t>首盒原生 TM 构造与精确有理数审计</w:t>
+        </w:r>
+      </w:hyperlink>
+      <w:r>
+        <w:rPr>
+          <w:b w:val="0"/>
+        </w:rPr>
+        <w:t xml:space="preserve">保留 </w:t>
+      </w:r>
+      <w:r>
+        <w:rPr>
+          <w:rFonts w:ascii="Menlo" w:hAnsi="Menlo"/>
+          <w:b w:val="0"/>
+          <w:sz w:val="16"/>
+        </w:rPr>
+        <w:t>.asFloat()</w:t>
+      </w:r>
+      <w:r>
+        <w:rPr>
+          <w:b w:val="0"/>
+        </w:rPr>
+        <w:t xml:space="preserve">、double 重心化及 TM 注入顺序，以相同归一化符号检查条件性修正控制界。构造进程成功；首拒检查在输出 1 下侧给出 </w:t>
+      </w:r>
+      <w:r>
+        <w:rPr>
+          <w:rFonts w:ascii="Menlo" w:hAnsi="Menlo"/>
+          <w:b w:val="0"/>
+          <w:sz w:val="16"/>
+        </w:rPr>
+        <w:t>−3.330452308×10⁻¹⁶</w:t>
+      </w:r>
+      <w:r>
+        <w:rPr>
+          <w:b w:val="0"/>
+        </w:rPr>
+        <w:t xml:space="preserve"> 的余量，原始结果只检查了这一行。随后对同一保存全精度 TM trace 的只读分析发现三输出下侧余量分别为 </w:t>
+      </w:r>
+      <w:r>
+        <w:rPr>
+          <w:rFonts w:ascii="Menlo" w:hAnsi="Menlo"/>
+          <w:b w:val="0"/>
+          <w:sz w:val="16"/>
+        </w:rPr>
+        <w:t>−3.330452308×10⁻¹⁶</w:t>
+      </w:r>
+      <w:r>
+        <w:rPr>
+          <w:b w:val="0"/>
+        </w:rPr>
+        <w:t>、</w:t>
+      </w:r>
+      <w:r>
+        <w:rPr>
+          <w:rFonts w:ascii="Menlo" w:hAnsi="Menlo"/>
+          <w:b w:val="0"/>
+          <w:sz w:val="16"/>
+        </w:rPr>
+        <w:t>−5.159067004×10⁻¹⁹</w:t>
+      </w:r>
+      <w:r>
+        <w:rPr>
+          <w:b w:val="0"/>
+        </w:rPr>
+        <w:t>、</w:t>
+      </w:r>
+      <w:r>
+        <w:rPr>
+          <w:rFonts w:ascii="Menlo" w:hAnsi="Menlo"/>
+          <w:b w:val="0"/>
+          <w:sz w:val="16"/>
+        </w:rPr>
+        <w:t>−5.310919262×10⁻²⁰</w:t>
+      </w:r>
+      <w:r>
+        <w:rPr>
+          <w:b w:val="0"/>
+        </w:rPr>
+        <w:t>，上侧均通过。若固定当前 TM 多项式和输入 TM，最终余项下界分别需向外移动 48、1、1 个 binary64 ULP 才满足这项充分条件；修改 bias 会重新构造 TM，不能直接视作已验证修补。该门未运行 NN/CROWN 或 ODE，未证实真实网络越界；原生生产门仍关闭。</w:t>
+      </w:r>
+    </w:p>
+    <w:p>
+      <w:pPr>
+        <w:pStyle w:val="ListBullet"/>
+      </w:pPr>
+      <w:r>
+        <w:rPr>
+          <w:b/>
+        </w:rPr>
         <w:t>未决：</w:t>
       </w:r>
       <w:r>
@@ -18316,7 +18419,7 @@
         </w:rPr>
         <w:t xml:space="preserve"> 各方法有首轮和五次后续独立进程，逐次见 campaign；P3 安全窗 x1 tube union 为 [0.5645452654370386,0.9932406822927875]。</w:t>
       </w:r>
-      <w:hyperlink r:id="rId153">
+      <w:hyperlink r:id="rId154">
         <w:r>
           <w:rPr>
             <w:color w:val="1D4D71"/>
@@ -18346,7 +18449,7 @@
         </w:rPr>
         <w:t xml:space="preserve"> 全 100 步 tube，下排展示末段 endpoint 相对 Huan 的小差值；Huan/Xiangru 保存界直接一致。</w:t>
       </w:r>
-      <w:hyperlink r:id="rId154">
+      <w:hyperlink r:id="rId155">
         <w:r>
           <w:rPr>
             <w:color w:val="1D4D71"/>
@@ -18362,7 +18465,7 @@
         </w:rPr>
         <w:t>及</w:t>
       </w:r>
-      <w:hyperlink r:id="rId155">
+      <w:hyperlink r:id="rId156">
         <w:r>
           <w:rPr>
             <w:color w:val="1D4D71"/>
@@ -18401,7 +18504,7 @@
                     <pic:cNvPicPr/>
                   </pic:nvPicPr>
                   <pic:blipFill>
-                    <a:blip r:embed="rId156"/>
+                    <a:blip r:embed="rId157"/>
                     <a:stretch>
                       <a:fillRect/>
                     </a:stretch>
@@ -18448,7 +18551,7 @@
         </w:rPr>
         <w:t xml:space="preserve"> </w:t>
       </w:r>
-      <w:hyperlink r:id="rId157">
+      <w:hyperlink r:id="rId158">
         <w:r>
           <w:rPr>
             <w:color w:val="1D4D71"/>
@@ -18597,7 +18700,7 @@
         </w:rPr>
         <w:t xml:space="preserve"> 与统一余项初猜的新</w:t>
       </w:r>
-      <w:hyperlink r:id="rId158">
+      <w:hyperlink r:id="rId159">
         <w:r>
           <w:rPr>
             <w:color w:val="1D4D71"/>
@@ -18683,7 +18786,7 @@
         </w:rPr>
         <w:t xml:space="preserve"> 的</w:t>
       </w:r>
-      <w:hyperlink r:id="rId159">
+      <w:hyperlink r:id="rId160">
         <w:r>
           <w:rPr>
             <w:color w:val="1D4D71"/>
@@ -18732,7 +18835,7 @@
         </w:rPr>
         <w:t>把未完成终点留空，</w:t>
       </w:r>
-      <w:hyperlink r:id="rId160">
+      <w:hyperlink r:id="rId161">
         <w:r>
           <w:rPr>
             <w:color w:val="1D4D71"/>
@@ -18793,7 +18896,7 @@
         </w:rPr>
         <w:t xml:space="preserve"> </w:t>
       </w:r>
-      <w:hyperlink r:id="rId161">
+      <w:hyperlink r:id="rId162">
         <w:r>
           <w:rPr>
             <w:color w:val="1D4D71"/>
@@ -18837,7 +18940,7 @@
         </w:rPr>
         <w:t>，前三方没有明确 checker 文字输出。</w:t>
       </w:r>
-      <w:hyperlink r:id="rId162">
+      <w:hyperlink r:id="rId163">
         <w:r>
           <w:rPr>
             <w:color w:val="1D4D71"/>
@@ -18853,7 +18956,7 @@
         </w:rPr>
         <w:t>与</w:t>
       </w:r>
-      <w:hyperlink r:id="rId163">
+      <w:hyperlink r:id="rId164">
         <w:r>
           <w:rPr>
             <w:color w:val="1D4D71"/>
@@ -18923,7 +19026,7 @@
         </w:rPr>
         <w:t>，也不提供稳定速度排名或独立端到端 NNCS 证明。</w:t>
       </w:r>
-      <w:hyperlink r:id="rId164">
+      <w:hyperlink r:id="rId165">
         <w:r>
           <w:rPr>
             <w:color w:val="1D4D71"/>
@@ -18939,7 +19042,7 @@
         </w:rPr>
         <w:t>、</w:t>
       </w:r>
-      <w:hyperlink r:id="rId165">
+      <w:hyperlink r:id="rId166">
         <w:r>
           <w:rPr>
             <w:color w:val="1D4D71"/>
@@ -18955,7 +19058,7 @@
         </w:rPr>
         <w:t>、</w:t>
       </w:r>
-      <w:hyperlink r:id="rId166">
+      <w:hyperlink r:id="rId167">
         <w:r>
           <w:rPr>
             <w:color w:val="1D4D71"/>
@@ -18994,7 +19097,7 @@
                     <pic:cNvPicPr/>
                   </pic:nvPicPr>
                   <pic:blipFill>
-                    <a:blip r:embed="rId167"/>
+                    <a:blip r:embed="rId168"/>
                     <a:stretch>
                       <a:fillRect/>
                     </a:stretch>
@@ -19049,7 +19152,7 @@
         </w:rPr>
         <w:t xml:space="preserve"> 用户选定官方 2026 四层 sigmoid 模型及 u=11f；四态完整初盒、0.5 秒×10 到 T=5，目标 x1∈[-0.1,0.2]、x2∈[-0.9,-0.6]。</w:t>
       </w:r>
-      <w:hyperlink r:id="rId168">
+      <w:hyperlink r:id="rId169">
         <w:r>
           <w:rPr>
             <w:color w:val="1D4D71"/>
@@ -19082,7 +19185,7 @@
         </w:rPr>
         <w:t xml:space="preserve"> P3、Huan、Xiangru、原生均有本轮 500/500 小步，保存 T=5 目标坐标全盒入目标。P3/Huan/Xiangru 未执行性质 checker，只有原生作者终点 checker 打印 VERIFIED；Huan/Xiangru 共用驱动。</w:t>
       </w:r>
-      <w:hyperlink r:id="rId169">
+      <w:hyperlink r:id="rId170">
         <w:r>
           <w:rPr>
             <w:color w:val="1D4D71"/>
@@ -19147,7 +19250,7 @@
         </w:rPr>
         <w:t>摘要；四态终点绝对界见 CSV。</w:t>
       </w:r>
-      <w:hyperlink r:id="rId170">
+      <w:hyperlink r:id="rId171">
         <w:r>
           <w:rPr>
             <w:color w:val="1D4D71"/>
@@ -19186,7 +19289,7 @@
                     <pic:cNvPicPr/>
                   </pic:nvPicPr>
                   <pic:blipFill>
-                    <a:blip r:embed="rId171"/>
+                    <a:blip r:embed="rId172"/>
                     <a:stretch>
                       <a:fillRect/>
                     </a:stretch>
@@ -19258,7 +19361,7 @@
         </w:rPr>
         <w:t xml:space="preserve"> 固定官方 ReLU³/tanh 网络及 u=11f；和 sigmoid 共用四态 ODE、初盒、0.5 秒×10 与终点目标。</w:t>
       </w:r>
-      <w:hyperlink r:id="rId168">
+      <w:hyperlink r:id="rId169">
         <w:r>
           <w:rPr>
             <w:color w:val="1D4D71"/>
@@ -19337,7 +19440,7 @@
         </w:rPr>
         <w:t xml:space="preserve"> P3 仍保留作历史对照，不能改名为当前 working P3。</w:t>
       </w:r>
-      <w:hyperlink r:id="rId172">
+      <w:hyperlink r:id="rId173">
         <w:r>
           <w:rPr>
             <w:color w:val="1D4D71"/>
@@ -19440,7 +19543,7 @@
         </w:rPr>
         <w:t>；逐步 500 条范围独立扫描有限、有序且 endpoint 逐段包含。</w:t>
       </w:r>
-      <w:hyperlink r:id="rId173">
+      <w:hyperlink r:id="rId174">
         <w:r>
           <w:rPr>
             <w:color w:val="1D4D71"/>
@@ -19456,7 +19559,7 @@
         </w:rPr>
         <w:t>逐行标明 P3 为新、其它三方为历史；本轮没有同资源四方计时，不据旧新混合样本排名。</w:t>
       </w:r>
-      <w:hyperlink r:id="rId174">
+      <w:hyperlink r:id="rId175">
         <w:r>
           <w:rPr>
             <w:color w:val="1D4D71"/>
@@ -19509,7 +19612,7 @@
                     <pic:cNvPicPr/>
                   </pic:nvPicPr>
                   <pic:blipFill>
-                    <a:blip r:embed="rId175"/>
+                    <a:blip r:embed="rId176"/>
                     <a:stretch>
                       <a:fillRect/>
                     </a:stretch>
@@ -19595,7 +19698,7 @@
         </w:rPr>
         <w:t xml:space="preserve"> 用户指定论文方程：常值 w∈[-10⁻⁴,10⁻⁴] 只加速度导数，完整四态初盒、0.2 秒×50 到 T=10；目标 [-0.6,0.6]×[-0.2,0.2]×[-0.06,0.06]×[-0.3,0.3]。</w:t>
       </w:r>
-      <w:hyperlink r:id="rId176">
+      <w:hyperlink r:id="rId177">
         <w:r>
           <w:rPr>
             <w:color w:val="1D4D71"/>
@@ -19628,7 +19731,7 @@
         </w:rPr>
         <w:t xml:space="preserve"> P3、Huan、Xiangru、原生各有 500/500 小步。P3/原生保存 T=10 全盒终点入目标，原生作者终点 checker 打印 VERIFIED；Huan/Xiangru 的 x3/x4 终点盒未全入目标，程序 UNKNOWN。</w:t>
       </w:r>
-      <w:hyperlink r:id="rId177">
+      <w:hyperlink r:id="rId178">
         <w:r>
           <w:rPr>
             <w:color w:val="1D4D71"/>
@@ -19672,7 +19775,7 @@
         </w:rPr>
         <w:t xml:space="preserve"> 的完整初盒 endpoint 入目标；Huan/Xiangru 的 500 个已保存 endpoint 无一次四态同时全入目标，这不能推成整个窗口不可达。</w:t>
       </w:r>
-      <w:hyperlink r:id="rId178">
+      <w:hyperlink r:id="rId179">
         <w:r>
           <w:rPr>
             <w:color w:val="1D4D71"/>
@@ -19688,7 +19791,7 @@
         </w:rPr>
         <w:t>与</w:t>
       </w:r>
-      <w:hyperlink r:id="rId179">
+      <w:hyperlink r:id="rId180">
         <w:r>
           <w:rPr>
             <w:color w:val="1D4D71"/>
@@ -19721,7 +19824,7 @@
         </w:rPr>
         <w:t xml:space="preserve"> 单次外层 wall 按 P3/Huan/Xiangru/原生为 17.819782/9.594389/9.895126/10.397308 秒；</w:t>
       </w:r>
-      <w:hyperlink r:id="rId180">
+      <w:hyperlink r:id="rId181">
         <w:r>
           <w:rPr>
             <w:color w:val="1D4D71"/>
@@ -19737,7 +19840,7 @@
         </w:rPr>
         <w:t>来自保存范围，各方法阶数不同。</w:t>
       </w:r>
-      <w:hyperlink r:id="rId181">
+      <w:hyperlink r:id="rId182">
         <w:r>
           <w:rPr>
             <w:color w:val="1D4D71"/>
@@ -19804,7 +19907,7 @@
                     <pic:cNvPicPr/>
                   </pic:nvPicPr>
                   <pic:blipFill>
-                    <a:blip r:embed="rId182"/>
+                    <a:blip r:embed="rId183"/>
                     <a:stretch>
                       <a:fillRect/>
                     </a:stretch>
@@ -19897,7 +20000,7 @@
         </w:rPr>
         <w:t xml:space="preserve"> 当同合同加速比。新论文方程下 Huan parity 单次 94.583 s 已独立列于 QUAD 节，也不能直接与旧 75.250099 s 作优化倍率。40 步 parity/strict 与阶段计时只解释早期成本，不外推 1000 步；见</w:t>
       </w:r>
-      <w:hyperlink r:id="rId183">
+      <w:hyperlink r:id="rId184">
         <w:r>
           <w:rPr>
             <w:color w:val="1D4D71"/>
@@ -19913,7 +20016,7 @@
         </w:rPr>
         <w:t>。旧作者合同的另一组 P3 无 JIT 40 步 observer 开/关成对尝试在终步每盒数值数组直接一致的条件下，单对 driver 时间差仅 0.230546 s；两臂均省去旧完整运行的诊断签名，因此它不测签名净成本，也不支持删除逐步绘图记录或宣称全程加速，见</w:t>
       </w:r>
-      <w:hyperlink r:id="rId184">
+      <w:hyperlink r:id="rId185">
         <w:r>
           <w:rPr>
             <w:color w:val="1D4D71"/>
@@ -19937,7 +20040,7 @@
         </w:rPr>
         <w:t>另立</w:t>
       </w:r>
-      <w:hyperlink r:id="rId185">
+      <w:hyperlink r:id="rId186">
         <w:r>
           <w:rPr>
             <w:color w:val="1D4D71"/>
@@ -19955,7 +20058,7 @@
       </w:r>
     </w:p>
     <w:p>
-      <w:hyperlink r:id="rId186">
+      <w:hyperlink r:id="rId187">
         <w:r>
           <w:rPr>
             <w:color w:val="1D4D71"/>
@@ -19973,7 +20076,7 @@
       </w:r>
     </w:p>
     <w:p>
-      <w:hyperlink r:id="rId187">
+      <w:hyperlink r:id="rId188">
         <w:r>
           <w:rPr>
             <w:color w:val="1D4D71"/>
@@ -20031,7 +20134,7 @@
       </w:r>
     </w:p>
     <w:p>
-      <w:hyperlink r:id="rId188">
+      <w:hyperlink r:id="rId189">
         <w:r>
           <w:rPr>
             <w:color w:val="1D4D71"/>
@@ -20047,7 +20150,7 @@
         </w:rPr>
         <w:t>保留两轮细化、普通验证 128 行和旧作者其余合同，40,960/40,960 盒步接受；加权图调用从 640 降至 320，40 条观察与既有短程参考逐字节相同，所存终态逐盒 tube/endpoint/status 亦直接一致。</w:t>
       </w:r>
-      <w:hyperlink r:id="rId189">
+      <w:hyperlink r:id="rId190">
         <w:r>
           <w:rPr>
             <w:color w:val="1D4D71"/>
@@ -20063,7 +20166,7 @@
         </w:rPr>
         <w:t>也通过旧合同/资源自动预检后完成 1,000/1,000 步、1,024,000/1,024,000 盒步接受和 50 次控制。</w:t>
       </w:r>
-      <w:hyperlink r:id="rId190">
+      <w:hyperlink r:id="rId191">
         <w:r>
           <w:rPr>
             <w:color w:val="1D4D71"/>
@@ -20095,6 +20198,56 @@
       </w:r>
     </w:p>
     <w:p>
+      <w:hyperlink r:id="rId192">
+        <w:r>
+          <w:rPr>
+            <w:color w:val="1D4D71"/>
+            <w:u w:val="single"/>
+            <w:rFonts w:eastAsia="Hiragino Sans GB" w:ascii="Hiragino Sans GB"/>
+          </w:rPr>
+          <w:t>同包装 128 行全程对照</w:t>
+        </w:r>
+      </w:hyperlink>
+      <w:r>
+        <w:rPr>
+          <w:b w:val="0"/>
+        </w:rPr>
+        <w:t>也完成 1,000/1,000 步、1,024,000/1,024,000 盒步接受与 50 次控制；加权图调用 16,000 次，对应 256 行版本的 8,000 次，两者均无填充。其</w:t>
+      </w:r>
+      <w:hyperlink r:id="rId193">
+        <w:r>
+          <w:rPr>
+            <w:color w:val="1D4D71"/>
+            <w:u w:val="single"/>
+            <w:rFonts w:eastAsia="Hiragino Sans GB" w:ascii="Hiragino Sans GB"/>
+          </w:rPr>
+          <w:t>全 1,000 步直接保存值比较</w:t>
+        </w:r>
+      </w:hyperlink>
+      <w:r>
+        <w:rPr>
+          <w:b w:val="0"/>
+        </w:rPr>
+        <w:t>对逐盒 bounds、接受掩码、状态和 pooled 观察均与同一旧 P3/trig 参考相同；</w:t>
+      </w:r>
+      <w:hyperlink r:id="rId194">
+        <w:r>
+          <w:rPr>
+            <w:color w:val="1D4D71"/>
+            <w:u w:val="single"/>
+            <w:rFonts w:eastAsia="Hiragino Sans GB" w:ascii="Hiragino Sans GB"/>
+          </w:rPr>
+          <w:t>三份终态 NPY 直接文件字节比较</w:t>
+        </w:r>
+      </w:hyperlink>
+      <w:r>
+        <w:rPr>
+          <w:b w:val="0"/>
+        </w:rPr>
+        <w:t>也与 256 行运行相同，但旧 P3/trig 参考没有这组三数组可比；隐藏 TM/SR 未逐项比对。128 行 outer/watchdog/driver wall 为 1350.901/1350.820/1343.874 秒；同包装 256 行 outer 为 1093.267 秒，单次相差 257.634 秒，按 128 行 outer 计算约 19.07%。两次顺序运行，未交错或重复，故只是描述性差值，不能证明稳定或因果速度收益；这项旧作者合同诊断不计入 200 条 2026 benchmark 新尝试。</w:t>
+      </w:r>
+    </w:p>
+    <w:p>
       <w:pPr>
         <w:pStyle w:val="Heading1"/>
       </w:pPr>
@@ -20109,7 +20262,7 @@
         </w:rPr>
         <w:t>图层、tube/endpoint 语义与 MATLAB/替代渲染边界见</w:t>
       </w:r>
-      <w:hyperlink r:id="rId191">
+      <w:hyperlink r:id="rId195">
         <w:r>
           <w:rPr>
             <w:color w:val="1D4D71"/>
@@ -20125,7 +20278,7 @@
         </w:rPr>
         <w:t>和</w:t>
       </w:r>
-      <w:hyperlink r:id="rId192">
+      <w:hyperlink r:id="rId196">
         <w:r>
           <w:rPr>
             <w:color w:val="1D4D71"/>
@@ -20141,7 +20294,7 @@
         </w:rPr>
         <w:t>。本轮新增</w:t>
       </w:r>
-      <w:hyperlink r:id="rId193">
+      <w:hyperlink r:id="rId197">
         <w:r>
           <w:rPr>
             <w:color w:val="1D4D71"/>
@@ -20249,7 +20402,7 @@
         </w:rPr>
         <w:t>入口现在可重复指定兼容的 v1 保存几何，在同一坐标轴叠加多方法，并在回执中分别记录几何验证/导出、MATLAB 生成和 PNG/PDF 渲染用时。</w:t>
       </w:r>
-      <w:hyperlink r:id="rId194">
+      <w:hyperlink r:id="rId198">
         <w:r>
           <w:rPr>
             <w:color w:val="1D4D71"/>
@@ -20289,7 +20442,7 @@
         </w:rPr>
         <w:t>、</w:t>
       </w:r>
-      <w:hyperlink r:id="rId195">
+      <w:hyperlink r:id="rId199">
         <w:r>
           <w:rPr>
             <w:color w:val="1D4D71"/>
@@ -20372,7 +20525,7 @@
                     <pic:cNvPicPr/>
                   </pic:nvPicPr>
                   <pic:blipFill>
-                    <a:blip r:embed="rId196"/>
+                    <a:blip r:embed="rId200"/>
                     <a:stretch>
                       <a:fillRect/>
                     </a:stretch>
@@ -20474,7 +20627,7 @@
         </w:rPr>
         <w:t>新增的</w:t>
       </w:r>
-      <w:hyperlink r:id="rId197">
+      <w:hyperlink r:id="rId201">
         <w:r>
           <w:rPr>
             <w:color w:val="1D4D71"/>
@@ -20536,7 +20689,7 @@
         </w:rPr>
         <w:t>保存新完成、短程 smoke 与失败预检的不同资格。</w:t>
       </w:r>
-      <w:hyperlink r:id="rId198">
+      <w:hyperlink r:id="rId202">
         <w:r>
           <w:rPr>
             <w:color w:val="1D4D71"/>

</xml_diff>